<commit_message>
docs: refresh documents for Phase 8 Oee reference data
Data model v1.5 (adds four Oee tables), FDS v0.7 (minor cross-refs),
Phased Plan v1.6 (Phase 8 marked complete), CLAUDE.md current state
section updated through 2026-04-15. ERD regenerated to include new
Oee tables alongside ProductionEventValue from v1.4.
</commit_message>
<xml_diff>
--- a/MPP_MES_FDS.docx
+++ b/MPP_MES_FDS.docx
@@ -2,7 +2,7 @@
 <file path=word/document.xml><?xml version="1.0" encoding="utf-8"?>
 <w:document xmlns:w="http://schemas.openxmlformats.org/wordprocessingml/2006/main" xmlns:m="http://schemas.openxmlformats.org/officeDocument/2006/math" xmlns:r="http://schemas.openxmlformats.org/officeDocument/2006/relationships" xmlns:o="urn:schemas-microsoft-com:office:office" xmlns:v="urn:schemas-microsoft-com:vml" xmlns:w10="urn:schemas-microsoft-com:office:word" xmlns:a="http://schemas.openxmlformats.org/drawingml/2006/main" xmlns:pic="http://schemas.openxmlformats.org/drawingml/2006/picture" xmlns:wp="http://schemas.openxmlformats.org/drawingml/2006/wordprocessingDrawing">
   <w:body>
-    <w:bookmarkStart w:id="308" w:name="mpp-mes-functional-design-specification"/>
+    <w:bookmarkStart w:id="309" w:name="mpp-mes-functional-design-specification"/>
     <w:p>
       <w:pPr>
         <w:pStyle w:val="Heading1"/>
@@ -90,7 +90,7 @@
         <w:t xml:space="preserve"> </w:t>
       </w:r>
       <w:r>
-        <w:t xml:space="preserve">0.6 — Working Draft</w:t>
+        <w:t xml:space="preserve">0.7 — Working Draft</w:t>
       </w:r>
       <w:r>
         <w:t xml:space="preserve"> </w:t>
@@ -617,14 +617,327 @@
               <w:pStyle w:val="Compact"/>
             </w:pPr>
             <w:r>
+              <w:t xml:space="preserve">0.7</w:t>
+            </w:r>
+          </w:p>
+        </w:tc>
+        <w:tc>
+          <w:tcPr>
+            <w:shd w:val="clear" w:color="auto" w:fill="F2F2F2"/>
+          </w:tcPr>
+          <w:tcPr/>
+          <w:p>
+            <w:pPr>
+              <w:pStyle w:val="Compact"/>
+            </w:pPr>
+            <w:r>
+              <w:t xml:space="preserve">2026-04-15</w:t>
+            </w:r>
+          </w:p>
+        </w:tc>
+        <w:tc>
+          <w:tcPr>
+            <w:shd w:val="clear" w:color="auto" w:fill="F2F2F2"/>
+          </w:tcPr>
+          <w:tcPr/>
+          <w:p>
+            <w:pPr>
+              <w:pStyle w:val="Compact"/>
+            </w:pPr>
+            <w:r>
+              <w:t xml:space="preserve">Blue Ridge Automation</w:t>
+            </w:r>
+          </w:p>
+        </w:tc>
+        <w:tc>
+          <w:tcPr>
+            <w:shd w:val="clear" w:color="auto" w:fill="F2F2F2"/>
+          </w:tcPr>
+          <w:tcPr/>
+          <w:p>
+            <w:pPr>
+              <w:pStyle w:val="Compact"/>
+            </w:pPr>
+            <w:r>
+              <w:rPr>
+                <w:b/>
+                <w:bCs/>
+              </w:rPr>
+              <w:t xml:space="preserve">Production data collection capture.</w:t>
+            </w:r>
+            <w:r>
+              <w:t xml:space="preserve"> </w:t>
+            </w:r>
+            <w:r>
+              <w:t xml:space="preserve">Closed a gap where</w:t>
+            </w:r>
+            <w:r>
+              <w:t xml:space="preserve"> </w:t>
+            </w:r>
+            <w:r>
+              <w:rPr>
+                <w:rStyle w:val="VerbatimChar"/>
+              </w:rPr>
+              <w:t xml:space="preserve">OperationTemplate</w:t>
+            </w:r>
+            <w:r>
+              <w:t xml:space="preserve"> </w:t>
+            </w:r>
+            <w:r>
+              <w:t xml:space="preserve">+</w:t>
+            </w:r>
+            <w:r>
+              <w:t xml:space="preserve"> </w:t>
+            </w:r>
+            <w:r>
+              <w:rPr>
+                <w:rStyle w:val="VerbatimChar"/>
+              </w:rPr>
+              <w:t xml:space="preserve">OperationTemplateField</w:t>
+            </w:r>
+            <w:r>
+              <w:t xml:space="preserve"> </w:t>
+            </w:r>
+            <w:r>
+              <w:t xml:space="preserve">+</w:t>
+            </w:r>
+            <w:r>
+              <w:t xml:space="preserve"> </w:t>
+            </w:r>
+            <w:r>
+              <w:rPr>
+                <w:rStyle w:val="VerbatimChar"/>
+              </w:rPr>
+              <w:t xml:space="preserve">DataCollectionField</w:t>
+            </w:r>
+            <w:r>
+              <w:t xml:space="preserve"> </w:t>
+            </w:r>
+            <w:r>
+              <w:t xml:space="preserve">defined</w:t>
+            </w:r>
+            <w:r>
+              <w:t xml:space="preserve"> </w:t>
+            </w:r>
+            <w:r>
+              <w:rPr>
+                <w:i/>
+                <w:iCs/>
+              </w:rPr>
+              <w:t xml:space="preserve">what</w:t>
+            </w:r>
+            <w:r>
+              <w:t xml:space="preserve"> </w:t>
+            </w:r>
+            <w:r>
+              <w:t xml:space="preserve">to collect but nothing persisted</w:t>
+            </w:r>
+            <w:r>
+              <w:t xml:space="preserve"> </w:t>
+            </w:r>
+            <w:r>
+              <w:rPr>
+                <w:i/>
+                <w:iCs/>
+              </w:rPr>
+              <w:t xml:space="preserve">what was actually collected</w:t>
+            </w:r>
+            <w:r>
+              <w:t xml:space="preserve"> </w:t>
+            </w:r>
+            <w:r>
+              <w:t xml:space="preserve">when a LOT passed through. Updated §3.4 (FDS-03-012 operation-template definition — replaced stale</w:t>
+            </w:r>
+            <w:r>
+              <w:t xml:space="preserve"> </w:t>
+            </w:r>
+            <w:r>
+              <w:rPr>
+                <w:rStyle w:val="VerbatimChar"/>
+              </w:rPr>
+              <w:t xml:space="preserve">Collects*</w:t>
+            </w:r>
+            <w:r>
+              <w:t xml:space="preserve">/</w:t>
+            </w:r>
+            <w:r>
+              <w:rPr>
+                <w:rStyle w:val="VerbatimChar"/>
+              </w:rPr>
+              <w:t xml:space="preserve">Requires*</w:t>
+            </w:r>
+            <w:r>
+              <w:t xml:space="preserve"> </w:t>
+            </w:r>
+            <w:r>
+              <w:t xml:space="preserve">BIT-flag table with the</w:t>
+            </w:r>
+            <w:r>
+              <w:t xml:space="preserve"> </w:t>
+            </w:r>
+            <w:r>
+              <w:rPr>
+                <w:rStyle w:val="VerbatimChar"/>
+              </w:rPr>
+              <w:t xml:space="preserve">OperationTemplateField</w:t>
+            </w:r>
+            <w:r>
+              <w:t xml:space="preserve"> </w:t>
+            </w:r>
+            <w:r>
+              <w:t xml:space="preserve">→</w:t>
+            </w:r>
+            <w:r>
+              <w:t xml:space="preserve"> </w:t>
+            </w:r>
+            <w:r>
+              <w:rPr>
+                <w:rStyle w:val="VerbatimChar"/>
+              </w:rPr>
+              <w:t xml:space="preserve">DataCollectionField</w:t>
+            </w:r>
+            <w:r>
+              <w:t xml:space="preserve"> </w:t>
+            </w:r>
+            <w:r>
+              <w:t xml:space="preserve">junction wording that matches data model rev 0.7+). Updated §6.2 (FDS-06-001 die cast screen — now driven by</w:t>
+            </w:r>
+            <w:r>
+              <w:t xml:space="preserve"> </w:t>
+            </w:r>
+            <w:r>
+              <w:rPr>
+                <w:rStyle w:val="VerbatimChar"/>
+              </w:rPr>
+              <w:t xml:space="preserve">OperationTemplateField</w:t>
+            </w:r>
+            <w:r>
+              <w:t xml:space="preserve"> </w:t>
+            </w:r>
+            <w:r>
+              <w:t xml:space="preserve">rows rather than flags) and FDS-06-003 (die cast production event — now captures</w:t>
+            </w:r>
+            <w:r>
+              <w:t xml:space="preserve"> </w:t>
+            </w:r>
+            <w:r>
+              <w:rPr>
+                <w:rStyle w:val="VerbatimChar"/>
+              </w:rPr>
+              <w:t xml:space="preserve">OperationTemplateId</w:t>
+            </w:r>
+            <w:r>
+              <w:t xml:space="preserve">,</w:t>
+            </w:r>
+            <w:r>
+              <w:t xml:space="preserve"> </w:t>
+            </w:r>
+            <w:r>
+              <w:rPr>
+                <w:rStyle w:val="VerbatimChar"/>
+              </w:rPr>
+              <w:t xml:space="preserve">DieIdentifier</w:t>
+            </w:r>
+            <w:r>
+              <w:t xml:space="preserve">,</w:t>
+            </w:r>
+            <w:r>
+              <w:t xml:space="preserve"> </w:t>
+            </w:r>
+            <w:r>
+              <w:rPr>
+                <w:rStyle w:val="VerbatimChar"/>
+              </w:rPr>
+              <w:t xml:space="preserve">CavityNumber</w:t>
+            </w:r>
+            <w:r>
+              <w:t xml:space="preserve">,</w:t>
+            </w:r>
+            <w:r>
+              <w:t xml:space="preserve"> </w:t>
+            </w:r>
+            <w:r>
+              <w:rPr>
+                <w:rStyle w:val="VerbatimChar"/>
+              </w:rPr>
+              <w:t xml:space="preserve">WeightValue</w:t>
+            </w:r>
+            <w:r>
+              <w:t xml:space="preserve">/</w:t>
+            </w:r>
+            <w:r>
+              <w:rPr>
+                <w:rStyle w:val="VerbatimChar"/>
+              </w:rPr>
+              <w:t xml:space="preserve">WeightUomId</w:t>
+            </w:r>
+            <w:r>
+              <w:t xml:space="preserve"> </w:t>
+            </w:r>
+            <w:r>
+              <w:t xml:space="preserve">as hot columns plus N</w:t>
+            </w:r>
+            <w:r>
+              <w:t xml:space="preserve"> </w:t>
+            </w:r>
+            <w:r>
+              <w:rPr>
+                <w:rStyle w:val="VerbatimChar"/>
+              </w:rPr>
+              <w:t xml:space="preserve">ProductionEventValue</w:t>
+            </w:r>
+            <w:r>
+              <w:t xml:space="preserve"> </w:t>
+            </w:r>
+            <w:r>
+              <w:t xml:space="preserve">children for any other configured field). Added new FDS-03-017a specifying how the Perspective screen resolves operation-template fields into inputs and writes the header+children transactionally. Data model aligned at v1.4 (new</w:t>
+            </w:r>
+            <w:r>
+              <w:t xml:space="preserve"> </w:t>
+            </w:r>
+            <w:r>
+              <w:rPr>
+                <w:rStyle w:val="VerbatimChar"/>
+              </w:rPr>
+              <w:t xml:space="preserve">Workorder.ProductionEventValue</w:t>
+            </w:r>
+            <w:r>
+              <w:t xml:space="preserve"> </w:t>
+            </w:r>
+            <w:r>
+              <w:t xml:space="preserve">table +</w:t>
+            </w:r>
+            <w:r>
+              <w:t xml:space="preserve"> </w:t>
+            </w:r>
+            <w:r>
+              <w:rPr>
+                <w:rStyle w:val="VerbatimChar"/>
+              </w:rPr>
+              <w:t xml:space="preserve">ProductionEvent</w:t>
+            </w:r>
+            <w:r>
+              <w:t xml:space="preserve"> </w:t>
+            </w:r>
+            <w:r>
+              <w:t xml:space="preserve">extensions).</w:t>
+            </w:r>
+          </w:p>
+        </w:tc>
+      </w:tr>
+      <w:tr>
+        <w:tc>
+          <w:tcPr/>
+          <w:p>
+            <w:pPr>
+              <w:pStyle w:val="Compact"/>
+            </w:pPr>
+            <w:r>
               <w:t xml:space="preserve">0.6</w:t>
             </w:r>
           </w:p>
         </w:tc>
         <w:tc>
-          <w:tcPr>
-            <w:shd w:val="clear" w:color="auto" w:fill="F2F2F2"/>
-          </w:tcPr>
           <w:tcPr/>
           <w:p>
             <w:pPr>
@@ -636,9 +949,6 @@
           </w:p>
         </w:tc>
         <w:tc>
-          <w:tcPr>
-            <w:shd w:val="clear" w:color="auto" w:fill="F2F2F2"/>
-          </w:tcPr>
           <w:tcPr/>
           <w:p>
             <w:pPr>
@@ -650,9 +960,6 @@
           </w:p>
         </w:tc>
         <w:tc>
-          <w:tcPr>
-            <w:shd w:val="clear" w:color="auto" w:fill="F2F2F2"/>
-          </w:tcPr>
           <w:tcPr/>
           <w:p>
             <w:pPr>
@@ -9665,7 +9972,7 @@
     <w:bookmarkEnd w:id="50"/>
     <w:bookmarkEnd w:id="51"/>
     <w:bookmarkEnd w:id="52"/>
-    <w:bookmarkStart w:id="76" w:name="master-data-management-mvp"/>
+    <w:bookmarkStart w:id="77" w:name="master-data-management-mvp"/>
     <w:p>
       <w:pPr>
         <w:pStyle w:val="Heading2"/>
@@ -10253,7 +10560,7 @@
     </w:p>
     <w:bookmarkEnd w:id="65"/>
     <w:bookmarkEnd w:id="66"/>
-    <w:bookmarkStart w:id="69" w:name="operation-templates"/>
+    <w:bookmarkStart w:id="70" w:name="operation-templates"/>
     <w:p>
       <w:pPr>
         <w:pStyle w:val="Heading3"/>
@@ -10276,7 +10583,7 @@
         <w:pStyle w:val="FirstParagraph"/>
       </w:pPr>
       <w:r>
-        <w:t xml:space="preserve">Operation templates define what data to collect at a type of operation. They are reusable across products. Each template SHALL specify:</w:t>
+        <w:t xml:space="preserve">Operation templates define what data to collect at a type of operation. They are reusable across products and versioned (Draft/Published/Deprecated). Each template SHALL specify:</w:t>
       </w:r>
     </w:p>
     <w:tbl>
@@ -10347,18 +10654,18 @@
               <w:pStyle w:val="Compact"/>
             </w:pPr>
             <w:r>
-              <w:t xml:space="preserve">name, code</w:t>
-            </w:r>
-          </w:p>
-        </w:tc>
-        <w:tc>
-          <w:tcPr/>
-          <w:p>
-            <w:pPr>
-              <w:pStyle w:val="Compact"/>
-            </w:pPr>
-            <w:r>
-              <w:t xml:space="preserve">Identity</w:t>
+              <w:t xml:space="preserve">Code, VersionNumber</w:t>
+            </w:r>
+          </w:p>
+        </w:tc>
+        <w:tc>
+          <w:tcPr/>
+          <w:p>
+            <w:pPr>
+              <w:pStyle w:val="Compact"/>
+            </w:pPr>
+            <w:r>
+              <w:t xml:space="preserve">Identity within a version family</w:t>
             </w:r>
           </w:p>
         </w:tc>
@@ -10374,7 +10681,7 @@
               <w:pStyle w:val="Compact"/>
             </w:pPr>
             <w:r>
-              <w:t xml:space="preserve">AreaLocationId</w:t>
+              <w:t xml:space="preserve">Name</w:t>
             </w:r>
           </w:p>
         </w:tc>
@@ -10388,7 +10695,7 @@
               <w:pStyle w:val="Compact"/>
             </w:pPr>
             <w:r>
-              <w:t xml:space="preserve">Area this operation belongs to (for defect/downtime code filtering)</w:t>
+              <w:t xml:space="preserve">Human-readable label</w:t>
             </w:r>
           </w:p>
         </w:tc>
@@ -10401,18 +10708,18 @@
               <w:pStyle w:val="Compact"/>
             </w:pPr>
             <w:r>
-              <w:t xml:space="preserve">RequiresMaterialVerification</w:t>
-            </w:r>
-          </w:p>
-        </w:tc>
-        <w:tc>
-          <w:tcPr/>
-          <w:p>
-            <w:pPr>
-              <w:pStyle w:val="Compact"/>
-            </w:pPr>
-            <w:r>
-              <w:t xml:space="preserve">Operator must scan source LOT barcode before consuming</w:t>
+              <w:t xml:space="preserve">AreaLocationId</w:t>
+            </w:r>
+          </w:p>
+        </w:tc>
+        <w:tc>
+          <w:tcPr/>
+          <w:p>
+            <w:pPr>
+              <w:pStyle w:val="Compact"/>
+            </w:pPr>
+            <w:r>
+              <w:t xml:space="preserve">Area this operation belongs to (for defect/downtime code filtering)</w:t>
             </w:r>
           </w:p>
         </w:tc>
@@ -10428,7 +10735,7 @@
               <w:pStyle w:val="Compact"/>
             </w:pPr>
             <w:r>
-              <w:t xml:space="preserve">RequiresSerialNumber</w:t>
+              <w:t xml:space="preserve">Description</w:t>
             </w:r>
           </w:p>
         </w:tc>
@@ -10442,7 +10749,7 @@
               <w:pStyle w:val="Compact"/>
             </w:pPr>
             <w:r>
-              <w:t xml:space="preserve">Operation produces serialized parts</w:t>
+              <w:t xml:space="preserve">Optional notes</w:t>
             </w:r>
           </w:p>
         </w:tc>
@@ -10455,131 +10762,149 @@
               <w:pStyle w:val="Compact"/>
             </w:pPr>
             <w:r>
-              <w:t xml:space="preserve">CollectsDieInfo</w:t>
-            </w:r>
-          </w:p>
-        </w:tc>
-        <w:tc>
-          <w:tcPr/>
-          <w:p>
-            <w:pPr>
-              <w:pStyle w:val="Compact"/>
-            </w:pPr>
-            <w:r>
-              <w:t xml:space="preserve">Screen shows die number field</w:t>
-            </w:r>
-          </w:p>
-        </w:tc>
-      </w:tr>
-      <w:tr>
-        <w:tc>
-          <w:tcPr>
-            <w:shd w:val="clear" w:color="auto" w:fill="F2F2F2"/>
-          </w:tcPr>
-          <w:tcPr/>
-          <w:p>
-            <w:pPr>
-              <w:pStyle w:val="Compact"/>
-            </w:pPr>
-            <w:r>
-              <w:t xml:space="preserve">CollectsCavityInfo</w:t>
-            </w:r>
-          </w:p>
-        </w:tc>
-        <w:tc>
-          <w:tcPr>
-            <w:shd w:val="clear" w:color="auto" w:fill="F2F2F2"/>
-          </w:tcPr>
-          <w:tcPr/>
-          <w:p>
-            <w:pPr>
-              <w:pStyle w:val="Compact"/>
-            </w:pPr>
-            <w:r>
-              <w:t xml:space="preserve">Screen shows cavity number field</w:t>
-            </w:r>
-          </w:p>
-        </w:tc>
-      </w:tr>
-      <w:tr>
-        <w:tc>
-          <w:tcPr/>
-          <w:p>
-            <w:pPr>
-              <w:pStyle w:val="Compact"/>
-            </w:pPr>
-            <w:r>
-              <w:t xml:space="preserve">CollectsWeight</w:t>
-            </w:r>
-          </w:p>
-        </w:tc>
-        <w:tc>
-          <w:tcPr/>
-          <w:p>
-            <w:pPr>
-              <w:pStyle w:val="Compact"/>
-            </w:pPr>
-            <w:r>
-              <w:t xml:space="preserve">Screen shows weight entry (with scale integration where available)</w:t>
-            </w:r>
-          </w:p>
-        </w:tc>
-      </w:tr>
-      <w:tr>
-        <w:tc>
-          <w:tcPr>
-            <w:shd w:val="clear" w:color="auto" w:fill="F2F2F2"/>
-          </w:tcPr>
-          <w:tcPr/>
-          <w:p>
-            <w:pPr>
-              <w:pStyle w:val="Compact"/>
-            </w:pPr>
-            <w:r>
-              <w:t xml:space="preserve">CollectsGoodCount</w:t>
-            </w:r>
-          </w:p>
-        </w:tc>
-        <w:tc>
-          <w:tcPr>
-            <w:shd w:val="clear" w:color="auto" w:fill="F2F2F2"/>
-          </w:tcPr>
-          <w:tcPr/>
-          <w:p>
-            <w:pPr>
-              <w:pStyle w:val="Compact"/>
-            </w:pPr>
-            <w:r>
-              <w:t xml:space="preserve">Screen shows good count entry</w:t>
-            </w:r>
-          </w:p>
-        </w:tc>
-      </w:tr>
-      <w:tr>
-        <w:tc>
-          <w:tcPr/>
-          <w:p>
-            <w:pPr>
-              <w:pStyle w:val="Compact"/>
-            </w:pPr>
-            <w:r>
-              <w:t xml:space="preserve">CollectsBadCount</w:t>
-            </w:r>
-          </w:p>
-        </w:tc>
-        <w:tc>
-          <w:tcPr/>
-          <w:p>
-            <w:pPr>
-              <w:pStyle w:val="Compact"/>
-            </w:pPr>
-            <w:r>
-              <w:t xml:space="preserve">Screen shows reject count entry</w:t>
+              <w:rPr>
+                <w:i/>
+                <w:iCs/>
+              </w:rPr>
+              <w:t xml:space="preserve">(data collection requirements)</w:t>
+            </w:r>
+          </w:p>
+        </w:tc>
+        <w:tc>
+          <w:tcPr/>
+          <w:p>
+            <w:pPr>
+              <w:pStyle w:val="Compact"/>
+            </w:pPr>
+            <w:r>
+              <w:t xml:space="preserve">Defined by</w:t>
+            </w:r>
+            <w:r>
+              <w:t xml:space="preserve"> </w:t>
+            </w:r>
+            <w:r>
+              <w:rPr>
+                <w:rStyle w:val="VerbatimChar"/>
+              </w:rPr>
+              <w:t xml:space="preserve">OperationTemplateField</w:t>
+            </w:r>
+            <w:r>
+              <w:t xml:space="preserve"> </w:t>
+            </w:r>
+            <w:r>
+              <w:t xml:space="preserve">rows referencing</w:t>
+            </w:r>
+            <w:r>
+              <w:t xml:space="preserve"> </w:t>
+            </w:r>
+            <w:r>
+              <w:rPr>
+                <w:rStyle w:val="VerbatimChar"/>
+              </w:rPr>
+              <w:t xml:space="preserve">DataCollectionField</w:t>
+            </w:r>
+            <w:r>
+              <w:t xml:space="preserve"> </w:t>
+            </w:r>
+            <w:r>
+              <w:t xml:space="preserve">— not hardcoded on the template itself</w:t>
             </w:r>
           </w:p>
         </w:tc>
       </w:tr>
     </w:tbl>
+    <w:p>
+      <w:pPr>
+        <w:pStyle w:val="BodyText"/>
+      </w:pPr>
+      <w:r>
+        <w:t xml:space="preserve">Data collection requirements are modeled as a one-to-many junction (</w:t>
+      </w:r>
+      <w:r>
+        <w:rPr>
+          <w:rStyle w:val="VerbatimChar"/>
+        </w:rPr>
+        <w:t xml:space="preserve">Parts.OperationTemplateField</w:t>
+      </w:r>
+      <w:r>
+        <w:t xml:space="preserve">) linking the template to zero-or-more</w:t>
+      </w:r>
+      <w:r>
+        <w:t xml:space="preserve"> </w:t>
+      </w:r>
+      <w:r>
+        <w:rPr>
+          <w:rStyle w:val="VerbatimChar"/>
+        </w:rPr>
+        <w:t xml:space="preserve">Parts.DataCollectionField</w:t>
+      </w:r>
+      <w:r>
+        <w:t xml:space="preserve"> </w:t>
+      </w:r>
+      <w:r>
+        <w:t xml:space="preserve">rows, each with an</w:t>
+      </w:r>
+      <w:r>
+        <w:t xml:space="preserve"> </w:t>
+      </w:r>
+      <w:r>
+        <w:rPr>
+          <w:rStyle w:val="VerbatimChar"/>
+        </w:rPr>
+        <w:t xml:space="preserve">IsRequired</w:t>
+      </w:r>
+      <w:r>
+        <w:t xml:space="preserve"> </w:t>
+      </w:r>
+      <w:r>
+        <w:t xml:space="preserve">flag.</w:t>
+      </w:r>
+      <w:r>
+        <w:t xml:space="preserve"> </w:t>
+      </w:r>
+      <w:r>
+        <w:rPr>
+          <w:rStyle w:val="VerbatimChar"/>
+        </w:rPr>
+        <w:t xml:space="preserve">DataCollectionField</w:t>
+      </w:r>
+      <w:r>
+        <w:t xml:space="preserve"> </w:t>
+      </w:r>
+      <w:r>
+        <w:t xml:space="preserve">is an extensible vocabulary seeded with the initial set (MaterialVerification, SerialNumber, DieInfo, CavityInfo, Weight, GoodCount, BadCount) and expandable by engineering without schema changes. (Replaces the</w:t>
+      </w:r>
+      <w:r>
+        <w:t xml:space="preserve"> </w:t>
+      </w:r>
+      <w:r>
+        <w:rPr>
+          <w:rStyle w:val="VerbatimChar"/>
+        </w:rPr>
+        <w:t xml:space="preserve">Collects*</w:t>
+      </w:r>
+      <w:r>
+        <w:t xml:space="preserve"> </w:t>
+      </w:r>
+      <w:r>
+        <w:t xml:space="preserve">/</w:t>
+      </w:r>
+      <w:r>
+        <w:t xml:space="preserve"> </w:t>
+      </w:r>
+      <w:r>
+        <w:rPr>
+          <w:rStyle w:val="VerbatimChar"/>
+        </w:rPr>
+        <w:t xml:space="preserve">Requires*</w:t>
+      </w:r>
+      <w:r>
+        <w:t xml:space="preserve"> </w:t>
+      </w:r>
+      <w:r>
+        <w:t xml:space="preserve">BIT flags from earlier drafts per data model rev 0.7.)</w:t>
+      </w:r>
+    </w:p>
     <w:bookmarkEnd w:id="67"/>
     <w:bookmarkStart w:id="68" w:name="Xb343b5b18ca378b26df12d6c1f449348da4a1f4"/>
     <w:p>
@@ -10595,12 +10920,330 @@
         <w:pStyle w:val="FirstParagraph"/>
       </w:pPr>
       <w:r>
-        <w:t xml:space="preserve">The Perspective production screen SHALL dynamically render input fields based on the operation template’s flags. A Die Cast screen shows die/cavity/weight fields; an Assembly screen shows serial number and material verification fields. The same screen component is reused — the template controls which sections are visible. (FRS 3.11.6)</w:t>
+        <w:t xml:space="preserve">The Perspective production screen SHALL dynamically render input fields based on the operation template’s</w:t>
+      </w:r>
+      <w:r>
+        <w:t xml:space="preserve"> </w:t>
+      </w:r>
+      <w:r>
+        <w:rPr>
+          <w:rStyle w:val="VerbatimChar"/>
+        </w:rPr>
+        <w:t xml:space="preserve">OperationTemplateField</w:t>
+      </w:r>
+      <w:r>
+        <w:t xml:space="preserve"> </w:t>
+      </w:r>
+      <w:r>
+        <w:t xml:space="preserve">rows. A Die Cast screen shows die/cavity/weight fields; an Assembly screen shows serial number and material verification fields. The same screen component is reused — the junction rows control which sections are visible and whether each field is required. (FRS 3.11.6)</w:t>
       </w:r>
     </w:p>
     <w:bookmarkEnd w:id="68"/>
+    <w:bookmarkStart w:id="69" w:name="Xde18523983306ddccbde651169f16089a6f36d4"/>
+    <w:p>
+      <w:pPr>
+        <w:pStyle w:val="Heading4"/>
+      </w:pPr>
+      <w:r>
+        <w:t xml:space="preserve">FDS-03-017a — Data Collection Capture at Event Time</w:t>
+      </w:r>
+    </w:p>
+    <w:p>
+      <w:pPr>
+        <w:pStyle w:val="FirstParagraph"/>
+      </w:pPr>
+      <w:r>
+        <w:t xml:space="preserve">When a LOT passes through an operation, the system SHALL persist every field configured on the operation template as part of the production event:</w:t>
+      </w:r>
+    </w:p>
+    <w:p>
+      <w:pPr>
+        <w:pStyle w:val="Compact"/>
+        <w:numPr>
+          <w:ilvl w:val="0"/>
+          <w:numId w:val="1003"/>
+        </w:numPr>
+      </w:pPr>
+      <w:r>
+        <w:t xml:space="preserve">On screen load, the client SHALL read</w:t>
+      </w:r>
+      <w:r>
+        <w:t xml:space="preserve"> </w:t>
+      </w:r>
+      <w:r>
+        <w:rPr>
+          <w:rStyle w:val="VerbatimChar"/>
+        </w:rPr>
+        <w:t xml:space="preserve">OperationTemplateField</w:t>
+      </w:r>
+      <w:r>
+        <w:t xml:space="preserve"> </w:t>
+      </w:r>
+      <w:r>
+        <w:t xml:space="preserve">rows for the active template to determine the visible inputs.</w:t>
+      </w:r>
+    </w:p>
+    <w:p>
+      <w:pPr>
+        <w:pStyle w:val="Compact"/>
+        <w:numPr>
+          <w:ilvl w:val="0"/>
+          <w:numId w:val="1003"/>
+        </w:numPr>
+      </w:pPr>
+      <w:r>
+        <w:t xml:space="preserve">On submit, the Phase 8</w:t>
+      </w:r>
+      <w:r>
+        <w:t xml:space="preserve"> </w:t>
+      </w:r>
+      <w:r>
+        <w:rPr>
+          <w:rStyle w:val="VerbatimChar"/>
+        </w:rPr>
+        <w:t xml:space="preserve">ProductionEvent_Record</w:t>
+      </w:r>
+      <w:r>
+        <w:t xml:space="preserve"> </w:t>
+      </w:r>
+      <w:r>
+        <w:t xml:space="preserve">stored procedure SHALL, in one transaction:</w:t>
+      </w:r>
+    </w:p>
+    <w:p>
+      <w:pPr>
+        <w:pStyle w:val="Compact"/>
+        <w:numPr>
+          <w:ilvl w:val="1"/>
+          <w:numId w:val="1004"/>
+        </w:numPr>
+      </w:pPr>
+      <w:r>
+        <w:t xml:space="preserve">Insert one</w:t>
+      </w:r>
+      <w:r>
+        <w:t xml:space="preserve"> </w:t>
+      </w:r>
+      <w:r>
+        <w:rPr>
+          <w:rStyle w:val="VerbatimChar"/>
+        </w:rPr>
+        <w:t xml:space="preserve">Workorder.ProductionEvent</w:t>
+      </w:r>
+      <w:r>
+        <w:t xml:space="preserve"> </w:t>
+      </w:r>
+      <w:r>
+        <w:t xml:space="preserve">header row carrying</w:t>
+      </w:r>
+      <w:r>
+        <w:t xml:space="preserve"> </w:t>
+      </w:r>
+      <w:r>
+        <w:rPr>
+          <w:rStyle w:val="VerbatimChar"/>
+        </w:rPr>
+        <w:t xml:space="preserve">OperationTemplateId</w:t>
+      </w:r>
+      <w:r>
+        <w:t xml:space="preserve"> </w:t>
+      </w:r>
+      <w:r>
+        <w:t xml:space="preserve">and the hot typed columns for fields that have been promoted (GoodCount, NoGoodCount, DieIdentifier, CavityNumber, WeightValue, WeightUomId).</w:t>
+      </w:r>
+    </w:p>
+    <w:p>
+      <w:pPr>
+        <w:pStyle w:val="Compact"/>
+        <w:numPr>
+          <w:ilvl w:val="1"/>
+          <w:numId w:val="1004"/>
+        </w:numPr>
+      </w:pPr>
+      <w:r>
+        <w:t xml:space="preserve">Insert one</w:t>
+      </w:r>
+      <w:r>
+        <w:t xml:space="preserve"> </w:t>
+      </w:r>
+      <w:r>
+        <w:rPr>
+          <w:rStyle w:val="VerbatimChar"/>
+        </w:rPr>
+        <w:t xml:space="preserve">Workorder.ProductionEventValue</w:t>
+      </w:r>
+      <w:r>
+        <w:t xml:space="preserve"> </w:t>
+      </w:r>
+      <w:r>
+        <w:t xml:space="preserve">child row per non-hot</w:t>
+      </w:r>
+      <w:r>
+        <w:t xml:space="preserve"> </w:t>
+      </w:r>
+      <w:r>
+        <w:rPr>
+          <w:rStyle w:val="VerbatimChar"/>
+        </w:rPr>
+        <w:t xml:space="preserve">DataCollectionField</w:t>
+      </w:r>
+      <w:r>
+        <w:t xml:space="preserve"> </w:t>
+      </w:r>
+      <w:r>
+        <w:t xml:space="preserve">configured on the template, keyed by</w:t>
+      </w:r>
+      <w:r>
+        <w:t xml:space="preserve"> </w:t>
+      </w:r>
+      <w:r>
+        <w:rPr>
+          <w:rStyle w:val="VerbatimChar"/>
+        </w:rPr>
+        <w:t xml:space="preserve">(ProductionEventId, DataCollectionFieldId)</w:t>
+      </w:r>
+      <w:r>
+        <w:t xml:space="preserve">, with both the string</w:t>
+      </w:r>
+      <w:r>
+        <w:t xml:space="preserve"> </w:t>
+      </w:r>
+      <w:r>
+        <w:rPr>
+          <w:rStyle w:val="VerbatimChar"/>
+        </w:rPr>
+        <w:t xml:space="preserve">Value</w:t>
+      </w:r>
+      <w:r>
+        <w:t xml:space="preserve"> </w:t>
+      </w:r>
+      <w:r>
+        <w:t xml:space="preserve">and the typed</w:t>
+      </w:r>
+      <w:r>
+        <w:t xml:space="preserve"> </w:t>
+      </w:r>
+      <w:r>
+        <w:rPr>
+          <w:rStyle w:val="VerbatimChar"/>
+        </w:rPr>
+        <w:t xml:space="preserve">NumericValue</w:t>
+      </w:r>
+      <w:r>
+        <w:t xml:space="preserve"> </w:t>
+      </w:r>
+      <w:r>
+        <w:t xml:space="preserve">/</w:t>
+      </w:r>
+      <w:r>
+        <w:t xml:space="preserve"> </w:t>
+      </w:r>
+      <w:r>
+        <w:rPr>
+          <w:rStyle w:val="VerbatimChar"/>
+        </w:rPr>
+        <w:t xml:space="preserve">UomId</w:t>
+      </w:r>
+      <w:r>
+        <w:t xml:space="preserve"> </w:t>
+      </w:r>
+      <w:r>
+        <w:t xml:space="preserve">where applicable.</w:t>
+      </w:r>
+    </w:p>
+    <w:p>
+      <w:pPr>
+        <w:pStyle w:val="Compact"/>
+        <w:numPr>
+          <w:ilvl w:val="1"/>
+          <w:numId w:val="1004"/>
+        </w:numPr>
+      </w:pPr>
+      <w:r>
+        <w:t xml:space="preserve">Reject the submission if any</w:t>
+      </w:r>
+      <w:r>
+        <w:t xml:space="preserve"> </w:t>
+      </w:r>
+      <w:r>
+        <w:rPr>
+          <w:rStyle w:val="VerbatimChar"/>
+        </w:rPr>
+        <w:t xml:space="preserve">IsRequired = 1</w:t>
+      </w:r>
+      <w:r>
+        <w:t xml:space="preserve"> </w:t>
+      </w:r>
+      <w:r>
+        <w:t xml:space="preserve">field on the template is missing from the payload.</w:t>
+      </w:r>
+    </w:p>
+    <w:p>
+      <w:pPr>
+        <w:pStyle w:val="Compact"/>
+        <w:numPr>
+          <w:ilvl w:val="1"/>
+          <w:numId w:val="1004"/>
+        </w:numPr>
+      </w:pPr>
+      <w:r>
+        <w:t xml:space="preserve">Reject the submission if the payload duplicates a hot-column field in</w:t>
+      </w:r>
+      <w:r>
+        <w:t xml:space="preserve"> </w:t>
+      </w:r>
+      <w:r>
+        <w:rPr>
+          <w:rStyle w:val="VerbatimChar"/>
+        </w:rPr>
+        <w:t xml:space="preserve">ProductionEventValue</w:t>
+      </w:r>
+      <w:r>
+        <w:t xml:space="preserve"> </w:t>
+      </w:r>
+      <w:r>
+        <w:t xml:space="preserve">(hot columns are the sole home for promoted fields).</w:t>
+      </w:r>
+    </w:p>
+    <w:p>
+      <w:pPr>
+        <w:pStyle w:val="Compact"/>
+        <w:numPr>
+          <w:ilvl w:val="0"/>
+          <w:numId w:val="1003"/>
+        </w:numPr>
+      </w:pPr>
+      <w:r>
+        <w:rPr>
+          <w:rStyle w:val="VerbatimChar"/>
+        </w:rPr>
+        <w:t xml:space="preserve">DieIdentifier</w:t>
+      </w:r>
+      <w:r>
+        <w:t xml:space="preserve"> </w:t>
+      </w:r>
+      <w:r>
+        <w:t xml:space="preserve">SHALL be captured from the machine’s current</w:t>
+      </w:r>
+      <w:r>
+        <w:t xml:space="preserve"> </w:t>
+      </w:r>
+      <w:r>
+        <w:rPr>
+          <w:rStyle w:val="VerbatimChar"/>
+        </w:rPr>
+        <w:t xml:space="preserve">LocationAttribute</w:t>
+      </w:r>
+      <w:r>
+        <w:t xml:space="preserve"> </w:t>
+      </w:r>
+      <w:r>
+        <w:t xml:space="preserve">value at event time — it is the historical snapshot of the die mounted on the machine when the event occurred, not a reference to any die table (OI-10 pending).</w:t>
+      </w:r>
+    </w:p>
     <w:bookmarkEnd w:id="69"/>
-    <w:bookmarkStart w:id="72" w:name="part-to-location-eligibility"/>
+    <w:bookmarkEnd w:id="70"/>
+    <w:bookmarkStart w:id="73" w:name="part-to-location-eligibility"/>
     <w:p>
       <w:pPr>
         <w:pStyle w:val="Heading3"/>
@@ -10609,7 +11252,7 @@
         <w:t xml:space="preserve">3.5 Part-to-Location Eligibility</w:t>
       </w:r>
     </w:p>
-    <w:bookmarkStart w:id="70" w:name="fds-03-014-eligibility-map"/>
+    <w:bookmarkStart w:id="71" w:name="fds-03-014-eligibility-map"/>
     <w:p>
       <w:pPr>
         <w:pStyle w:val="Heading4"/>
@@ -10641,8 +11284,8 @@
         <w:t xml:space="preserve">table SHALL define which parts can run on which machines. When an operator starts production at a machine, the MES SHALL validate that the selected item is eligible for that machine. If not eligible, the system SHALL reject the operation with a clear error message. (FRS 3.4.7)</w:t>
       </w:r>
     </w:p>
-    <w:bookmarkEnd w:id="70"/>
-    <w:bookmarkStart w:id="71" w:name="fds-03-015-eligibility-management"/>
+    <w:bookmarkEnd w:id="71"/>
+    <w:bookmarkStart w:id="72" w:name="fds-03-015-eligibility-management"/>
     <w:p>
       <w:pPr>
         <w:pStyle w:val="Heading4"/>
@@ -10671,9 +11314,9 @@
         <w:t xml:space="preserve">.</w:t>
       </w:r>
     </w:p>
-    <w:bookmarkEnd w:id="71"/>
     <w:bookmarkEnd w:id="72"/>
-    <w:bookmarkStart w:id="75" w:name="container-configuration"/>
+    <w:bookmarkEnd w:id="73"/>
+    <w:bookmarkStart w:id="76" w:name="container-configuration"/>
     <w:p>
       <w:pPr>
         <w:pStyle w:val="Heading3"/>
@@ -10682,7 +11325,7 @@
         <w:t xml:space="preserve">3.6 Container Configuration</w:t>
       </w:r>
     </w:p>
-    <w:bookmarkStart w:id="73" w:name="fds-03-016-container-config"/>
+    <w:bookmarkStart w:id="74" w:name="fds-03-016-container-config"/>
     <w:p>
       <w:pPr>
         <w:pStyle w:val="Heading4"/>
@@ -10699,8 +11342,8 @@
         <w:t xml:space="preserve">Each finished good that ships to Honda SHALL have a container configuration record specifying: trays per container, parts per tray, whether serialized, dunnage code, and customer code. This configuration drives automatic container lifecycle management on the shop floor. (FRS 3.9.7)</w:t>
       </w:r>
     </w:p>
-    <w:bookmarkEnd w:id="73"/>
-    <w:bookmarkStart w:id="74" w:name="fds-03-017-container-closure-logic"/>
+    <w:bookmarkEnd w:id="74"/>
+    <w:bookmarkStart w:id="75" w:name="fds-03-017-container-closure-logic"/>
     <w:p>
       <w:pPr>
         <w:pStyle w:val="Heading4"/>
@@ -10748,10 +11391,10 @@
         </w:pict>
       </w:r>
     </w:p>
-    <w:bookmarkEnd w:id="74"/>
     <w:bookmarkEnd w:id="75"/>
     <w:bookmarkEnd w:id="76"/>
-    <w:bookmarkStart w:id="88" w:name="X2970193eafb64bf7490adf1a53e14ba3fd51569"/>
+    <w:bookmarkEnd w:id="77"/>
+    <w:bookmarkStart w:id="89" w:name="X2970193eafb64bf7490adf1a53e14ba3fd51569"/>
     <w:p>
       <w:pPr>
         <w:pStyle w:val="Heading2"/>
@@ -10769,7 +11412,7 @@
         <w:t xml:space="preserve">MVP</w:t>
       </w:r>
     </w:p>
-    <w:bookmarkStart w:id="80" w:name="authentication-architecture"/>
+    <w:bookmarkStart w:id="81" w:name="authentication-architecture"/>
     <w:p>
       <w:pPr>
         <w:pStyle w:val="Heading3"/>
@@ -10778,7 +11421,7 @@
         <w:t xml:space="preserve">4.1 Authentication Architecture</w:t>
       </w:r>
     </w:p>
-    <w:bookmarkStart w:id="77" w:name="fds-04-001-active-directory-integration"/>
+    <w:bookmarkStart w:id="78" w:name="fds-04-001-active-directory-integration"/>
     <w:p>
       <w:pPr>
         <w:pStyle w:val="Heading4"/>
@@ -10795,8 +11438,8 @@
         <w:t xml:space="preserve">The Ignition Gateway SHALL be configured with an Active Directory User Source. All user authentication SHALL be performed against AD. The MES database SHALL NOT store passwords (except hashed PINs for terminal convenience login). (FRS 5.3)</w:t>
       </w:r>
     </w:p>
-    <w:bookmarkEnd w:id="77"/>
-    <w:bookmarkStart w:id="78" w:name="fds-04-002-app-user-records"/>
+    <w:bookmarkEnd w:id="78"/>
+    <w:bookmarkStart w:id="79" w:name="fds-04-002-app-user-records"/>
     <w:p>
       <w:pPr>
         <w:pStyle w:val="Heading4"/>
@@ -10843,8 +11486,8 @@
         <w:t xml:space="preserve">field links to the AD identity. (FRS Spark Dependency B.8)</w:t>
       </w:r>
     </w:p>
-    <w:bookmarkEnd w:id="78"/>
-    <w:bookmarkStart w:id="79" w:name="fds-04-003-clock-number-pin-login"/>
+    <w:bookmarkEnd w:id="79"/>
+    <w:bookmarkStart w:id="80" w:name="fds-04-003-clock-number-pin-login"/>
     <w:p>
       <w:pPr>
         <w:pStyle w:val="Heading4"/>
@@ -10876,9 +11519,9 @@
         <w:t xml:space="preserve">record by clock number, verify the PIN hash, and establish a Perspective session under the corresponding AD identity. This avoids requiring operators to type AD credentials on a shop-floor keyboard. (FRS 3.6.1)</w:t>
       </w:r>
     </w:p>
-    <w:bookmarkEnd w:id="79"/>
     <w:bookmarkEnd w:id="80"/>
-    <w:bookmarkStart w:id="84" w:name="session-lifecycle"/>
+    <w:bookmarkEnd w:id="81"/>
+    <w:bookmarkStart w:id="85" w:name="session-lifecycle"/>
     <w:p>
       <w:pPr>
         <w:pStyle w:val="Heading3"/>
@@ -10911,7 +11554,7 @@
         <w:t xml:space="preserve">Blue Ridge recommends login-on-first-action with 5-minute inactivity timeout. High-security actions require re-authentication. Zone-based authentication requirements are under investigation as an alternative. Needs MPP validation before screen design.</w:t>
       </w:r>
     </w:p>
-    <w:bookmarkStart w:id="81" w:name="fds-04-004-session-model"/>
+    <w:bookmarkStart w:id="82" w:name="fds-04-004-session-model"/>
     <w:p>
       <w:pPr>
         <w:pStyle w:val="Heading4"/>
@@ -10928,8 +11571,8 @@
         <w:t xml:space="preserve">Operators SHALL authenticate on their first action at a terminal using clock number + PIN. The session SHALL remain active until the operator explicitly logs out or a configurable inactivity timeout expires (default: 5 minutes). An easy logout button SHALL be visible on all screens to support quick operator handoff at shared terminals.</w:t>
       </w:r>
     </w:p>
-    <w:bookmarkEnd w:id="81"/>
-    <w:bookmarkStart w:id="82" w:name="fds-04-005-elevated-actions"/>
+    <w:bookmarkEnd w:id="82"/>
+    <w:bookmarkStart w:id="83" w:name="fds-04-005-elevated-actions"/>
     <w:p>
       <w:pPr>
         <w:pStyle w:val="Heading4"/>
@@ -10946,8 +11589,8 @@
         <w:t xml:space="preserve">Actions with quality or financial impact (placing/releasing holds, scrapping LOTs, voiding shipping labels) SHALL require re-authentication regardless of session state. The system SHALL prompt for clock number + PIN before executing these actions, even if the operator has an active session. (FRS 3.3.1, 3.3.4)</w:t>
       </w:r>
     </w:p>
-    <w:bookmarkEnd w:id="82"/>
-    <w:bookmarkStart w:id="83" w:name="fds-04-006-multi-user-terminals"/>
+    <w:bookmarkEnd w:id="83"/>
+    <w:bookmarkStart w:id="84" w:name="fds-04-006-multi-user-terminals"/>
     <w:p>
       <w:pPr>
         <w:pStyle w:val="Heading4"/>
@@ -10964,9 +11607,9 @@
         <w:t xml:space="preserve">Since terminals are shared (per FDS-02-008), multiple operators will use the same terminal. The 5-minute timeout and prominent logout button ensure clean handoffs. Each operator authenticates individually via clock number + PIN. No full session restart is required — the system transitions directly from one user to another.</w:t>
       </w:r>
     </w:p>
-    <w:bookmarkEnd w:id="83"/>
     <w:bookmarkEnd w:id="84"/>
-    <w:bookmarkStart w:id="87" w:name="role-based-access"/>
+    <w:bookmarkEnd w:id="85"/>
+    <w:bookmarkStart w:id="88" w:name="role-based-access"/>
     <w:p>
       <w:pPr>
         <w:pStyle w:val="Heading3"/>
@@ -10975,7 +11618,7 @@
         <w:t xml:space="preserve">4.3 Role-Based Access</w:t>
       </w:r>
     </w:p>
-    <w:bookmarkStart w:id="85" w:name="fds-04-007-ignition-role-mapping"/>
+    <w:bookmarkStart w:id="86" w:name="fds-04-007-ignition-role-mapping"/>
     <w:p>
       <w:pPr>
         <w:pStyle w:val="Heading4"/>
@@ -11185,8 +11828,8 @@
         </w:tc>
       </w:tr>
     </w:tbl>
-    <w:bookmarkEnd w:id="85"/>
-    <w:bookmarkStart w:id="86" w:name="fds-04-008-screen-level-security"/>
+    <w:bookmarkEnd w:id="86"/>
+    <w:bookmarkStart w:id="87" w:name="fds-04-008-screen-level-security"/>
     <w:p>
       <w:pPr>
         <w:pStyle w:val="Heading4"/>
@@ -11210,10 +11853,10 @@
         </w:pict>
       </w:r>
     </w:p>
-    <w:bookmarkEnd w:id="86"/>
     <w:bookmarkEnd w:id="87"/>
     <w:bookmarkEnd w:id="88"/>
-    <w:bookmarkStart w:id="119" w:name="lot-lifecycle-genealogy-mvp"/>
+    <w:bookmarkEnd w:id="89"/>
+    <w:bookmarkStart w:id="120" w:name="lot-lifecycle-genealogy-mvp"/>
     <w:p>
       <w:pPr>
         <w:pStyle w:val="Heading2"/>
@@ -11231,7 +11874,7 @@
         <w:t xml:space="preserve">MVP</w:t>
       </w:r>
     </w:p>
-    <w:bookmarkStart w:id="92" w:name="lot-identity"/>
+    <w:bookmarkStart w:id="93" w:name="lot-identity"/>
     <w:p>
       <w:pPr>
         <w:pStyle w:val="Heading3"/>
@@ -11240,7 +11883,7 @@
         <w:t xml:space="preserve">5.1 LOT Identity</w:t>
       </w:r>
     </w:p>
-    <w:bookmarkStart w:id="89" w:name="fds-05-001-lot-uniqueness"/>
+    <w:bookmarkStart w:id="90" w:name="fds-05-001-lot-uniqueness"/>
     <w:p>
       <w:pPr>
         <w:pStyle w:val="Heading4"/>
@@ -11272,8 +11915,8 @@
         <w:t xml:space="preserve">— the barcode number printed on the physical LTT. LOT names SHALL be system-enforced unique via a database unique constraint. (FRS 3.9.6)</w:t>
       </w:r>
     </w:p>
-    <w:bookmarkEnd w:id="89"/>
-    <w:bookmarkStart w:id="90" w:name="fds-05-002-ltt-pre-printing"/>
+    <w:bookmarkEnd w:id="90"/>
+    <w:bookmarkStart w:id="91" w:name="fds-05-002-ltt-pre-printing"/>
     <w:p>
       <w:pPr>
         <w:pStyle w:val="Heading4"/>
@@ -11308,8 +11951,8 @@
         <w:t xml:space="preserve">If MPP requires LTT inventory management (tracking which barcodes have been printed but not yet used), this would be a configuration screen addition. Currently out of scope based on FRS 2.2.1.</w:t>
       </w:r>
     </w:p>
-    <w:bookmarkEnd w:id="90"/>
-    <w:bookmarkStart w:id="91" w:name="fds-05-003-lot-attributes"/>
+    <w:bookmarkEnd w:id="91"/>
+    <w:bookmarkStart w:id="92" w:name="fds-05-003-lot-attributes"/>
     <w:p>
       <w:pPr>
         <w:pStyle w:val="Heading4"/>
@@ -11844,9 +12487,9 @@
         <w:t xml:space="preserve">(FRS 3.9.6, 2.2.2)</w:t>
       </w:r>
     </w:p>
-    <w:bookmarkEnd w:id="91"/>
     <w:bookmarkEnd w:id="92"/>
-    <w:bookmarkStart w:id="96" w:name="lot-creation-workflows"/>
+    <w:bookmarkEnd w:id="93"/>
+    <w:bookmarkStart w:id="97" w:name="lot-creation-workflows"/>
     <w:p>
       <w:pPr>
         <w:pStyle w:val="Heading3"/>
@@ -11855,7 +12498,7 @@
         <w:t xml:space="preserve">5.2 LOT Creation Workflows</w:t>
       </w:r>
     </w:p>
-    <w:bookmarkStart w:id="93" w:name="X73ad30121c973d5d75ac3c447af18b3e31abffc"/>
+    <w:bookmarkStart w:id="94" w:name="X73ad30121c973d5d75ac3c447af18b3e31abffc"/>
     <w:p>
       <w:pPr>
         <w:pStyle w:val="Heading4"/>
@@ -12021,8 +12664,8 @@
         <w:t xml:space="preserve">Confirms that LTT tags at Die Cast are pre-printed and the first scan creates the record. No in-MES print for Die Cast LOT creation.</w:t>
       </w:r>
     </w:p>
-    <w:bookmarkEnd w:id="93"/>
-    <w:bookmarkStart w:id="94" w:name="X8c84fe94cf4f62f853ccfc28bc3e6bc23c1cb30"/>
+    <w:bookmarkEnd w:id="94"/>
+    <w:bookmarkStart w:id="95" w:name="X8c84fe94cf4f62f853ccfc28bc3e6bc23c1cb30"/>
     <w:p>
       <w:pPr>
         <w:pStyle w:val="Heading4"/>
@@ -12114,8 +12757,8 @@
         <w:t xml:space="preserve">(FRS 2.1.1, 2.1.12)</w:t>
       </w:r>
     </w:p>
-    <w:bookmarkEnd w:id="94"/>
-    <w:bookmarkStart w:id="95" w:name="X7f4268cbab9df7694a7f7282af8ee03e942dc17"/>
+    <w:bookmarkEnd w:id="95"/>
+    <w:bookmarkStart w:id="96" w:name="X7f4268cbab9df7694a7f7282af8ee03e942dc17"/>
     <w:p>
       <w:pPr>
         <w:pStyle w:val="Heading4"/>
@@ -12132,9 +12775,9 @@
         <w:t xml:space="preserve">Off-site receiving SHALL use the same Perspective application accessed remotely (VPN or published Ignition Gateway). The workflow is identical to FDS-05-005 except: origin type = ReceivedOffsite, and the location is the off-site inventory location. (See User Journey Assumption #6 for network/offline considerations)</w:t>
       </w:r>
     </w:p>
-    <w:bookmarkEnd w:id="95"/>
     <w:bookmarkEnd w:id="96"/>
-    <w:bookmarkStart w:id="99" w:name="lot-movement"/>
+    <w:bookmarkEnd w:id="97"/>
+    <w:bookmarkStart w:id="100" w:name="lot-movement"/>
     <w:p>
       <w:pPr>
         <w:pStyle w:val="Heading3"/>
@@ -12143,7 +12786,7 @@
         <w:t xml:space="preserve">5.3 LOT Movement</w:t>
       </w:r>
     </w:p>
-    <w:bookmarkStart w:id="97" w:name="fds-05-007-movement-tracking"/>
+    <w:bookmarkStart w:id="98" w:name="fds-05-007-movement-tracking"/>
     <w:p>
       <w:pPr>
         <w:pStyle w:val="Heading4"/>
@@ -12190,8 +12833,8 @@
         <w:t xml:space="preserve">SHALL be updated to reflect the new location. (FRS 3.9.8)</w:t>
       </w:r>
     </w:p>
-    <w:bookmarkEnd w:id="97"/>
-    <w:bookmarkStart w:id="98" w:name="fds-05-008-movement-workflow"/>
+    <w:bookmarkEnd w:id="98"/>
+    <w:bookmarkStart w:id="99" w:name="fds-05-008-movement-workflow"/>
     <w:p>
       <w:pPr>
         <w:pStyle w:val="Heading4"/>
@@ -12213,7 +12856,7 @@
         <w:pStyle w:val="Compact"/>
         <w:numPr>
           <w:ilvl w:val="0"/>
-          <w:numId w:val="1003"/>
+          <w:numId w:val="1005"/>
         </w:numPr>
       </w:pPr>
       <w:r>
@@ -12265,7 +12908,7 @@
         <w:pStyle w:val="Compact"/>
         <w:numPr>
           <w:ilvl w:val="0"/>
-          <w:numId w:val="1003"/>
+          <w:numId w:val="1005"/>
         </w:numPr>
       </w:pPr>
       <w:r>
@@ -12302,7 +12945,7 @@
         <w:pStyle w:val="Compact"/>
         <w:numPr>
           <w:ilvl w:val="0"/>
-          <w:numId w:val="1003"/>
+          <w:numId w:val="1005"/>
         </w:numPr>
       </w:pPr>
       <w:r>
@@ -12351,7 +12994,7 @@
         <w:pStyle w:val="Compact"/>
         <w:numPr>
           <w:ilvl w:val="0"/>
-          <w:numId w:val="1003"/>
+          <w:numId w:val="1005"/>
         </w:numPr>
       </w:pPr>
       <w:r>
@@ -12403,7 +13046,7 @@
         <w:pStyle w:val="Compact"/>
         <w:numPr>
           <w:ilvl w:val="0"/>
-          <w:numId w:val="1003"/>
+          <w:numId w:val="1005"/>
         </w:numPr>
       </w:pPr>
       <w:r>
@@ -12485,9 +13128,9 @@
         <w:t xml:space="preserve">. This keeps the traceability record complete without requiring redundant scans.</w:t>
       </w:r>
     </w:p>
-    <w:bookmarkEnd w:id="98"/>
     <w:bookmarkEnd w:id="99"/>
-    <w:bookmarkStart w:id="103" w:name="sub-lot-splitting"/>
+    <w:bookmarkEnd w:id="100"/>
+    <w:bookmarkStart w:id="104" w:name="sub-lot-splitting"/>
     <w:p>
       <w:pPr>
         <w:pStyle w:val="Heading3"/>
@@ -12496,7 +13139,7 @@
         <w:t xml:space="preserve">5.4 Sub-LOT Splitting</w:t>
       </w:r>
     </w:p>
-    <w:bookmarkStart w:id="100" w:name="fds-05-009-split-workflow"/>
+    <w:bookmarkStart w:id="101" w:name="fds-05-009-split-workflow"/>
     <w:p>
       <w:pPr>
         <w:pStyle w:val="Heading4"/>
@@ -12629,8 +13272,8 @@
         <w:t xml:space="preserve">The operator MAY cancel the auto-split and process the LOT without splitting. The operator MAY also adjust the number of sublots (not limited to 2) or the quantities before confirming. (FRS 2.1.4, 2.2.5, 3.9.12)</w:t>
       </w:r>
     </w:p>
-    <w:bookmarkEnd w:id="100"/>
-    <w:bookmarkStart w:id="101" w:name="fds-05-010-uneven-split-handling"/>
+    <w:bookmarkEnd w:id="101"/>
+    <w:bookmarkStart w:id="102" w:name="fds-05-010-uneven-split-handling"/>
     <w:p>
       <w:pPr>
         <w:pStyle w:val="Heading4"/>
@@ -12647,8 +13290,8 @@
         <w:t xml:space="preserve">If the parent LOT’s piece count is odd, the system SHALL propose the closest even split (e.g., 51 → 26/25). The operator MAY adjust these sizes before confirming. The total of all child quantities SHALL equal the parent’s piece count.</w:t>
       </w:r>
     </w:p>
-    <w:bookmarkEnd w:id="101"/>
-    <w:bookmarkStart w:id="102" w:name="fds-05-011-split-genealogy-permanence"/>
+    <w:bookmarkEnd w:id="102"/>
+    <w:bookmarkStart w:id="103" w:name="fds-05-011-split-genealogy-permanence"/>
     <w:p>
       <w:pPr>
         <w:pStyle w:val="Heading4"/>
@@ -12695,9 +13338,9 @@
         <w:t xml:space="preserve">records for graph traversal. Both directions (parent→children, child→parent) SHALL be queryable.</w:t>
       </w:r>
     </w:p>
-    <w:bookmarkEnd w:id="102"/>
     <w:bookmarkEnd w:id="103"/>
-    <w:bookmarkStart w:id="105" w:name="X5d74d1a066845934b4c3713e4f48545726ee7b2"/>
+    <w:bookmarkEnd w:id="104"/>
+    <w:bookmarkStart w:id="106" w:name="X5d74d1a066845934b4c3713e4f48545726ee7b2"/>
     <w:p>
       <w:pPr>
         <w:pStyle w:val="Heading3"/>
@@ -12733,7 +13376,7 @@
         <w:t xml:space="preserve">)</w:t>
       </w:r>
     </w:p>
-    <w:bookmarkStart w:id="104" w:name="fds-05-012-merge-capability"/>
+    <w:bookmarkStart w:id="105" w:name="fds-05-012-merge-capability"/>
     <w:p>
       <w:pPr>
         <w:pStyle w:val="Heading4"/>
@@ -12833,9 +13476,9 @@
         <w:t xml:space="preserve">Where these rules are defined (configuration screen vs. hard-coded) is also TBD — see UJ-08. The data model supports merges. The Perspective merge screen will not be built until rules are confirmed.</w:t>
       </w:r>
     </w:p>
-    <w:bookmarkEnd w:id="104"/>
     <w:bookmarkEnd w:id="105"/>
-    <w:bookmarkStart w:id="109" w:name="lot-status-transitions"/>
+    <w:bookmarkEnd w:id="106"/>
+    <w:bookmarkStart w:id="110" w:name="lot-status-transitions"/>
     <w:p>
       <w:pPr>
         <w:pStyle w:val="Heading3"/>
@@ -12844,7 +13487,7 @@
         <w:t xml:space="preserve">5.6 LOT Status Transitions</w:t>
       </w:r>
     </w:p>
-    <w:bookmarkStart w:id="106" w:name="fds-05-013-status-codes"/>
+    <w:bookmarkStart w:id="107" w:name="fds-05-013-status-codes"/>
     <w:p>
       <w:pPr>
         <w:pStyle w:val="Heading4"/>
@@ -13191,8 +13834,8 @@
         <w:t xml:space="preserve">(FRS 3.16.3)</w:t>
       </w:r>
     </w:p>
-    <w:bookmarkEnd w:id="106"/>
-    <w:bookmarkStart w:id="107" w:name="fds-05-014-status-transition-rules"/>
+    <w:bookmarkEnd w:id="107"/>
+    <w:bookmarkStart w:id="108" w:name="fds-05-014-status-transition-rules"/>
     <w:p>
       <w:pPr>
         <w:pStyle w:val="Heading4"/>
@@ -13283,8 +13926,8 @@
         <w:t xml:space="preserve">CLOSED → (none) (terminal state)</w:t>
       </w:r>
     </w:p>
-    <w:bookmarkEnd w:id="107"/>
-    <w:bookmarkStart w:id="108" w:name="fds-05-015-status-history"/>
+    <w:bookmarkEnd w:id="108"/>
+    <w:bookmarkStart w:id="109" w:name="fds-05-015-status-history"/>
     <w:p>
       <w:pPr>
         <w:pStyle w:val="Heading4"/>
@@ -13316,9 +13959,9 @@
         <w:t xml:space="preserve">event: LOT, old status, new status, reason, changed-by user, terminal, timestamp. (FRS 3.16.4)</w:t>
       </w:r>
     </w:p>
-    <w:bookmarkEnd w:id="108"/>
     <w:bookmarkEnd w:id="109"/>
-    <w:bookmarkStart w:id="113" w:name="genealogy"/>
+    <w:bookmarkEnd w:id="110"/>
+    <w:bookmarkStart w:id="114" w:name="genealogy"/>
     <w:p>
       <w:pPr>
         <w:pStyle w:val="Heading3"/>
@@ -13327,7 +13970,7 @@
         <w:t xml:space="preserve">5.7 Genealogy</w:t>
       </w:r>
     </w:p>
-    <w:bookmarkStart w:id="110" w:name="fds-05-016-genealogy-graph"/>
+    <w:bookmarkStart w:id="111" w:name="fds-05-016-genealogy-graph"/>
     <w:p>
       <w:pPr>
         <w:pStyle w:val="Heading4"/>
@@ -13359,8 +14002,8 @@
         <w:t xml:space="preserve">table SHALL record every parent→child relationship with: parent LOT, child LOT, relationship type (SPLIT, MERGE, CONSUMPTION), piece count transferred, user, terminal, and timestamp.</w:t>
       </w:r>
     </w:p>
-    <w:bookmarkEnd w:id="110"/>
-    <w:bookmarkStart w:id="111" w:name="fds-05-017-bidirectional-query"/>
+    <w:bookmarkEnd w:id="111"/>
+    <w:bookmarkStart w:id="112" w:name="fds-05-017-bidirectional-query"/>
     <w:p>
       <w:pPr>
         <w:pStyle w:val="Heading4"/>
@@ -13444,8 +14087,8 @@
         <w:t xml:space="preserve">adjacency list. (FRS 3.13.2)</w:t>
       </w:r>
     </w:p>
-    <w:bookmarkEnd w:id="111"/>
-    <w:bookmarkStart w:id="112" w:name="fds-05-018-genealogy-report"/>
+    <w:bookmarkEnd w:id="112"/>
+    <w:bookmarkStart w:id="113" w:name="fds-05-018-genealogy-report"/>
     <w:p>
       <w:pPr>
         <w:pStyle w:val="Heading4"/>
@@ -13462,9 +14105,9 @@
         <w:t xml:space="preserve">The system SHALL provide a genealogy report (screen and printable) that, given any LOT, sub-LOT, serial number, or container, displays the complete tree: source LOTs, operations performed, operators, machines, timestamps, and shipping destination. This is the primary Honda traceability deliverable.</w:t>
       </w:r>
     </w:p>
-    <w:bookmarkEnd w:id="112"/>
     <w:bookmarkEnd w:id="113"/>
-    <w:bookmarkStart w:id="116" w:name="lot-label-management"/>
+    <w:bookmarkEnd w:id="114"/>
+    <w:bookmarkStart w:id="117" w:name="lot-label-management"/>
     <w:p>
       <w:pPr>
         <w:pStyle w:val="Heading3"/>
@@ -13473,7 +14116,7 @@
         <w:t xml:space="preserve">5.8 LOT Label Management</w:t>
       </w:r>
     </w:p>
-    <w:bookmarkStart w:id="114" w:name="fds-05-019-label-print-tracking"/>
+    <w:bookmarkStart w:id="115" w:name="fds-05-019-label-print-tracking"/>
     <w:p>
       <w:pPr>
         <w:pStyle w:val="Heading4"/>
@@ -13505,8 +14148,8 @@
         <w:t xml:space="preserve">table with: LOT, print reason, ZPL content, printer name, printed-by user, terminal, and timestamp.</w:t>
       </w:r>
     </w:p>
-    <w:bookmarkEnd w:id="114"/>
-    <w:bookmarkStart w:id="115" w:name="fds-05-020-print-reasons"/>
+    <w:bookmarkEnd w:id="115"/>
+    <w:bookmarkStart w:id="116" w:name="fds-05-020-print-reasons"/>
     <w:p>
       <w:pPr>
         <w:pStyle w:val="Heading4"/>
@@ -13929,9 +14572,9 @@
         <w:t xml:space="preserve">(FRS 3.13.1, 2.2.1, UJ-02)</w:t>
       </w:r>
     </w:p>
-    <w:bookmarkEnd w:id="115"/>
     <w:bookmarkEnd w:id="116"/>
-    <w:bookmarkStart w:id="118" w:name="lot-attribute-auditing"/>
+    <w:bookmarkEnd w:id="117"/>
+    <w:bookmarkStart w:id="119" w:name="lot-attribute-auditing"/>
     <w:p>
       <w:pPr>
         <w:pStyle w:val="Heading3"/>
@@ -13940,7 +14583,7 @@
         <w:t xml:space="preserve">5.9 LOT Attribute Auditing</w:t>
       </w:r>
     </w:p>
-    <w:bookmarkStart w:id="117" w:name="fds-05-021-attribute-change-log"/>
+    <w:bookmarkStart w:id="118" w:name="fds-05-021-attribute-change-log"/>
     <w:p>
       <w:pPr>
         <w:pStyle w:val="Heading4"/>
@@ -13986,10 +14629,10 @@
         </w:pict>
       </w:r>
     </w:p>
-    <w:bookmarkEnd w:id="117"/>
     <w:bookmarkEnd w:id="118"/>
     <w:bookmarkEnd w:id="119"/>
-    <w:bookmarkStart w:id="154" w:name="production-execution-mvp-expanded"/>
+    <w:bookmarkEnd w:id="120"/>
+    <w:bookmarkStart w:id="155" w:name="production-execution-mvp-expanded"/>
     <w:p>
       <w:pPr>
         <w:pStyle w:val="Heading2"/>
@@ -14007,7 +14650,7 @@
         <w:t xml:space="preserve">MVP-EXPANDED</w:t>
       </w:r>
     </w:p>
-    <w:bookmarkStart w:id="120" w:name="design-overview-1"/>
+    <w:bookmarkStart w:id="121" w:name="design-overview-1"/>
     <w:p>
       <w:pPr>
         <w:pStyle w:val="Heading3"/>
@@ -14097,8 +14740,8 @@
         <w:t xml:space="preserve">This section replaces the paper production sheets (DCFM-1589/1785/2003 and MS1FM-series) and the legacy Productivity Database manual data entry workflow. Operators enter data at the point of action in real time, eliminating the 2-hour post-shift clerk entry pattern. (FRS 3.5.4, 5.6.6)</w:t>
       </w:r>
     </w:p>
-    <w:bookmarkEnd w:id="120"/>
-    <w:bookmarkStart w:id="124" w:name="die-cast-workflow"/>
+    <w:bookmarkEnd w:id="121"/>
+    <w:bookmarkStart w:id="125" w:name="die-cast-workflow"/>
     <w:p>
       <w:pPr>
         <w:pStyle w:val="Heading3"/>
@@ -14107,7 +14750,7 @@
         <w:t xml:space="preserve">6.2 Die Cast Workflow</w:t>
       </w:r>
     </w:p>
-    <w:bookmarkStart w:id="121" w:name="fds-06-001-die-cast-production-screen"/>
+    <w:bookmarkStart w:id="122" w:name="fds-06-001-die-cast-production-screen"/>
     <w:p>
       <w:pPr>
         <w:pStyle w:val="Heading4"/>
@@ -14121,13 +14764,31 @@
         <w:pStyle w:val="FirstParagraph"/>
       </w:pPr>
       <w:r>
-        <w:t xml:space="preserve">The Die Cast production screen SHALL be driven by the operation template flags (</w:t>
-      </w:r>
-      <w:r>
-        <w:rPr>
-          <w:rStyle w:val="VerbatimChar"/>
-        </w:rPr>
-        <w:t xml:space="preserve">CollectsDieInfo</w:t>
+        <w:t xml:space="preserve">The Die Cast production screen SHALL be driven by the active operation template’s</w:t>
+      </w:r>
+      <w:r>
+        <w:t xml:space="preserve"> </w:t>
+      </w:r>
+      <w:r>
+        <w:rPr>
+          <w:rStyle w:val="VerbatimChar"/>
+        </w:rPr>
+        <w:t xml:space="preserve">OperationTemplateField</w:t>
+      </w:r>
+      <w:r>
+        <w:t xml:space="preserve"> </w:t>
+      </w:r>
+      <w:r>
+        <w:t xml:space="preserve">rows (typically configured with</w:t>
+      </w:r>
+      <w:r>
+        <w:t xml:space="preserve"> </w:t>
+      </w:r>
+      <w:r>
+        <w:rPr>
+          <w:rStyle w:val="VerbatimChar"/>
+        </w:rPr>
+        <w:t xml:space="preserve">DieInfo</w:t>
       </w:r>
       <w:r>
         <w:t xml:space="preserve">,</w:t>
@@ -14139,7 +14800,7 @@
         <w:rPr>
           <w:rStyle w:val="VerbatimChar"/>
         </w:rPr>
-        <w:t xml:space="preserve">CollectsCavityInfo</w:t>
+        <w:t xml:space="preserve">CavityInfo</w:t>
       </w:r>
       <w:r>
         <w:t xml:space="preserve">,</w:t>
@@ -14151,7 +14812,7 @@
         <w:rPr>
           <w:rStyle w:val="VerbatimChar"/>
         </w:rPr>
-        <w:t xml:space="preserve">CollectsWeight</w:t>
+        <w:t xml:space="preserve">Weight</w:t>
       </w:r>
       <w:r>
         <w:t xml:space="preserve">,</w:t>
@@ -14163,7 +14824,7 @@
         <w:rPr>
           <w:rStyle w:val="VerbatimChar"/>
         </w:rPr>
-        <w:t xml:space="preserve">CollectsGoodCount</w:t>
+        <w:t xml:space="preserve">GoodCount</w:t>
       </w:r>
       <w:r>
         <w:t xml:space="preserve">,</w:t>
@@ -14175,10 +14836,28 @@
         <w:rPr>
           <w:rStyle w:val="VerbatimChar"/>
         </w:rPr>
-        <w:t xml:space="preserve">CollectsBadCount</w:t>
-      </w:r>
-      <w:r>
-        <w:t xml:space="preserve">). The screen SHALL present:</w:t>
+        <w:t xml:space="preserve">BadCount</w:t>
+      </w:r>
+      <w:r>
+        <w:t xml:space="preserve"> </w:t>
+      </w:r>
+      <w:r>
+        <w:t xml:space="preserve">for die cast operations). Fields flagged</w:t>
+      </w:r>
+      <w:r>
+        <w:t xml:space="preserve"> </w:t>
+      </w:r>
+      <w:r>
+        <w:rPr>
+          <w:rStyle w:val="VerbatimChar"/>
+        </w:rPr>
+        <w:t xml:space="preserve">IsRequired = 1</w:t>
+      </w:r>
+      <w:r>
+        <w:t xml:space="preserve"> </w:t>
+      </w:r>
+      <w:r>
+        <w:t xml:space="preserve">on the junction SHALL be mandatory on submit. The screen SHALL present:</w:t>
       </w:r>
       <w:r>
         <w:t xml:space="preserve"> </w:t>
@@ -14217,8 +14896,8 @@
         <w:t xml:space="preserve">- Weight (manual entry or automatic from OmniServer scale where available)</w:t>
       </w:r>
     </w:p>
-    <w:bookmarkEnd w:id="121"/>
-    <w:bookmarkStart w:id="122" w:name="fds-06-002-die-cast-validation"/>
+    <w:bookmarkEnd w:id="122"/>
+    <w:bookmarkStart w:id="123" w:name="fds-06-002-die-cast-validation"/>
     <w:p>
       <w:pPr>
         <w:pStyle w:val="Heading4"/>
@@ -14271,8 +14950,8 @@
         <w:t xml:space="preserve">- If any validation fails, the system SHALL display a clear error and prevent the recording</w:t>
       </w:r>
     </w:p>
-    <w:bookmarkEnd w:id="122"/>
-    <w:bookmarkStart w:id="123" w:name="fds-06-003-die-cast-production-event"/>
+    <w:bookmarkEnd w:id="123"/>
+    <w:bookmarkStart w:id="124" w:name="fds-06-003-die-cast-production-event"/>
     <w:p>
       <w:pPr>
         <w:pStyle w:val="Heading4"/>
@@ -14286,7 +14965,7 @@
         <w:pStyle w:val="FirstParagraph"/>
       </w:pPr>
       <w:r>
-        <w:t xml:space="preserve">On submission, the system SHALL:</w:t>
+        <w:t xml:space="preserve">On submission, the system SHALL (per FDS-03-017a, in one transaction):</w:t>
       </w:r>
       <w:r>
         <w:t xml:space="preserve"> </w:t>
@@ -14301,19 +14980,229 @@
         <w:rPr>
           <w:rStyle w:val="VerbatimChar"/>
         </w:rPr>
-        <w:t xml:space="preserve">ProductionEvent</w:t>
-      </w:r>
-      <w:r>
-        <w:t xml:space="preserve"> </w:t>
-      </w:r>
-      <w:r>
-        <w:t xml:space="preserve">(lot, location, item, good count, no-good count, operator, TerminalLocation, timestamp)</w:t>
-      </w:r>
-      <w:r>
-        <w:t xml:space="preserve"> </w:t>
-      </w:r>
-      <w:r>
-        <w:t xml:space="preserve">2. Update the LOT’s</w:t>
+        <w:t xml:space="preserve">Workorder.ProductionEvent</w:t>
+      </w:r>
+      <w:r>
+        <w:t xml:space="preserve"> </w:t>
+      </w:r>
+      <w:r>
+        <w:t xml:space="preserve">header carrying</w:t>
+      </w:r>
+      <w:r>
+        <w:t xml:space="preserve"> </w:t>
+      </w:r>
+      <w:r>
+        <w:rPr>
+          <w:rStyle w:val="VerbatimChar"/>
+        </w:rPr>
+        <w:t xml:space="preserve">OperationTemplateId</w:t>
+      </w:r>
+      <w:r>
+        <w:t xml:space="preserve">,</w:t>
+      </w:r>
+      <w:r>
+        <w:t xml:space="preserve"> </w:t>
+      </w:r>
+      <w:r>
+        <w:rPr>
+          <w:rStyle w:val="VerbatimChar"/>
+        </w:rPr>
+        <w:t xml:space="preserve">LotId</w:t>
+      </w:r>
+      <w:r>
+        <w:t xml:space="preserve">,</w:t>
+      </w:r>
+      <w:r>
+        <w:t xml:space="preserve"> </w:t>
+      </w:r>
+      <w:r>
+        <w:rPr>
+          <w:rStyle w:val="VerbatimChar"/>
+        </w:rPr>
+        <w:t xml:space="preserve">LocationId</w:t>
+      </w:r>
+      <w:r>
+        <w:t xml:space="preserve">,</w:t>
+      </w:r>
+      <w:r>
+        <w:t xml:space="preserve"> </w:t>
+      </w:r>
+      <w:r>
+        <w:rPr>
+          <w:rStyle w:val="VerbatimChar"/>
+        </w:rPr>
+        <w:t xml:space="preserve">ItemId</w:t>
+      </w:r>
+      <w:r>
+        <w:t xml:space="preserve">,</w:t>
+      </w:r>
+      <w:r>
+        <w:t xml:space="preserve"> </w:t>
+      </w:r>
+      <w:r>
+        <w:rPr>
+          <w:rStyle w:val="VerbatimChar"/>
+        </w:rPr>
+        <w:t xml:space="preserve">GoodCount</w:t>
+      </w:r>
+      <w:r>
+        <w:t xml:space="preserve">,</w:t>
+      </w:r>
+      <w:r>
+        <w:t xml:space="preserve"> </w:t>
+      </w:r>
+      <w:r>
+        <w:rPr>
+          <w:rStyle w:val="VerbatimChar"/>
+        </w:rPr>
+        <w:t xml:space="preserve">NoGoodCount</w:t>
+      </w:r>
+      <w:r>
+        <w:t xml:space="preserve">,</w:t>
+      </w:r>
+      <w:r>
+        <w:t xml:space="preserve"> </w:t>
+      </w:r>
+      <w:r>
+        <w:rPr>
+          <w:rStyle w:val="VerbatimChar"/>
+        </w:rPr>
+        <w:t xml:space="preserve">DieIdentifier</w:t>
+      </w:r>
+      <w:r>
+        <w:t xml:space="preserve"> </w:t>
+      </w:r>
+      <w:r>
+        <w:t xml:space="preserve">(from the machine’s</w:t>
+      </w:r>
+      <w:r>
+        <w:t xml:space="preserve"> </w:t>
+      </w:r>
+      <w:r>
+        <w:rPr>
+          <w:rStyle w:val="VerbatimChar"/>
+        </w:rPr>
+        <w:t xml:space="preserve">LocationAttribute</w:t>
+      </w:r>
+      <w:r>
+        <w:t xml:space="preserve">),</w:t>
+      </w:r>
+      <w:r>
+        <w:t xml:space="preserve"> </w:t>
+      </w:r>
+      <w:r>
+        <w:rPr>
+          <w:rStyle w:val="VerbatimChar"/>
+        </w:rPr>
+        <w:t xml:space="preserve">CavityNumber</w:t>
+      </w:r>
+      <w:r>
+        <w:t xml:space="preserve">,</w:t>
+      </w:r>
+      <w:r>
+        <w:t xml:space="preserve"> </w:t>
+      </w:r>
+      <w:r>
+        <w:rPr>
+          <w:rStyle w:val="VerbatimChar"/>
+        </w:rPr>
+        <w:t xml:space="preserve">WeightValue</w:t>
+      </w:r>
+      <w:r>
+        <w:t xml:space="preserve"> </w:t>
+      </w:r>
+      <w:r>
+        <w:t xml:space="preserve">+</w:t>
+      </w:r>
+      <w:r>
+        <w:t xml:space="preserve"> </w:t>
+      </w:r>
+      <w:r>
+        <w:rPr>
+          <w:rStyle w:val="VerbatimChar"/>
+        </w:rPr>
+        <w:t xml:space="preserve">WeightUomId</w:t>
+      </w:r>
+      <w:r>
+        <w:t xml:space="preserve">,</w:t>
+      </w:r>
+      <w:r>
+        <w:t xml:space="preserve"> </w:t>
+      </w:r>
+      <w:r>
+        <w:rPr>
+          <w:rStyle w:val="VerbatimChar"/>
+        </w:rPr>
+        <w:t xml:space="preserve">OperatorId</w:t>
+      </w:r>
+      <w:r>
+        <w:t xml:space="preserve">,</w:t>
+      </w:r>
+      <w:r>
+        <w:t xml:space="preserve"> </w:t>
+      </w:r>
+      <w:r>
+        <w:rPr>
+          <w:rStyle w:val="VerbatimChar"/>
+        </w:rPr>
+        <w:t xml:space="preserve">TerminalLocationId</w:t>
+      </w:r>
+      <w:r>
+        <w:t xml:space="preserve">, and</w:t>
+      </w:r>
+      <w:r>
+        <w:t xml:space="preserve"> </w:t>
+      </w:r>
+      <w:r>
+        <w:rPr>
+          <w:rStyle w:val="VerbatimChar"/>
+        </w:rPr>
+        <w:t xml:space="preserve">RecordedAt</w:t>
+      </w:r>
+      <w:r>
+        <w:t xml:space="preserve">.</w:t>
+      </w:r>
+      <w:r>
+        <w:t xml:space="preserve"> </w:t>
+      </w:r>
+      <w:r>
+        <w:t xml:space="preserve">2. Write one</w:t>
+      </w:r>
+      <w:r>
+        <w:t xml:space="preserve"> </w:t>
+      </w:r>
+      <w:r>
+        <w:rPr>
+          <w:rStyle w:val="VerbatimChar"/>
+        </w:rPr>
+        <w:t xml:space="preserve">Workorder.ProductionEventValue</w:t>
+      </w:r>
+      <w:r>
+        <w:t xml:space="preserve"> </w:t>
+      </w:r>
+      <w:r>
+        <w:t xml:space="preserve">child row per non-hot</w:t>
+      </w:r>
+      <w:r>
+        <w:t xml:space="preserve"> </w:t>
+      </w:r>
+      <w:r>
+        <w:rPr>
+          <w:rStyle w:val="VerbatimChar"/>
+        </w:rPr>
+        <w:t xml:space="preserve">DataCollectionField</w:t>
+      </w:r>
+      <w:r>
+        <w:t xml:space="preserve"> </w:t>
+      </w:r>
+      <w:r>
+        <w:t xml:space="preserve">configured on the active operation template.</w:t>
+      </w:r>
+      <w:r>
+        <w:t xml:space="preserve"> </w:t>
+      </w:r>
+      <w:r>
+        <w:t xml:space="preserve">3. Update the LOT’s</w:t>
       </w:r>
       <w:r>
         <w:t xml:space="preserve"> </w:t>
@@ -14328,13 +15217,13 @@
         <w:t xml:space="preserve"> </w:t>
       </w:r>
       <w:r>
-        <w:t xml:space="preserve">to reflect the good count</w:t>
-      </w:r>
-      <w:r>
-        <w:t xml:space="preserve"> </w:t>
-      </w:r>
-      <w:r>
-        <w:t xml:space="preserve">3. Log to</w:t>
+        <w:t xml:space="preserve">to reflect the good count.</w:t>
+      </w:r>
+      <w:r>
+        <w:t xml:space="preserve"> </w:t>
+      </w:r>
+      <w:r>
+        <w:t xml:space="preserve">4. Log to</w:t>
       </w:r>
       <w:r>
         <w:t xml:space="preserve"> </w:t>
@@ -14344,6 +15233,9 @@
           <w:rStyle w:val="VerbatimChar"/>
         </w:rPr>
         <w:t xml:space="preserve">Audit.OperationLog</w:t>
+      </w:r>
+      <w:r>
+        <w:t xml:space="preserve">.</w:t>
       </w:r>
     </w:p>
     <w:p>
@@ -14427,9 +15319,9 @@
         <w:t xml:space="preserve">. This separates warm-up activity (time + shots wasted) from production activity (good parts made). Needs review with Ben.</w:t>
       </w:r>
     </w:p>
-    <w:bookmarkEnd w:id="123"/>
     <w:bookmarkEnd w:id="124"/>
-    <w:bookmarkStart w:id="128" w:name="trim-shop-workflow"/>
+    <w:bookmarkEnd w:id="125"/>
+    <w:bookmarkStart w:id="129" w:name="trim-shop-workflow"/>
     <w:p>
       <w:pPr>
         <w:pStyle w:val="Heading3"/>
@@ -14438,7 +15330,7 @@
         <w:t xml:space="preserve">6.3 Trim Shop Workflow</w:t>
       </w:r>
     </w:p>
-    <w:bookmarkStart w:id="125" w:name="fds-06-004-trim-shop-lot-processing"/>
+    <w:bookmarkStart w:id="126" w:name="fds-06-004-trim-shop-lot-processing"/>
     <w:p>
       <w:pPr>
         <w:pStyle w:val="Heading4"/>
@@ -14470,8 +15362,8 @@
         <w:t xml:space="preserve">to the Trim area. (FRS 2.2.3)</w:t>
       </w:r>
     </w:p>
-    <w:bookmarkEnd w:id="125"/>
-    <w:bookmarkStart w:id="126" w:name="Xed1f1d4b9a4131323f5cf3c876db5890be27ed9"/>
+    <w:bookmarkEnd w:id="126"/>
+    <w:bookmarkStart w:id="127" w:name="Xed1f1d4b9a4131323f5cf3c876db5890be27ed9"/>
     <w:p>
       <w:pPr>
         <w:pStyle w:val="Heading4"/>
@@ -14557,8 +15449,8 @@
         <w:t xml:space="preserve">LotAttributeChange</w:t>
       </w:r>
     </w:p>
-    <w:bookmarkEnd w:id="126"/>
-    <w:bookmarkStart w:id="127" w:name="fds-06-006-trim-production-event"/>
+    <w:bookmarkEnd w:id="127"/>
+    <w:bookmarkStart w:id="128" w:name="fds-06-006-trim-production-event"/>
     <w:p>
       <w:pPr>
         <w:pStyle w:val="Heading4"/>
@@ -14590,9 +15482,9 @@
         <w:t xml:space="preserve">for the Trim operation, confirming the LOT passed through this step.</w:t>
       </w:r>
     </w:p>
-    <w:bookmarkEnd w:id="127"/>
     <w:bookmarkEnd w:id="128"/>
-    <w:bookmarkStart w:id="132" w:name="machining-workflow"/>
+    <w:bookmarkEnd w:id="129"/>
+    <w:bookmarkStart w:id="133" w:name="machining-workflow"/>
     <w:p>
       <w:pPr>
         <w:pStyle w:val="Heading3"/>
@@ -14601,7 +15493,7 @@
         <w:t xml:space="preserve">6.4 Machining Workflow</w:t>
       </w:r>
     </w:p>
-    <w:bookmarkStart w:id="129" w:name="fds-06-007-machining-in"/>
+    <w:bookmarkStart w:id="130" w:name="fds-06-007-machining-in"/>
     <w:p>
       <w:pPr>
         <w:pStyle w:val="Heading4"/>
@@ -14651,8 +15543,8 @@
         <w:t xml:space="preserve">3. Show the FIFO queue of LOTs waiting at this machine (ordered by arrival time), with operator ability to override the queue order (FRS 2.2.4)</w:t>
       </w:r>
     </w:p>
-    <w:bookmarkEnd w:id="129"/>
-    <w:bookmarkStart w:id="130" w:name="fds-06-008-machining-out"/>
+    <w:bookmarkEnd w:id="130"/>
+    <w:bookmarkStart w:id="131" w:name="fds-06-008-machining-out"/>
     <w:p>
       <w:pPr>
         <w:pStyle w:val="Heading4"/>
@@ -14721,8 +15613,8 @@
         <w:t xml:space="preserve">The operator MAY perform production recording and splitting in a single workflow (record machining results, then split the output into sub-LOTs for downstream operations). (FRS 2.2.5)</w:t>
       </w:r>
     </w:p>
-    <w:bookmarkEnd w:id="130"/>
-    <w:bookmarkStart w:id="131" w:name="fds-06-009-machining-production-event"/>
+    <w:bookmarkEnd w:id="131"/>
+    <w:bookmarkStart w:id="132" w:name="fds-06-009-machining-production-event"/>
     <w:p>
       <w:pPr>
         <w:pStyle w:val="Heading4"/>
@@ -14769,9 +15661,9 @@
         <w:t xml:space="preserve">SHALL be written for each defect code used.</w:t>
       </w:r>
     </w:p>
-    <w:bookmarkEnd w:id="131"/>
     <w:bookmarkEnd w:id="132"/>
-    <w:bookmarkStart w:id="136" w:name="assembly-workflow-serialized-lines"/>
+    <w:bookmarkEnd w:id="133"/>
+    <w:bookmarkStart w:id="137" w:name="assembly-workflow-serialized-lines"/>
     <w:p>
       <w:pPr>
         <w:pStyle w:val="Heading3"/>
@@ -14780,7 +15672,7 @@
         <w:t xml:space="preserve">6.5 Assembly Workflow — Serialized Lines</w:t>
       </w:r>
     </w:p>
-    <w:bookmarkStart w:id="133" w:name="Xa688ac5e1150784ce49ac583be71cb75e3d8f4d"/>
+    <w:bookmarkStart w:id="134" w:name="Xa688ac5e1150784ce49ac583be71cb75e3d8f4d"/>
     <w:p>
       <w:pPr>
         <w:pStyle w:val="Heading4"/>
@@ -14970,8 +15862,8 @@
         <w:t xml:space="preserve">(FRS 2.1.7, 2.1.10; Touchpoint Agreement Section 1.4)</w:t>
       </w:r>
     </w:p>
-    <w:bookmarkEnd w:id="133"/>
-    <w:bookmarkStart w:id="134" w:name="X40aa65024f4545dbd47031ce5ef8716b9204013"/>
+    <w:bookmarkEnd w:id="134"/>
+    <w:bookmarkStart w:id="135" w:name="X40aa65024f4545dbd47031ce5ef8716b9204013"/>
     <w:p>
       <w:pPr>
         <w:pStyle w:val="Heading4"/>
@@ -15064,8 +15956,8 @@
         <w:t xml:space="preserve">Material verification uses BOM-based checking — the system validates that the scanned source LOT’s part number matches a BOM component. Substitute parts are rejected. Needs MPP confirmation.</w:t>
       </w:r>
     </w:p>
-    <w:bookmarkEnd w:id="134"/>
-    <w:bookmarkStart w:id="135" w:name="fds-06-012-hardware-interlock-bypass"/>
+    <w:bookmarkEnd w:id="135"/>
+    <w:bookmarkStart w:id="136" w:name="fds-06-012-hardware-interlock-bypass"/>
     <w:p>
       <w:pPr>
         <w:pStyle w:val="Heading4"/>
@@ -15217,9 +16109,9 @@
         <w:t xml:space="preserve">— marks the broader production event. The circumstances under which MPP bypasses the interlock are not yet understood. Both options presented for discussion with Ben. See data model for details.</w:t>
       </w:r>
     </w:p>
-    <w:bookmarkEnd w:id="135"/>
     <w:bookmarkEnd w:id="136"/>
-    <w:bookmarkStart w:id="139" w:name="assembly-workflow-non-serialized-lines"/>
+    <w:bookmarkEnd w:id="137"/>
+    <w:bookmarkStart w:id="140" w:name="assembly-workflow-non-serialized-lines"/>
     <w:p>
       <w:pPr>
         <w:pStyle w:val="Heading3"/>
@@ -15228,7 +16120,7 @@
         <w:t xml:space="preserve">6.6 Assembly Workflow — Non-Serialized Lines</w:t>
       </w:r>
     </w:p>
-    <w:bookmarkStart w:id="137" w:name="fds-06-013-non-serialized-assembly"/>
+    <w:bookmarkStart w:id="138" w:name="fds-06-013-non-serialized-assembly"/>
     <w:p>
       <w:pPr>
         <w:pStyle w:val="Heading4"/>
@@ -15322,8 +16214,8 @@
         <w:t xml:space="preserve">tags provide automated validation without individual serial tracking.</w:t>
       </w:r>
     </w:p>
-    <w:bookmarkEnd w:id="137"/>
-    <w:bookmarkStart w:id="138" w:name="X4e464a1b04ae7fa65e9ef5bcae72c4fdee87d5d"/>
+    <w:bookmarkEnd w:id="138"/>
+    <w:bookmarkStart w:id="139" w:name="X4e464a1b04ae7fa65e9ef5bcae72c4fdee87d5d"/>
     <w:p>
       <w:pPr>
         <w:pStyle w:val="Heading4"/>
@@ -15445,9 +16337,9 @@
         <w:t xml:space="preserve">signal).</w:t>
       </w:r>
     </w:p>
-    <w:bookmarkEnd w:id="138"/>
     <w:bookmarkEnd w:id="139"/>
-    <w:bookmarkStart w:id="142" w:name="production-events"/>
+    <w:bookmarkEnd w:id="140"/>
+    <w:bookmarkStart w:id="143" w:name="production-events"/>
     <w:p>
       <w:pPr>
         <w:pStyle w:val="Heading3"/>
@@ -15456,7 +16348,7 @@
         <w:t xml:space="preserve">6.7 Production Events</w:t>
       </w:r>
     </w:p>
-    <w:bookmarkStart w:id="140" w:name="fds-06-015-production-event-immutability"/>
+    <w:bookmarkStart w:id="141" w:name="fds-06-015-production-event-immutability"/>
     <w:p>
       <w:pPr>
         <w:pStyle w:val="Heading4"/>
@@ -15488,8 +16380,8 @@
         <w:t xml:space="preserve">record SHALL NOT be modified or deleted. If a correction is needed, a new compensating event SHALL be recorded (e.g., a negative adjustment event with remarks explaining the correction). (FRS 3.5.4)</w:t>
       </w:r>
     </w:p>
-    <w:bookmarkEnd w:id="140"/>
-    <w:bookmarkStart w:id="141" w:name="fds-06-016-production-event-fields"/>
+    <w:bookmarkEnd w:id="141"/>
+    <w:bookmarkStart w:id="142" w:name="fds-06-016-production-event-fields"/>
     <w:p>
       <w:pPr>
         <w:pStyle w:val="Heading4"/>
@@ -15536,9 +16428,9 @@
         <w:t xml:space="preserve">FK is nullable — production events function independently of work orders.</w:t>
       </w:r>
     </w:p>
-    <w:bookmarkEnd w:id="141"/>
     <w:bookmarkEnd w:id="142"/>
-    <w:bookmarkStart w:id="146" w:name="reject-events-and-scrap-handling"/>
+    <w:bookmarkEnd w:id="143"/>
+    <w:bookmarkStart w:id="147" w:name="reject-events-and-scrap-handling"/>
     <w:p>
       <w:pPr>
         <w:pStyle w:val="Heading3"/>
@@ -15547,7 +16439,7 @@
         <w:t xml:space="preserve">6.8 Reject Events and Scrap Handling</w:t>
       </w:r>
     </w:p>
-    <w:bookmarkStart w:id="143" w:name="fds-06-017-reject-recording"/>
+    <w:bookmarkStart w:id="144" w:name="fds-06-017-reject-recording"/>
     <w:p>
       <w:pPr>
         <w:pStyle w:val="Heading4"/>
@@ -15564,8 +16456,8 @@
         <w:t xml:space="preserve">The system SHALL allow operators to record reject/scrap counts associated with a LOT and defect code. Reject entry is optional — MPP may elect not to record rejects at every manufacturing step (FRS Section 4). The system SHALL allow but SHALL NOT require reject entry at each operation.</w:t>
       </w:r>
     </w:p>
-    <w:bookmarkEnd w:id="143"/>
-    <w:bookmarkStart w:id="144" w:name="fds-06-018-reject-event-fields"/>
+    <w:bookmarkEnd w:id="144"/>
+    <w:bookmarkStart w:id="145" w:name="fds-06-018-reject-event-fields"/>
     <w:p>
       <w:pPr>
         <w:pStyle w:val="Heading4"/>
@@ -15597,8 +16489,8 @@
         <w:t xml:space="preserve">SHALL record: associated production event (nullable), LOT, defect code, quantity, charge-to area (optional), remarks, operator, and timestamp.</w:t>
       </w:r>
     </w:p>
-    <w:bookmarkEnd w:id="144"/>
-    <w:bookmarkStart w:id="145" w:name="X0c95962e9db56e8bdb267e461177b84974d57f9"/>
+    <w:bookmarkEnd w:id="145"/>
+    <w:bookmarkStart w:id="146" w:name="X0c95962e9db56e8bdb267e461177b84974d57f9"/>
     <w:p>
       <w:pPr>
         <w:pStyle w:val="Heading4"/>
@@ -15716,7 +16608,7 @@
         <w:pStyle w:val="Compact"/>
         <w:numPr>
           <w:ilvl w:val="0"/>
-          <w:numId w:val="1004"/>
+          <w:numId w:val="1006"/>
         </w:numPr>
       </w:pPr>
       <w:r>
@@ -15738,7 +16630,7 @@
         <w:pStyle w:val="Compact"/>
         <w:numPr>
           <w:ilvl w:val="0"/>
-          <w:numId w:val="1004"/>
+          <w:numId w:val="1006"/>
         </w:numPr>
       </w:pPr>
       <w:r>
@@ -15871,7 +16763,7 @@
         <w:pStyle w:val="Compact"/>
         <w:numPr>
           <w:ilvl w:val="0"/>
-          <w:numId w:val="1005"/>
+          <w:numId w:val="1007"/>
         </w:numPr>
       </w:pPr>
       <w:r>
@@ -15893,7 +16785,7 @@
         <w:pStyle w:val="Compact"/>
         <w:numPr>
           <w:ilvl w:val="0"/>
-          <w:numId w:val="1005"/>
+          <w:numId w:val="1007"/>
         </w:numPr>
       </w:pPr>
       <w:r>
@@ -16020,9 +16912,9 @@
         <w:t xml:space="preserve">(FRS Section 4, 3.16.10)</w:t>
       </w:r>
     </w:p>
-    <w:bookmarkEnd w:id="145"/>
     <w:bookmarkEnd w:id="146"/>
-    <w:bookmarkStart w:id="149" w:name="consumption-events"/>
+    <w:bookmarkEnd w:id="147"/>
+    <w:bookmarkStart w:id="150" w:name="consumption-events"/>
     <w:p>
       <w:pPr>
         <w:pStyle w:val="Heading3"/>
@@ -16031,7 +16923,7 @@
         <w:t xml:space="preserve">6.9 Consumption Events</w:t>
       </w:r>
     </w:p>
-    <w:bookmarkStart w:id="147" w:name="fds-06-020-consumption-tracking"/>
+    <w:bookmarkStart w:id="148" w:name="fds-06-020-consumption-tracking"/>
     <w:p>
       <w:pPr>
         <w:pStyle w:val="Heading4"/>
@@ -16063,8 +16955,8 @@
         <w:t xml:space="preserve">recording: source LOT, produced LOT (or container), consumed item, produced item, piece count, location, operator, terminal, tray (if applicable), produced serial number (if serialized), and timestamp.</w:t>
       </w:r>
     </w:p>
-    <w:bookmarkEnd w:id="147"/>
-    <w:bookmarkStart w:id="148" w:name="fds-06-021-consumption-genealogy"/>
+    <w:bookmarkEnd w:id="148"/>
+    <w:bookmarkStart w:id="149" w:name="fds-06-021-consumption-genealogy"/>
     <w:p>
       <w:pPr>
         <w:pStyle w:val="Heading4"/>
@@ -16096,9 +16988,9 @@
         <w:t xml:space="preserve">record with relationship type Consumption, linking the source LOT to the output LOT or serialized part. This is the backbone of Honda traceability — every finished good traces back to every component LOT consumed. (FRS 3.13.2)</w:t>
       </w:r>
     </w:p>
-    <w:bookmarkEnd w:id="148"/>
     <w:bookmarkEnd w:id="149"/>
-    <w:bookmarkStart w:id="153" w:name="work-orders-mvp-lite"/>
+    <w:bookmarkEnd w:id="150"/>
+    <w:bookmarkStart w:id="154" w:name="work-orders-mvp-lite"/>
     <w:p>
       <w:pPr>
         <w:pStyle w:val="Heading3"/>
@@ -16116,7 +17008,7 @@
         <w:t xml:space="preserve">MVP-LITE</w:t>
       </w:r>
     </w:p>
-    <w:bookmarkStart w:id="150" w:name="fds-06-022-work-order-auto-generation"/>
+    <w:bookmarkStart w:id="151" w:name="fds-06-022-work-order-auto-generation"/>
     <w:p>
       <w:pPr>
         <w:pStyle w:val="Heading4"/>
@@ -16133,8 +17025,8 @@
         <w:t xml:space="preserve">If work order functionality is included, the system SHALL auto-generate internal work orders when production activity begins on a LOT. Operators SHALL NOT see, create, or interact with work orders directly — they are invisible bookkeeping. (FRS 3.1.5)</w:t>
       </w:r>
     </w:p>
-    <w:bookmarkEnd w:id="150"/>
-    <w:bookmarkStart w:id="151" w:name="fds-06-023-work-order-structure"/>
+    <w:bookmarkEnd w:id="151"/>
+    <w:bookmarkStart w:id="152" w:name="fds-06-023-work-order-structure"/>
     <w:p>
       <w:pPr>
         <w:pStyle w:val="Heading4"/>
@@ -16151,8 +17043,8 @@
         <w:t xml:space="preserve">Each work order SHALL link an item to a route template version. Work order operations SHALL be created for each route step, tracking: planned step, actual location, status (PENDING → IN_PROGRESS → COMPLETED / SKIPPED), start/completion times, and operator.</w:t>
       </w:r>
     </w:p>
-    <w:bookmarkEnd w:id="151"/>
-    <w:bookmarkStart w:id="152" w:name="fds-06-024-work-order-independence"/>
+    <w:bookmarkEnd w:id="152"/>
+    <w:bookmarkStart w:id="153" w:name="fds-06-024-work-order-independence"/>
     <w:p>
       <w:pPr>
         <w:pStyle w:val="Heading4"/>
@@ -16215,10 +17107,10 @@
         </w:pict>
       </w:r>
     </w:p>
-    <w:bookmarkEnd w:id="152"/>
     <w:bookmarkEnd w:id="153"/>
     <w:bookmarkEnd w:id="154"/>
-    <w:bookmarkStart w:id="181" w:name="container-management-shipping-mvp"/>
+    <w:bookmarkEnd w:id="155"/>
+    <w:bookmarkStart w:id="182" w:name="container-management-shipping-mvp"/>
     <w:p>
       <w:pPr>
         <w:pStyle w:val="Heading2"/>
@@ -16236,7 +17128,7 @@
         <w:t xml:space="preserve">MVP</w:t>
       </w:r>
     </w:p>
-    <w:bookmarkStart w:id="155" w:name="design-overview-2"/>
+    <w:bookmarkStart w:id="156" w:name="design-overview-2"/>
     <w:p>
       <w:pPr>
         <w:pStyle w:val="Heading3"/>
@@ -16276,8 +17168,8 @@
         <w:t xml:space="preserve">table and drives automatic fill/close behavior.</w:t>
       </w:r>
     </w:p>
-    <w:bookmarkEnd w:id="155"/>
-    <w:bookmarkStart w:id="161" w:name="container-lifecycle"/>
+    <w:bookmarkEnd w:id="156"/>
+    <w:bookmarkStart w:id="162" w:name="container-lifecycle"/>
     <w:p>
       <w:pPr>
         <w:pStyle w:val="Heading3"/>
@@ -16286,7 +17178,7 @@
         <w:t xml:space="preserve">7.2 Container Lifecycle</w:t>
       </w:r>
     </w:p>
-    <w:bookmarkStart w:id="156" w:name="fds-07-001-container-creation"/>
+    <w:bookmarkStart w:id="157" w:name="fds-07-001-container-creation"/>
     <w:p>
       <w:pPr>
         <w:pStyle w:val="Heading4"/>
@@ -16355,8 +17247,8 @@
         <w:t xml:space="preserve">Each container SHALL reference: item, container config, status, source LOT, current location, and AIM shipper ID (assigned at closure).</w:t>
       </w:r>
     </w:p>
-    <w:bookmarkEnd w:id="156"/>
-    <w:bookmarkStart w:id="157" w:name="fds-07-002-container-status-codes"/>
+    <w:bookmarkEnd w:id="157"/>
+    <w:bookmarkStart w:id="158" w:name="fds-07-002-container-status-codes"/>
     <w:p>
       <w:pPr>
         <w:pStyle w:val="Heading4"/>
@@ -16657,8 +17549,8 @@
         </w:tc>
       </w:tr>
     </w:tbl>
-    <w:bookmarkEnd w:id="157"/>
-    <w:bookmarkStart w:id="158" w:name="X3b2c7f3a97e613d0fa212aaab1a2e4848f99368"/>
+    <w:bookmarkEnd w:id="158"/>
+    <w:bookmarkStart w:id="159" w:name="X3b2c7f3a97e613d0fa212aaab1a2e4848f99368"/>
     <w:p>
       <w:pPr>
         <w:pStyle w:val="Heading4"/>
@@ -16768,8 +17660,8 @@
         <w:t xml:space="preserve">), close the container</w:t>
       </w:r>
     </w:p>
-    <w:bookmarkEnd w:id="158"/>
-    <w:bookmarkStart w:id="159" w:name="X66e71cf1fd89647b6d2bf82d2bf80a185bdaede"/>
+    <w:bookmarkEnd w:id="159"/>
+    <w:bookmarkStart w:id="160" w:name="X66e71cf1fd89647b6d2bf82d2bf80a185bdaede"/>
     <w:p>
       <w:pPr>
         <w:pStyle w:val="Heading4"/>
@@ -16819,8 +17711,8 @@
         <w:t xml:space="preserve">3. On lines with weight-based tracking, the system MAY use the scale reading to validate the piece count before closure</w:t>
       </w:r>
     </w:p>
-    <w:bookmarkEnd w:id="159"/>
-    <w:bookmarkStart w:id="160" w:name="fds-07-005-container-closure"/>
+    <w:bookmarkEnd w:id="160"/>
+    <w:bookmarkStart w:id="161" w:name="fds-07-005-container-closure"/>
     <w:p>
       <w:pPr>
         <w:pStyle w:val="Heading4"/>
@@ -16942,9 +17834,9 @@
         <w:t xml:space="preserve">Audit.InterfaceLog</w:t>
       </w:r>
     </w:p>
-    <w:bookmarkEnd w:id="160"/>
     <w:bookmarkEnd w:id="161"/>
-    <w:bookmarkStart w:id="166" w:name="shipping-labels"/>
+    <w:bookmarkEnd w:id="162"/>
+    <w:bookmarkStart w:id="167" w:name="shipping-labels"/>
     <w:p>
       <w:pPr>
         <w:pStyle w:val="Heading3"/>
@@ -16953,7 +17845,7 @@
         <w:t xml:space="preserve">7.3 Shipping Labels</w:t>
       </w:r>
     </w:p>
-    <w:bookmarkStart w:id="162" w:name="fds-07-006-shipping-label-generation"/>
+    <w:bookmarkStart w:id="163" w:name="fds-07-006-shipping-label-generation"/>
     <w:p>
       <w:pPr>
         <w:pStyle w:val="Heading4"/>
@@ -16970,8 +17862,8 @@
         <w:t xml:space="preserve">Each completed container SHALL receive a shipping label containing the AIM shipper ID, part number, quantity, and Honda-required fields. The label SHALL be generated as ZPL and sent to the Zebra printer associated with the terminal.</w:t>
       </w:r>
     </w:p>
-    <w:bookmarkEnd w:id="162"/>
-    <w:bookmarkStart w:id="163" w:name="fds-07-007-shipping-label-tracking"/>
+    <w:bookmarkEnd w:id="163"/>
+    <w:bookmarkStart w:id="164" w:name="fds-07-007-shipping-label-tracking"/>
     <w:p>
       <w:pPr>
         <w:pStyle w:val="Heading4"/>
@@ -17003,8 +17895,8 @@
         <w:t xml:space="preserve">table: container, AIM shipper ID, label type, ZPL content, void flag, printed/voided timestamps, and printed-by user.</w:t>
       </w:r>
     </w:p>
-    <w:bookmarkEnd w:id="163"/>
-    <w:bookmarkStart w:id="164" w:name="fds-07-008-shipping-label-void"/>
+    <w:bookmarkEnd w:id="164"/>
+    <w:bookmarkStart w:id="165" w:name="fds-07-008-shipping-label-void"/>
     <w:p>
       <w:pPr>
         <w:pStyle w:val="Heading4"/>
@@ -17069,8 +17961,8 @@
         <w:t xml:space="preserve">3. The voided label SHALL remain in the database for audit trail — it is NOT deleted</w:t>
       </w:r>
     </w:p>
-    <w:bookmarkEnd w:id="164"/>
-    <w:bookmarkStart w:id="165" w:name="fds-07-009-shipping-label-reprint"/>
+    <w:bookmarkEnd w:id="165"/>
+    <w:bookmarkStart w:id="166" w:name="fds-07-009-shipping-label-reprint"/>
     <w:p>
       <w:pPr>
         <w:pStyle w:val="Heading4"/>
@@ -17102,9 +17994,9 @@
         <w:t xml:space="preserve">record (the original is NOT modified). (FRS 3.13.1)</w:t>
       </w:r>
     </w:p>
-    <w:bookmarkEnd w:id="165"/>
     <w:bookmarkEnd w:id="166"/>
-    <w:bookmarkStart w:id="170" w:name="aim-integration"/>
+    <w:bookmarkEnd w:id="167"/>
+    <w:bookmarkStart w:id="171" w:name="aim-integration"/>
     <w:p>
       <w:pPr>
         <w:pStyle w:val="Heading3"/>
@@ -17113,7 +18005,7 @@
         <w:t xml:space="preserve">7.4 AIM Integration</w:t>
       </w:r>
     </w:p>
-    <w:bookmarkStart w:id="167" w:name="fds-07-010-aim-shipper-id-request"/>
+    <w:bookmarkStart w:id="168" w:name="fds-07-010-aim-shipper-id-request"/>
     <w:p>
       <w:pPr>
         <w:pStyle w:val="Heading4"/>
@@ -17172,8 +18064,8 @@
         <w:t xml:space="preserve">until the AIM call succeeds — the label SHALL NOT print until the shipper ID is assigned.</w:t>
       </w:r>
     </w:p>
-    <w:bookmarkEnd w:id="167"/>
-    <w:bookmarkStart w:id="168" w:name="fds-07-011-aim-hold-notification"/>
+    <w:bookmarkEnd w:id="168"/>
+    <w:bookmarkStart w:id="169" w:name="fds-07-011-aim-hold-notification"/>
     <w:p>
       <w:pPr>
         <w:pStyle w:val="Heading4"/>
@@ -17229,8 +18121,8 @@
         <w:t xml:space="preserve">. (FRS 2.3.1)</w:t>
       </w:r>
     </w:p>
-    <w:bookmarkEnd w:id="168"/>
-    <w:bookmarkStart w:id="169" w:name="fds-07-012-aim-update-for-re-sort"/>
+    <w:bookmarkEnd w:id="169"/>
+    <w:bookmarkStart w:id="170" w:name="fds-07-012-aim-update-for-re-sort"/>
     <w:p>
       <w:pPr>
         <w:pStyle w:val="Heading4"/>
@@ -17262,9 +18154,9 @@
         <w:t xml:space="preserve">with the new serial and previous serial parameters (per Appendix L method signature) to update Honda’s records. (FRS 2.1.10)</w:t>
       </w:r>
     </w:p>
-    <w:bookmarkEnd w:id="169"/>
     <w:bookmarkEnd w:id="170"/>
-    <w:bookmarkStart w:id="173" w:name="shipping-dock-workflow"/>
+    <w:bookmarkEnd w:id="171"/>
+    <w:bookmarkStart w:id="174" w:name="shipping-dock-workflow"/>
     <w:p>
       <w:pPr>
         <w:pStyle w:val="Heading3"/>
@@ -17273,7 +18165,7 @@
         <w:t xml:space="preserve">7.5 Shipping Dock Workflow</w:t>
       </w:r>
     </w:p>
-    <w:bookmarkStart w:id="171" w:name="fds-07-013-shipping-validation"/>
+    <w:bookmarkStart w:id="172" w:name="fds-07-013-shipping-validation"/>
     <w:p>
       <w:pPr>
         <w:pStyle w:val="Heading4"/>
@@ -17308,8 +18200,8 @@
         <w:t xml:space="preserve">- If validation fails, the system SHALL prevent loading and display the reason</w:t>
       </w:r>
     </w:p>
-    <w:bookmarkEnd w:id="171"/>
-    <w:bookmarkStart w:id="172" w:name="fds-07-014-ship-confirmation"/>
+    <w:bookmarkEnd w:id="172"/>
+    <w:bookmarkStart w:id="173" w:name="fds-07-014-ship-confirmation"/>
     <w:p>
       <w:pPr>
         <w:pStyle w:val="Heading4"/>
@@ -17368,9 +18260,9 @@
         <w:t xml:space="preserve">Audit.OperationLog</w:t>
       </w:r>
     </w:p>
-    <w:bookmarkEnd w:id="172"/>
     <w:bookmarkEnd w:id="173"/>
-    <w:bookmarkStart w:id="176" w:name="container-holds"/>
+    <w:bookmarkEnd w:id="174"/>
+    <w:bookmarkStart w:id="177" w:name="container-holds"/>
     <w:p>
       <w:pPr>
         <w:pStyle w:val="Heading3"/>
@@ -17379,7 +18271,7 @@
         <w:t xml:space="preserve">7.6 Container Holds</w:t>
       </w:r>
     </w:p>
-    <w:bookmarkStart w:id="174" w:name="fds-07-015-container-hold"/>
+    <w:bookmarkStart w:id="175" w:name="fds-07-015-container-hold"/>
     <w:p>
       <w:pPr>
         <w:pStyle w:val="Heading4"/>
@@ -17435,8 +18327,8 @@
         <w:t xml:space="preserve">4. Held containers SHALL NOT be loadable at the Shipping Dock</w:t>
       </w:r>
     </w:p>
-    <w:bookmarkEnd w:id="174"/>
-    <w:bookmarkStart w:id="175" w:name="fds-07-016-container-hold-release"/>
+    <w:bookmarkEnd w:id="175"/>
+    <w:bookmarkStart w:id="176" w:name="fds-07-016-container-hold-release"/>
     <w:p>
       <w:pPr>
         <w:pStyle w:val="Heading4"/>
@@ -17480,9 +18372,9 @@
         <w:t xml:space="preserve">3. The container is now eligible for shipping</w:t>
       </w:r>
     </w:p>
-    <w:bookmarkEnd w:id="175"/>
     <w:bookmarkEnd w:id="176"/>
-    <w:bookmarkStart w:id="180" w:name="sort-cage-mvp-expanded"/>
+    <w:bookmarkEnd w:id="177"/>
+    <w:bookmarkStart w:id="181" w:name="sort-cage-mvp-expanded"/>
     <w:p>
       <w:pPr>
         <w:pStyle w:val="Heading3"/>
@@ -17500,7 +18392,7 @@
         <w:t xml:space="preserve">MVP-EXPANDED</w:t>
       </w:r>
     </w:p>
-    <w:bookmarkStart w:id="177" w:name="fds-07-017-sort-cage-workflow"/>
+    <w:bookmarkStart w:id="178" w:name="fds-07-017-sort-cage-workflow"/>
     <w:p>
       <w:pPr>
         <w:pStyle w:val="Heading4"/>
@@ -17604,8 +18496,8 @@
         <w:t xml:space="preserve">(FDS-07-012)</w:t>
       </w:r>
     </w:p>
-    <w:bookmarkEnd w:id="177"/>
-    <w:bookmarkStart w:id="178" w:name="fds-07-018-sort-cage-scope-boundary"/>
+    <w:bookmarkEnd w:id="178"/>
+    <w:bookmarkStart w:id="179" w:name="fds-07-018-sort-cage-scope-boundary"/>
     <w:p>
       <w:pPr>
         <w:pStyle w:val="Heading4"/>
@@ -17622,8 +18514,8 @@
         <w:t xml:space="preserve">The Sort Cage workflow uses holds (MVP) and LOT splits (MVP) as the operational tools for quality disposition. Formal NCM disposition codes and rework routing are FUTURE capabilities. In MVP, the Sort Cage separates good from bad parts via split, scrap, and re-pack — not via formal non-conformance records.</w:t>
       </w:r>
     </w:p>
-    <w:bookmarkEnd w:id="178"/>
-    <w:bookmarkStart w:id="179" w:name="X934b9426248d171356d965185952aae4315520b"/>
+    <w:bookmarkEnd w:id="179"/>
+    <w:bookmarkStart w:id="180" w:name="X934b9426248d171356d965185952aae4315520b"/>
     <w:p>
       <w:pPr>
         <w:pStyle w:val="Heading4"/>
@@ -17660,7 +18552,7 @@
         <w:pStyle w:val="Compact"/>
         <w:numPr>
           <w:ilvl w:val="0"/>
-          <w:numId w:val="1006"/>
+          <w:numId w:val="1008"/>
         </w:numPr>
       </w:pPr>
       <w:r>
@@ -17728,7 +18620,7 @@
         <w:pStyle w:val="Compact"/>
         <w:numPr>
           <w:ilvl w:val="0"/>
-          <w:numId w:val="1006"/>
+          <w:numId w:val="1008"/>
         </w:numPr>
       </w:pPr>
       <w:r>
@@ -17780,7 +18672,7 @@
         <w:pStyle w:val="Compact"/>
         <w:numPr>
           <w:ilvl w:val="0"/>
-          <w:numId w:val="1006"/>
+          <w:numId w:val="1008"/>
         </w:numPr>
       </w:pPr>
       <w:r>
@@ -17979,10 +18871,10 @@
         </w:pict>
       </w:r>
     </w:p>
-    <w:bookmarkEnd w:id="179"/>
     <w:bookmarkEnd w:id="180"/>
     <w:bookmarkEnd w:id="181"/>
-    <w:bookmarkStart w:id="206" w:name="quality-hold-management-mixed-scope"/>
+    <w:bookmarkEnd w:id="182"/>
+    <w:bookmarkStart w:id="207" w:name="quality-hold-management-mixed-scope"/>
     <w:p>
       <w:pPr>
         <w:pStyle w:val="Heading2"/>
@@ -17991,7 +18883,7 @@
         <w:t xml:space="preserve">8. Quality &amp; Hold Management — MIXED SCOPE</w:t>
       </w:r>
     </w:p>
-    <w:bookmarkStart w:id="182" w:name="design-overview-3"/>
+    <w:bookmarkStart w:id="183" w:name="design-overview-3"/>
     <w:p>
       <w:pPr>
         <w:pStyle w:val="Heading3"/>
@@ -18016,8 +18908,8 @@
         <w:t xml:space="preserve">MPP currently uses Intelex for formal NCM/failure analysis. The MES hold system and Intelex operate independently; future integration is designed for but not delivered.</w:t>
       </w:r>
     </w:p>
-    <w:bookmarkEnd w:id="182"/>
-    <w:bookmarkStart w:id="190" w:name="hold-management-mvp-expanded"/>
+    <w:bookmarkEnd w:id="183"/>
+    <w:bookmarkStart w:id="191" w:name="hold-management-mvp-expanded"/>
     <w:p>
       <w:pPr>
         <w:pStyle w:val="Heading3"/>
@@ -18035,7 +18927,7 @@
         <w:t xml:space="preserve">MVP-EXPANDED</w:t>
       </w:r>
     </w:p>
-    <w:bookmarkStart w:id="183" w:name="fds-08-001-hold-placement"/>
+    <w:bookmarkStart w:id="184" w:name="fds-08-001-hold-placement"/>
     <w:p>
       <w:pPr>
         <w:pStyle w:val="Heading4"/>
@@ -18052,8 +18944,8 @@
         <w:t xml:space="preserve">A quality-authorized user SHALL be able to place a hold on one or more LOTs. Each hold SHALL record: LOT, hold type, reason, placed-by user, and timestamp. Hold types SHALL include: QUALITY, CUSTOMER_COMPLAINT, PRECAUTIONARY. (FRS 3.16.10)</w:t>
       </w:r>
     </w:p>
-    <w:bookmarkEnd w:id="183"/>
-    <w:bookmarkStart w:id="184" w:name="fds-08-002-hold-effect"/>
+    <w:bookmarkEnd w:id="184"/>
+    <w:bookmarkStart w:id="185" w:name="fds-08-002-hold-effect"/>
     <w:p>
       <w:pPr>
         <w:pStyle w:val="Heading4"/>
@@ -18085,8 +18977,8 @@
         <w:t xml:space="preserve">flag on the HOLD status code SHALL prevent manufacturing operation completion activities against that LOT. Any attempt to record production against a held LOT SHALL be rejected with a clear message. (FRS 3.16.10)</w:t>
       </w:r>
     </w:p>
-    <w:bookmarkEnd w:id="184"/>
-    <w:bookmarkStart w:id="185" w:name="fds-08-003-hold-release"/>
+    <w:bookmarkEnd w:id="185"/>
+    <w:bookmarkStart w:id="186" w:name="fds-08-003-hold-release"/>
     <w:p>
       <w:pPr>
         <w:pStyle w:val="Heading4"/>
@@ -18118,8 +19010,8 @@
         <w:t xml:space="preserve">record. The LOT status SHALL transition from HOLD back to GOOD. (FRS 3.16.11)</w:t>
       </w:r>
     </w:p>
-    <w:bookmarkEnd w:id="185"/>
-    <w:bookmarkStart w:id="186" w:name="fds-08-004-hold-without-ncm"/>
+    <w:bookmarkEnd w:id="186"/>
+    <w:bookmarkStart w:id="187" w:name="fds-08-004-hold-without-ncm"/>
     <w:p>
       <w:pPr>
         <w:pStyle w:val="Heading4"/>
@@ -18166,8 +19058,8 @@
         <w:t xml:space="preserve">is nullable. Precautionary holds (e.g., customer complaint pending investigation) are placed without formal NCM. (FRS 2.1.8)</w:t>
       </w:r>
     </w:p>
-    <w:bookmarkEnd w:id="186"/>
-    <w:bookmarkStart w:id="187" w:name="fds-08-005-partial-disposition-via-split"/>
+    <w:bookmarkEnd w:id="187"/>
+    <w:bookmarkStart w:id="188" w:name="fds-08-005-partial-disposition-via-split"/>
     <w:p>
       <w:pPr>
         <w:pStyle w:val="Heading4"/>
@@ -18184,8 +19076,8 @@
         <w:t xml:space="preserve">When investigation reveals only a portion of a held LOT is defective, the user SHALL split the LOT (per FDS-05-009) to isolate suspect parts. The suspect child LOT can be scrapped while the remainder is released. Genealogy permanently records the split. This is the MVP mechanism for partial quality disposition.</w:t>
       </w:r>
     </w:p>
-    <w:bookmarkEnd w:id="187"/>
-    <w:bookmarkStart w:id="188" w:name="fds-08-006-bulk-hold"/>
+    <w:bookmarkEnd w:id="188"/>
+    <w:bookmarkStart w:id="189" w:name="fds-08-006-bulk-hold"/>
     <w:p>
       <w:pPr>
         <w:pStyle w:val="Heading4"/>
@@ -18217,8 +19109,8 @@
         <w:t xml:space="preserve">record. (FRS 3.16.10)</w:t>
       </w:r>
     </w:p>
-    <w:bookmarkEnd w:id="188"/>
-    <w:bookmarkStart w:id="189" w:name="fds-08-007-container-hold-integration"/>
+    <w:bookmarkEnd w:id="189"/>
+    <w:bookmarkStart w:id="190" w:name="fds-08-007-container-hold-integration"/>
     <w:p>
       <w:pPr>
         <w:pStyle w:val="Heading4"/>
@@ -18235,9 +19127,9 @@
         <w:t xml:space="preserve">Hold management SHALL integrate with container holds (FDS-07-015/016) and AIM hold notifications (FDS-07-011). When a LOT that is the source of a completed container is held, the system SHOULD alert the user that associated containers exist and may need to be held as well.</w:t>
       </w:r>
     </w:p>
-    <w:bookmarkEnd w:id="189"/>
     <w:bookmarkEnd w:id="190"/>
-    <w:bookmarkStart w:id="197" w:name="inspections-mvp"/>
+    <w:bookmarkEnd w:id="191"/>
+    <w:bookmarkStart w:id="198" w:name="inspections-mvp"/>
     <w:p>
       <w:pPr>
         <w:pStyle w:val="Heading3"/>
@@ -18255,7 +19147,7 @@
         <w:t xml:space="preserve">MVP</w:t>
       </w:r>
     </w:p>
-    <w:bookmarkStart w:id="191" w:name="fds-08-008-quality-spec-management"/>
+    <w:bookmarkStart w:id="192" w:name="fds-08-008-quality-spec-management"/>
     <w:p>
       <w:pPr>
         <w:pStyle w:val="Heading4"/>
@@ -18272,8 +19164,8 @@
         <w:t xml:space="preserve">Engineering users SHALL create and version quality specs via the configuration tool. Each spec SHALL define: name, associated item (optional), associated operation template (optional), and a list of measurable attributes. (FRS 3.16.1)</w:t>
       </w:r>
     </w:p>
-    <w:bookmarkEnd w:id="191"/>
-    <w:bookmarkStart w:id="192" w:name="fds-08-009-quality-spec-versioning"/>
+    <w:bookmarkEnd w:id="192"/>
+    <w:bookmarkStart w:id="193" w:name="fds-08-009-quality-spec-versioning"/>
     <w:p>
       <w:pPr>
         <w:pStyle w:val="Heading4"/>
@@ -18290,8 +19182,8 @@
         <w:t xml:space="preserve">When a spec is revised, a new version SHALL be created with a new effective date. The previous version SHALL be soft-deleted. Inspection records SHALL FK to the spec version active at time of inspection, ensuring historical accuracy. (FRS 3.16.2)</w:t>
       </w:r>
     </w:p>
-    <w:bookmarkEnd w:id="192"/>
-    <w:bookmarkStart w:id="193" w:name="fds-08-010-quality-spec-attributes"/>
+    <w:bookmarkEnd w:id="193"/>
+    <w:bookmarkStart w:id="194" w:name="fds-08-010-quality-spec-attributes"/>
     <w:p>
       <w:pPr>
         <w:pStyle w:val="Heading4"/>
@@ -18308,8 +19200,8 @@
         <w:t xml:space="preserve">Each spec version SHALL define measurable attributes with: name, data type, UOM, target value, lower limit, upper limit, required flag, and sort order. The inspection screen SHALL render input fields dynamically based on these attribute definitions.</w:t>
       </w:r>
     </w:p>
-    <w:bookmarkEnd w:id="193"/>
-    <w:bookmarkStart w:id="194" w:name="fds-08-011-inspection-recording"/>
+    <w:bookmarkEnd w:id="194"/>
+    <w:bookmarkStart w:id="195" w:name="fds-08-011-inspection-recording"/>
     <w:p>
       <w:pPr>
         <w:pStyle w:val="Heading4"/>
@@ -18389,8 +19281,8 @@
         <w:t xml:space="preserve">Audit.OperationLog</w:t>
       </w:r>
     </w:p>
-    <w:bookmarkEnd w:id="194"/>
-    <w:bookmarkStart w:id="195" w:name="fds-08-012-failed-inspection-handling"/>
+    <w:bookmarkEnd w:id="195"/>
+    <w:bookmarkStart w:id="196" w:name="fds-08-012-failed-inspection-handling"/>
     <w:p>
       <w:pPr>
         <w:pStyle w:val="Heading4"/>
@@ -18407,8 +19299,8 @@
         <w:t xml:space="preserve">If an inspection fails, the system SHALL alert the inspector. The system SHALL NOT automatically place a hold — the inspector or quality supervisor decides the appropriate action (hold, continue monitoring, split suspect parts). This preserves human judgment in quality decisions.</w:t>
       </w:r>
     </w:p>
-    <w:bookmarkEnd w:id="195"/>
-    <w:bookmarkStart w:id="196" w:name="fds-08-013-quality-attachments"/>
+    <w:bookmarkEnd w:id="196"/>
+    <w:bookmarkStart w:id="197" w:name="fds-08-013-quality-attachments"/>
     <w:p>
       <w:pPr>
         <w:pStyle w:val="Heading4"/>
@@ -18437,9 +19329,9 @@
         <w:t xml:space="preserve">: file name, type, path, uploaded-at, uploaded-by.</w:t>
       </w:r>
     </w:p>
-    <w:bookmarkEnd w:id="196"/>
     <w:bookmarkEnd w:id="197"/>
-    <w:bookmarkStart w:id="200" w:name="sampling-workflows-conditional"/>
+    <w:bookmarkEnd w:id="198"/>
+    <w:bookmarkStart w:id="201" w:name="sampling-workflows-conditional"/>
     <w:p>
       <w:pPr>
         <w:pStyle w:val="Heading3"/>
@@ -18457,7 +19349,7 @@
         <w:t xml:space="preserve">CONDITIONAL</w:t>
       </w:r>
     </w:p>
-    <w:bookmarkStart w:id="198" w:name="fds-08-014-sample-triggers"/>
+    <w:bookmarkStart w:id="199" w:name="fds-08-014-sample-triggers"/>
     <w:p>
       <w:pPr>
         <w:pStyle w:val="Heading4"/>
@@ -18474,8 +19366,8 @@
         <w:t xml:space="preserve">If sampling is included, the system SHALL support configurable sample triggers: SHIFT_START, DIE_CHANGE, TOOL_CHANGE, TIME_INTERVAL, and MANUAL. The system SHOULD prompt operators to take a sample when a trigger condition is met.</w:t>
       </w:r>
     </w:p>
-    <w:bookmarkEnd w:id="198"/>
-    <w:bookmarkStart w:id="199" w:name="X0111a6ccc616982d69e334bc2888c441f0b8abb"/>
+    <w:bookmarkEnd w:id="199"/>
+    <w:bookmarkStart w:id="200" w:name="X0111a6ccc616982d69e334bc2888c441f0b8abb"/>
     <w:p>
       <w:pPr>
         <w:pStyle w:val="Heading4"/>
@@ -18492,9 +19384,9 @@
         <w:t xml:space="preserve">Quality samples are assumed representative of the entire LOT. A passing sample releases the LOT for continued production; a failing sample flags the LOT for quality review. (FRS 2.1.9)</w:t>
       </w:r>
     </w:p>
-    <w:bookmarkEnd w:id="199"/>
     <w:bookmarkEnd w:id="200"/>
-    <w:bookmarkStart w:id="203" w:name="defect-codes-mvp"/>
+    <w:bookmarkEnd w:id="201"/>
+    <w:bookmarkStart w:id="204" w:name="defect-codes-mvp"/>
     <w:p>
       <w:pPr>
         <w:pStyle w:val="Heading3"/>
@@ -18512,7 +19404,7 @@
         <w:t xml:space="preserve">MVP</w:t>
       </w:r>
     </w:p>
-    <w:bookmarkStart w:id="201" w:name="fds-08-016-defect-code-management"/>
+    <w:bookmarkStart w:id="202" w:name="fds-08-016-defect-code-management"/>
     <w:p>
       <w:pPr>
         <w:pStyle w:val="Heading4"/>
@@ -18544,8 +19436,8 @@
         <w:t xml:space="preserve">flag SHALL be set per the appendix for future OEE quality calculations.</w:t>
       </w:r>
     </w:p>
-    <w:bookmarkEnd w:id="201"/>
-    <w:bookmarkStart w:id="202" w:name="fds-08-017-area-filtering"/>
+    <w:bookmarkEnd w:id="202"/>
+    <w:bookmarkStart w:id="203" w:name="fds-08-017-area-filtering"/>
     <w:p>
       <w:pPr>
         <w:pStyle w:val="Heading4"/>
@@ -18562,9 +19454,9 @@
         <w:t xml:space="preserve">Production screens SHALL filter defect codes by the area of the current operation. A Die Cast screen shows only Die Cast defect codes; a Machine Shop screen shows only Machine Shop codes.</w:t>
       </w:r>
     </w:p>
-    <w:bookmarkEnd w:id="202"/>
     <w:bookmarkEnd w:id="203"/>
-    <w:bookmarkStart w:id="205" w:name="non-conformance-management-future"/>
+    <w:bookmarkEnd w:id="204"/>
+    <w:bookmarkStart w:id="206" w:name="non-conformance-management-future"/>
     <w:p>
       <w:pPr>
         <w:pStyle w:val="Heading3"/>
@@ -18582,7 +19474,7 @@
         <w:t xml:space="preserve">FUTURE</w:t>
       </w:r>
     </w:p>
-    <w:bookmarkStart w:id="204" w:name="fds-08-018-ncm-scope-boundary"/>
+    <w:bookmarkStart w:id="205" w:name="fds-08-018-ncm-scope-boundary"/>
     <w:p>
       <w:pPr>
         <w:pStyle w:val="Heading4"/>
@@ -18651,10 +19543,10 @@
         </w:pict>
       </w:r>
     </w:p>
-    <w:bookmarkEnd w:id="204"/>
     <w:bookmarkEnd w:id="205"/>
     <w:bookmarkEnd w:id="206"/>
-    <w:bookmarkStart w:id="223" w:name="downtime-tracking-mixed-scope"/>
+    <w:bookmarkEnd w:id="207"/>
+    <w:bookmarkStart w:id="224" w:name="downtime-tracking-mixed-scope"/>
     <w:p>
       <w:pPr>
         <w:pStyle w:val="Heading2"/>
@@ -18663,7 +19555,7 @@
         <w:t xml:space="preserve">9. Downtime Tracking — MIXED SCOPE</w:t>
       </w:r>
     </w:p>
-    <w:bookmarkStart w:id="207" w:name="design-overview-4"/>
+    <w:bookmarkStart w:id="208" w:name="design-overview-4"/>
     <w:p>
       <w:pPr>
         <w:pStyle w:val="Heading3"/>
@@ -18688,8 +19580,8 @@
         <w:t xml:space="preserve">OEE calculation from downtime data is FUTURE.</w:t>
       </w:r>
     </w:p>
-    <w:bookmarkEnd w:id="207"/>
-    <w:bookmarkStart w:id="213" w:name="downtime-events-mvp"/>
+    <w:bookmarkEnd w:id="208"/>
+    <w:bookmarkStart w:id="214" w:name="downtime-events-mvp"/>
     <w:p>
       <w:pPr>
         <w:pStyle w:val="Heading3"/>
@@ -18707,7 +19599,7 @@
         <w:t xml:space="preserve">MVP</w:t>
       </w:r>
     </w:p>
-    <w:bookmarkStart w:id="208" w:name="fds-09-001-manual-downtime-entry"/>
+    <w:bookmarkStart w:id="209" w:name="fds-09-001-manual-downtime-entry"/>
     <w:p>
       <w:pPr>
         <w:pStyle w:val="Heading4"/>
@@ -18724,8 +19616,8 @@
         <w:t xml:space="preserve">Operators SHALL be able to log downtime events manually: machine (auto-populated from terminal location), reason code (filtered by area and type), start time, end time, and remarks. (FRS 3.15.1)</w:t>
       </w:r>
     </w:p>
-    <w:bookmarkEnd w:id="208"/>
-    <w:bookmarkStart w:id="209" w:name="fds-09-002-plc-triggered-downtime"/>
+    <w:bookmarkEnd w:id="209"/>
+    <w:bookmarkStart w:id="210" w:name="fds-09-002-plc-triggered-downtime"/>
     <w:p>
       <w:pPr>
         <w:pStyle w:val="Heading4"/>
@@ -18766,8 +19658,8 @@
         <w:t xml:space="preserve">MAY be null on PLC-triggered events — the operator assigns the reason code after the fact. (FRS 3.15.2)</w:t>
       </w:r>
     </w:p>
-    <w:bookmarkEnd w:id="209"/>
-    <w:bookmarkStart w:id="210" w:name="fds-09-003-open-downtime-events"/>
+    <w:bookmarkEnd w:id="210"/>
+    <w:bookmarkStart w:id="211" w:name="fds-09-003-open-downtime-events"/>
     <w:p>
       <w:pPr>
         <w:pStyle w:val="Heading4"/>
@@ -18823,8 +19715,8 @@
         <w:t xml:space="preserve">.</w:t>
       </w:r>
     </w:p>
-    <w:bookmarkEnd w:id="210"/>
-    <w:bookmarkStart w:id="211" w:name="fds-09-004-downtime-event-immutability"/>
+    <w:bookmarkEnd w:id="211"/>
+    <w:bookmarkStart w:id="212" w:name="fds-09-004-downtime-event-immutability"/>
     <w:p>
       <w:pPr>
         <w:pStyle w:val="Heading4"/>
@@ -18886,8 +19778,8 @@
         <w:t xml:space="preserve">MAY be updated (these are the only mutable fields — they represent deferred information, not corrections to immutable facts).</w:t>
       </w:r>
     </w:p>
-    <w:bookmarkEnd w:id="211"/>
-    <w:bookmarkStart w:id="212" w:name="Xad1d7deb82fcbe05a765752929854da87c4ae91"/>
+    <w:bookmarkEnd w:id="212"/>
+    <w:bookmarkStart w:id="213" w:name="Xad1d7deb82fcbe05a765752929854da87c4ae91"/>
     <w:p>
       <w:pPr>
         <w:pStyle w:val="Heading4"/>
@@ -18924,9 +19816,9 @@
         <w:t xml:space="preserve">The operator selects the type first, then the specific code within that type.</w:t>
       </w:r>
     </w:p>
-    <w:bookmarkEnd w:id="212"/>
     <w:bookmarkEnd w:id="213"/>
-    <w:bookmarkStart w:id="216" w:name="downtime-reason-codes-mvp"/>
+    <w:bookmarkEnd w:id="214"/>
+    <w:bookmarkStart w:id="217" w:name="downtime-reason-codes-mvp"/>
     <w:p>
       <w:pPr>
         <w:pStyle w:val="Heading3"/>
@@ -18944,7 +19836,7 @@
         <w:t xml:space="preserve">MVP</w:t>
       </w:r>
     </w:p>
-    <w:bookmarkStart w:id="214" w:name="fds-09-006-reason-code-seed-data"/>
+    <w:bookmarkStart w:id="215" w:name="fds-09-006-reason-code-seed-data"/>
     <w:p>
       <w:pPr>
         <w:pStyle w:val="Heading4"/>
@@ -18976,8 +19868,8 @@
         <w:t xml:space="preserve">flag.</w:t>
       </w:r>
     </w:p>
-    <w:bookmarkEnd w:id="214"/>
-    <w:bookmarkStart w:id="215" w:name="fds-09-007-reason-types"/>
+    <w:bookmarkEnd w:id="215"/>
+    <w:bookmarkStart w:id="216" w:name="fds-09-007-reason-types"/>
     <w:p>
       <w:pPr>
         <w:pStyle w:val="Heading4"/>
@@ -18994,9 +19886,9 @@
         <w:t xml:space="preserve">The following reason types SHALL be seeded: Equipment, Miscellaneous, Mold, Quality, Setup, Unscheduled. (FRS Appendix D)</w:t>
       </w:r>
     </w:p>
-    <w:bookmarkEnd w:id="215"/>
     <w:bookmarkEnd w:id="216"/>
-    <w:bookmarkStart w:id="220" w:name="shift-management-mvp"/>
+    <w:bookmarkEnd w:id="217"/>
+    <w:bookmarkStart w:id="221" w:name="shift-management-mvp"/>
     <w:p>
       <w:pPr>
         <w:pStyle w:val="Heading3"/>
@@ -19014,7 +19906,7 @@
         <w:t xml:space="preserve">MVP</w:t>
       </w:r>
     </w:p>
-    <w:bookmarkStart w:id="217" w:name="fds-09-008-shift-schedules"/>
+    <w:bookmarkStart w:id="218" w:name="fds-09-008-shift-schedules"/>
     <w:p>
       <w:pPr>
         <w:pStyle w:val="Heading4"/>
@@ -19031,8 +19923,8 @@
         <w:t xml:space="preserve">Engineering users SHALL configure shift schedules: name, start time, end time, days of week, and effective date. Common patterns: First Shift (6:00am–2:00pm M–F), Second Shift (2:00pm–10:00pm M–F), Weekend Overtime.</w:t>
       </w:r>
     </w:p>
-    <w:bookmarkEnd w:id="217"/>
-    <w:bookmarkStart w:id="218" w:name="fds-09-009-shift-instances"/>
+    <w:bookmarkEnd w:id="218"/>
+    <w:bookmarkStart w:id="219" w:name="fds-09-009-shift-instances"/>
     <w:p>
       <w:pPr>
         <w:pStyle w:val="Heading4"/>
@@ -19088,8 +19980,8 @@
         <w:t xml:space="preserve">to reflect true end time, (b) add an adjustment field to the shift record, (c) derive runtime purely from downtime events (available time = shift duration − total downtime). Flagged for customer decision.</w:t>
       </w:r>
     </w:p>
-    <w:bookmarkEnd w:id="218"/>
-    <w:bookmarkStart w:id="219" w:name="fds-09-010-shift-downtime-association"/>
+    <w:bookmarkEnd w:id="219"/>
+    <w:bookmarkStart w:id="220" w:name="fds-09-010-shift-downtime-association"/>
     <w:p>
       <w:pPr>
         <w:pStyle w:val="Heading4"/>
@@ -19136,9 +20028,9 @@
         <w:t xml:space="preserve">This addresses User Journey Assumption #10 (shift boundary handling). Open downtime events at shift change remain open — the incoming shift operator closes them when the machine resumes. They do not auto-close and re-open.</w:t>
       </w:r>
     </w:p>
-    <w:bookmarkEnd w:id="219"/>
     <w:bookmarkEnd w:id="220"/>
-    <w:bookmarkStart w:id="222" w:name="oee-future"/>
+    <w:bookmarkEnd w:id="221"/>
+    <w:bookmarkStart w:id="223" w:name="oee-future"/>
     <w:p>
       <w:pPr>
         <w:pStyle w:val="Heading3"/>
@@ -19156,7 +20048,7 @@
         <w:t xml:space="preserve">FUTURE</w:t>
       </w:r>
     </w:p>
-    <w:bookmarkStart w:id="221" w:name="fds-09-011-oee-scope-boundary"/>
+    <w:bookmarkStart w:id="222" w:name="fds-09-011-oee-scope-boundary"/>
     <w:p>
       <w:pPr>
         <w:pStyle w:val="Heading4"/>
@@ -19195,10 +20087,10 @@
         </w:pict>
       </w:r>
     </w:p>
-    <w:bookmarkEnd w:id="221"/>
     <w:bookmarkEnd w:id="222"/>
     <w:bookmarkEnd w:id="223"/>
-    <w:bookmarkStart w:id="237" w:name="plcopc-integration-mvp"/>
+    <w:bookmarkEnd w:id="224"/>
+    <w:bookmarkStart w:id="238" w:name="plcopc-integration-mvp"/>
     <w:p>
       <w:pPr>
         <w:pStyle w:val="Heading2"/>
@@ -19216,7 +20108,7 @@
         <w:t xml:space="preserve">MVP</w:t>
       </w:r>
     </w:p>
-    <w:bookmarkStart w:id="224" w:name="design-overview-5"/>
+    <w:bookmarkStart w:id="225" w:name="design-overview-5"/>
     <w:p>
       <w:pPr>
         <w:pStyle w:val="Heading3"/>
@@ -19233,8 +20125,8 @@
         <w:t xml:space="preserve">The MES integrates with shop-floor equipment via OPC servers. Two primary patterns exist: the Machine Integration Panel (MIP) handshake for assembly lines, and direct tag reads for scales and sensors. All PLC communication flows through the Ignition Gateway’s OPC connections.</w:t>
       </w:r>
     </w:p>
-    <w:bookmarkEnd w:id="224"/>
-    <w:bookmarkStart w:id="228" w:name="mip-handshake-protocol-serialized-lines"/>
+    <w:bookmarkEnd w:id="225"/>
+    <w:bookmarkStart w:id="229" w:name="mip-handshake-protocol-serialized-lines"/>
     <w:p>
       <w:pPr>
         <w:pStyle w:val="Heading3"/>
@@ -19243,7 +20135,7 @@
         <w:t xml:space="preserve">10.2 MIP Handshake Protocol — Serialized Lines</w:t>
       </w:r>
     </w:p>
-    <w:bookmarkStart w:id="225" w:name="fds-10-001-mip-touch-points"/>
+    <w:bookmarkStart w:id="226" w:name="fds-10-001-mip-touch-points"/>
     <w:p>
       <w:pPr>
         <w:pStyle w:val="Heading4"/>
@@ -19887,8 +20779,8 @@
         <w:t xml:space="preserve">(Touchpoint Agreement Section 1.1–1.4)</w:t>
       </w:r>
     </w:p>
-    <w:bookmarkEnd w:id="225"/>
-    <w:bookmarkStart w:id="226" w:name="fds-10-002-mip-transaction-flow"/>
+    <w:bookmarkEnd w:id="226"/>
+    <w:bookmarkStart w:id="227" w:name="fds-10-002-mip-transaction-flow"/>
     <w:p>
       <w:pPr>
         <w:pStyle w:val="Heading4"/>
@@ -20070,8 +20962,8 @@
         <w:t xml:space="preserve">TransInProc=0</w:t>
       </w:r>
     </w:p>
-    <w:bookmarkEnd w:id="226"/>
-    <w:bookmarkStart w:id="227" w:name="fds-10-003-mes-alarms"/>
+    <w:bookmarkEnd w:id="227"/>
+    <w:bookmarkStart w:id="228" w:name="fds-10-003-mes-alarms"/>
     <w:p>
       <w:pPr>
         <w:pStyle w:val="Heading4"/>
@@ -20169,9 +21061,9 @@
         <w:t xml:space="preserve">— serial number already exists in the system</w:t>
       </w:r>
     </w:p>
-    <w:bookmarkEnd w:id="227"/>
     <w:bookmarkEnd w:id="228"/>
-    <w:bookmarkStart w:id="231" w:name="non-serialized-line-integration"/>
+    <w:bookmarkEnd w:id="229"/>
+    <w:bookmarkStart w:id="232" w:name="non-serialized-line-integration"/>
     <w:p>
       <w:pPr>
         <w:pStyle w:val="Heading3"/>
@@ -20180,7 +21072,7 @@
         <w:t xml:space="preserve">10.3 Non-Serialized Line Integration</w:t>
       </w:r>
     </w:p>
-    <w:bookmarkStart w:id="229" w:name="fds-10-004-disposition-based-lines"/>
+    <w:bookmarkStart w:id="230" w:name="fds-10-004-disposition-based-lines"/>
     <w:p>
       <w:pPr>
         <w:pStyle w:val="Heading4"/>
@@ -20227,8 +21119,8 @@
         <w:t xml:space="preserve">tags. These provide pass/fail validation without individual serial tracking.</w:t>
       </w:r>
     </w:p>
-    <w:bookmarkEnd w:id="229"/>
-    <w:bookmarkStart w:id="230" w:name="fds-10-005-vision-system-integration"/>
+    <w:bookmarkEnd w:id="230"/>
+    <w:bookmarkStart w:id="231" w:name="fds-10-005-vision-system-integration"/>
     <w:p>
       <w:pPr>
         <w:pStyle w:val="Heading4"/>
@@ -20317,9 +21209,9 @@
         <w:t xml:space="preserve">Blue Ridge recommends auto-hold + supervisor override popup for vision conflicts. The hold blocks production on that LOT until a supervisor intervenes. This ensures traceability of every conflict while not permanently stopping the line. Needs MPP validation of this workflow.</w:t>
       </w:r>
     </w:p>
-    <w:bookmarkEnd w:id="230"/>
     <w:bookmarkEnd w:id="231"/>
-    <w:bookmarkStart w:id="233" w:name="scale-integration"/>
+    <w:bookmarkEnd w:id="232"/>
+    <w:bookmarkStart w:id="234" w:name="scale-integration"/>
     <w:p>
       <w:pPr>
         <w:pStyle w:val="Heading3"/>
@@ -20328,7 +21220,7 @@
         <w:t xml:space="preserve">10.4 Scale Integration</w:t>
       </w:r>
     </w:p>
-    <w:bookmarkStart w:id="232" w:name="fds-10-006-omniserver-scale-reads"/>
+    <w:bookmarkStart w:id="233" w:name="fds-10-006-omniserver-scale-reads"/>
     <w:p>
       <w:pPr>
         <w:pStyle w:val="Heading4"/>
@@ -20380,9 +21272,9 @@
         <w:t xml:space="preserve">OmniServer/[LineName].[ScaleName].NET_NetWeightValue</w:t>
       </w:r>
     </w:p>
-    <w:bookmarkEnd w:id="232"/>
     <w:bookmarkEnd w:id="233"/>
-    <w:bookmarkStart w:id="236" w:name="barcode-integration"/>
+    <w:bookmarkEnd w:id="234"/>
+    <w:bookmarkStart w:id="237" w:name="barcode-integration"/>
     <w:p>
       <w:pPr>
         <w:pStyle w:val="Heading3"/>
@@ -20391,7 +21283,7 @@
         <w:t xml:space="preserve">10.5 Barcode Integration</w:t>
       </w:r>
     </w:p>
-    <w:bookmarkStart w:id="234" w:name="fds-10-007-barcode-scanners"/>
+    <w:bookmarkStart w:id="235" w:name="fds-10-007-barcode-scanners"/>
     <w:p>
       <w:pPr>
         <w:pStyle w:val="Heading4"/>
@@ -20408,8 +21300,8 @@
         <w:t xml:space="preserve">Barcode scanners at terminals SHALL operate as keyboard wedge devices — scan data is injected into the active input field on the Perspective screen. No custom scanner driver integration is required. The MES SHALL validate scanned data (LTT barcode format, AIM shipper ID format) on the server side after entry.</w:t>
       </w:r>
     </w:p>
-    <w:bookmarkEnd w:id="234"/>
-    <w:bookmarkStart w:id="235" w:name="fds-10-008-zebra-printer-integration"/>
+    <w:bookmarkEnd w:id="235"/>
+    <w:bookmarkStart w:id="236" w:name="fds-10-008-zebra-printer-integration"/>
     <w:p>
       <w:pPr>
         <w:pStyle w:val="Heading4"/>
@@ -20433,10 +21325,10 @@
         </w:pict>
       </w:r>
     </w:p>
-    <w:bookmarkEnd w:id="235"/>
     <w:bookmarkEnd w:id="236"/>
     <w:bookmarkEnd w:id="237"/>
-    <w:bookmarkStart w:id="253" w:name="audit-logging-mvp"/>
+    <w:bookmarkEnd w:id="238"/>
+    <w:bookmarkStart w:id="254" w:name="audit-logging-mvp"/>
     <w:p>
       <w:pPr>
         <w:pStyle w:val="Heading2"/>
@@ -20454,7 +21346,7 @@
         <w:t xml:space="preserve">MVP</w:t>
       </w:r>
     </w:p>
-    <w:bookmarkStart w:id="238" w:name="design-overview-6"/>
+    <w:bookmarkStart w:id="239" w:name="design-overview-6"/>
     <w:p>
       <w:pPr>
         <w:pStyle w:val="Heading3"/>
@@ -20553,8 +21445,8 @@
         <w:t xml:space="preserve">). Entity-specific procs never write to log tables directly — they call the shared procs. This gives a single source of truth for how audit entries are written and makes the audit schema refactor-friendly.</w:t>
       </w:r>
     </w:p>
-    <w:bookmarkEnd w:id="238"/>
-    <w:bookmarkStart w:id="244" w:name="log-types"/>
+    <w:bookmarkEnd w:id="239"/>
+    <w:bookmarkStart w:id="245" w:name="log-types"/>
     <w:p>
       <w:pPr>
         <w:pStyle w:val="Heading3"/>
@@ -20563,7 +21455,7 @@
         <w:t xml:space="preserve">11.2 Log Types</w:t>
       </w:r>
     </w:p>
-    <w:bookmarkStart w:id="239" w:name="fds-11-001-operation-log"/>
+    <w:bookmarkStart w:id="240" w:name="fds-11-001-operation-log"/>
     <w:p>
       <w:pPr>
         <w:pStyle w:val="Heading4"/>
@@ -20607,8 +21499,8 @@
         <w:t xml:space="preserve">inside the mutating proc’s transaction — atomic with the data.</w:t>
       </w:r>
     </w:p>
-    <w:bookmarkEnd w:id="239"/>
-    <w:bookmarkStart w:id="240" w:name="fds-11-002-configuration-log"/>
+    <w:bookmarkEnd w:id="240"/>
+    <w:bookmarkStart w:id="241" w:name="fds-11-002-configuration-log"/>
     <w:p>
       <w:pPr>
         <w:pStyle w:val="Heading4"/>
@@ -20652,8 +21544,8 @@
         <w:t xml:space="preserve">inside the mutating proc’s transaction — atomic with the data.</w:t>
       </w:r>
     </w:p>
-    <w:bookmarkEnd w:id="240"/>
-    <w:bookmarkStart w:id="241" w:name="fds-11-003-interface-log"/>
+    <w:bookmarkEnd w:id="241"/>
+    <w:bookmarkStart w:id="242" w:name="fds-11-003-interface-log"/>
     <w:p>
       <w:pPr>
         <w:pStyle w:val="Heading4"/>
@@ -20694,8 +21586,8 @@
         <w:t xml:space="preserve">.</w:t>
       </w:r>
     </w:p>
-    <w:bookmarkEnd w:id="241"/>
-    <w:bookmarkStart w:id="242" w:name="fds-11-004-failure-log"/>
+    <w:bookmarkEnd w:id="242"/>
+    <w:bookmarkStart w:id="243" w:name="fds-11-004-failure-log"/>
     <w:p>
       <w:pPr>
         <w:pStyle w:val="Heading4"/>
@@ -20865,8 +21757,8 @@
         <w:t xml:space="preserve">to support root-cause analysis and UX improvement. Not having this visibility is a known pain point in the legacy MES.</w:t>
       </w:r>
     </w:p>
-    <w:bookmarkEnd w:id="242"/>
-    <w:bookmarkStart w:id="243" w:name="X07a2c5733b4c265bf732336fe471dbedae8154b"/>
+    <w:bookmarkEnd w:id="243"/>
+    <w:bookmarkStart w:id="244" w:name="X07a2c5733b4c265bf732336fe471dbedae8154b"/>
     <w:p>
       <w:pPr>
         <w:pStyle w:val="Heading4"/>
@@ -20913,9 +21805,9 @@
         <w:t xml:space="preserve">columns. When disabled, only the summary description is logged. High-fidelity mode SHALL be toggleable per target system without restart.</w:t>
       </w:r>
     </w:p>
-    <w:bookmarkEnd w:id="243"/>
     <w:bookmarkEnd w:id="244"/>
-    <w:bookmarkStart w:id="249" w:name="normalized-vocabularies"/>
+    <w:bookmarkEnd w:id="245"/>
+    <w:bookmarkStart w:id="250" w:name="normalized-vocabularies"/>
     <w:p>
       <w:pPr>
         <w:pStyle w:val="Heading3"/>
@@ -20924,7 +21816,7 @@
         <w:t xml:space="preserve">11.3 Normalized Vocabularies</w:t>
       </w:r>
     </w:p>
-    <w:bookmarkStart w:id="245" w:name="fds-11-006-event-type-vocabulary"/>
+    <w:bookmarkStart w:id="246" w:name="fds-11-006-event-type-vocabulary"/>
     <w:p>
       <w:pPr>
         <w:pStyle w:val="Heading4"/>
@@ -21220,8 +22112,8 @@
         <w:t xml:space="preserve">, and others as needed.</w:t>
       </w:r>
     </w:p>
-    <w:bookmarkEnd w:id="245"/>
-    <w:bookmarkStart w:id="246" w:name="fds-11-007-entity-type-vocabulary"/>
+    <w:bookmarkEnd w:id="246"/>
+    <w:bookmarkStart w:id="247" w:name="fds-11-007-entity-type-vocabulary"/>
     <w:p>
       <w:pPr>
         <w:pStyle w:val="Heading4"/>
@@ -21469,8 +22361,8 @@
         <w:t xml:space="preserve">, and others as needed.</w:t>
       </w:r>
     </w:p>
-    <w:bookmarkEnd w:id="246"/>
-    <w:bookmarkStart w:id="247" w:name="X3c009791de0f9a31363e85ebb3d02247d087310"/>
+    <w:bookmarkEnd w:id="247"/>
+    <w:bookmarkStart w:id="248" w:name="X3c009791de0f9a31363e85ebb3d02247d087310"/>
     <w:p>
       <w:pPr>
         <w:pStyle w:val="Heading4"/>
@@ -21523,8 +22415,8 @@
         <w:t xml:space="preserve">) rather than integer IDs. Each shared proc SHALL resolve the code strings to internal IDs via the seeded lookup tables. This keeps entity-specific procs self-documenting and removes hard-coded integer constants from the CRUD layer. A code-string that does not resolve SHALL cause the shared proc to raise an error (indicating a seeding gap or a typo).</w:t>
       </w:r>
     </w:p>
-    <w:bookmarkEnd w:id="247"/>
-    <w:bookmarkStart w:id="248" w:name="Xe5b0a78e848999cb6c4942a575fcb1fc0734dd1"/>
+    <w:bookmarkEnd w:id="248"/>
+    <w:bookmarkStart w:id="249" w:name="Xe5b0a78e848999cb6c4942a575fcb1fc0734dd1"/>
     <w:p>
       <w:pPr>
         <w:pStyle w:val="Heading4"/>
@@ -21600,7 +22492,7 @@
         <w:pStyle w:val="Compact"/>
         <w:numPr>
           <w:ilvl w:val="0"/>
-          <w:numId w:val="1007"/>
+          <w:numId w:val="1009"/>
         </w:numPr>
       </w:pPr>
       <w:r>
@@ -21709,7 +22601,7 @@
         <w:pStyle w:val="Compact"/>
         <w:numPr>
           <w:ilvl w:val="0"/>
-          <w:numId w:val="1007"/>
+          <w:numId w:val="1009"/>
         </w:numPr>
       </w:pPr>
       <w:r>
@@ -21767,7 +22659,7 @@
         <w:pStyle w:val="Compact"/>
         <w:numPr>
           <w:ilvl w:val="0"/>
-          <w:numId w:val="1007"/>
+          <w:numId w:val="1009"/>
         </w:numPr>
       </w:pPr>
       <w:r>
@@ -21864,7 +22756,7 @@
         <w:pStyle w:val="Compact"/>
         <w:numPr>
           <w:ilvl w:val="0"/>
-          <w:numId w:val="1007"/>
+          <w:numId w:val="1009"/>
         </w:numPr>
       </w:pPr>
       <w:r>
@@ -21926,9 +22818,9 @@
         <w:t xml:space="preserve">as the failure contract.</w:t>
       </w:r>
     </w:p>
-    <w:bookmarkEnd w:id="248"/>
     <w:bookmarkEnd w:id="249"/>
-    <w:bookmarkStart w:id="252" w:name="data-retention"/>
+    <w:bookmarkEnd w:id="250"/>
+    <w:bookmarkStart w:id="253" w:name="data-retention"/>
     <w:p>
       <w:pPr>
         <w:pStyle w:val="Heading3"/>
@@ -21937,7 +22829,7 @@
         <w:t xml:space="preserve">11.4 Data Retention</w:t>
       </w:r>
     </w:p>
-    <w:bookmarkStart w:id="250" w:name="fds-11-009-retention-policy"/>
+    <w:bookmarkStart w:id="251" w:name="fds-11-009-retention-policy"/>
     <w:p>
       <w:pPr>
         <w:pStyle w:val="Heading4"/>
@@ -21954,8 +22846,8 @@
         <w:t xml:space="preserve">All MES data SHALL be retained for a minimum of 20 years (Honda traceability requirement). Online data (hot storage in SQL Server) SHALL be retained for a minimum of 6 months. Data older than 6 months MAY be archived to a secondary store, but SHALL remain queryable for genealogy and audit purposes.</w:t>
       </w:r>
     </w:p>
-    <w:bookmarkEnd w:id="250"/>
-    <w:bookmarkStart w:id="251" w:name="fds-11-010-bigint-primary-keys"/>
+    <w:bookmarkEnd w:id="251"/>
+    <w:bookmarkStart w:id="252" w:name="fds-11-010-bigint-primary-keys"/>
     <w:p>
       <w:pPr>
         <w:pStyle w:val="Heading4"/>
@@ -22024,10 +22916,10 @@
         </w:pict>
       </w:r>
     </w:p>
-    <w:bookmarkEnd w:id="251"/>
     <w:bookmarkEnd w:id="252"/>
     <w:bookmarkEnd w:id="253"/>
-    <w:bookmarkStart w:id="269" w:name="reporting-mvp"/>
+    <w:bookmarkEnd w:id="254"/>
+    <w:bookmarkStart w:id="270" w:name="reporting-mvp"/>
     <w:p>
       <w:pPr>
         <w:pStyle w:val="Heading2"/>
@@ -22045,7 +22937,7 @@
         <w:t xml:space="preserve">MVP</w:t>
       </w:r>
     </w:p>
-    <w:bookmarkStart w:id="254" w:name="design-overview-7"/>
+    <w:bookmarkStart w:id="255" w:name="design-overview-7"/>
     <w:p>
       <w:pPr>
         <w:pStyle w:val="Heading3"/>
@@ -22062,8 +22954,8 @@
         <w:t xml:space="preserve">The MES SHALL provide reports that replace the legacy Productivity Database reports and support Honda traceability requirements. Reports SHALL be delivered via Ignition’s Reporting Module (PDF/HTML/CSV) and Perspective embedded views.</w:t>
       </w:r>
     </w:p>
-    <w:bookmarkEnd w:id="254"/>
-    <w:bookmarkStart w:id="259" w:name="traceability-reports"/>
+    <w:bookmarkEnd w:id="255"/>
+    <w:bookmarkStart w:id="260" w:name="traceability-reports"/>
     <w:p>
       <w:pPr>
         <w:pStyle w:val="Heading3"/>
@@ -22072,7 +22964,7 @@
         <w:t xml:space="preserve">12.2 Traceability Reports</w:t>
       </w:r>
     </w:p>
-    <w:bookmarkStart w:id="255" w:name="fds-12-001-lot-genealogy-report"/>
+    <w:bookmarkStart w:id="256" w:name="fds-12-001-lot-genealogy-report"/>
     <w:p>
       <w:pPr>
         <w:pStyle w:val="Heading4"/>
@@ -22089,8 +22981,8 @@
         <w:t xml:space="preserve">Given any LOT, sub-LOT, serial number, or container, the system SHALL display the complete genealogy tree: all source LOTs, operations performed, operators, machines, timestamps, defect codes, and shipping destination. This is the primary Honda traceability deliverable. (FRS 3.13.2)</w:t>
       </w:r>
     </w:p>
-    <w:bookmarkEnd w:id="255"/>
-    <w:bookmarkStart w:id="256" w:name="fds-12-002-serialized-item-search"/>
+    <w:bookmarkEnd w:id="256"/>
+    <w:bookmarkStart w:id="257" w:name="fds-12-002-serialized-item-search"/>
     <w:p>
       <w:pPr>
         <w:pStyle w:val="Heading4"/>
@@ -22107,8 +22999,8 @@
         <w:t xml:space="preserve">Given a serial number, the system SHALL return: item, source LOT(s), production date/time, operator, machine, container, shipper ID, and ship date. (FRS 3.13.2)</w:t>
       </w:r>
     </w:p>
-    <w:bookmarkEnd w:id="256"/>
-    <w:bookmarkStart w:id="257" w:name="fds-12-003-container-search"/>
+    <w:bookmarkEnd w:id="257"/>
+    <w:bookmarkStart w:id="258" w:name="fds-12-003-container-search"/>
     <w:p>
       <w:pPr>
         <w:pStyle w:val="Heading4"/>
@@ -22125,8 +23017,8 @@
         <w:t xml:space="preserve">Given a container name or AIM shipper ID, the system SHALL return: item, piece count, source LOT(s), serial numbers (if serialized), container status, ship date, and hold history.</w:t>
       </w:r>
     </w:p>
-    <w:bookmarkEnd w:id="257"/>
-    <w:bookmarkStart w:id="258" w:name="fds-12-004-lot-search"/>
+    <w:bookmarkEnd w:id="258"/>
+    <w:bookmarkStart w:id="259" w:name="fds-12-004-lot-search"/>
     <w:p>
       <w:pPr>
         <w:pStyle w:val="Heading4"/>
@@ -22143,9 +23035,9 @@
         <w:t xml:space="preserve">The system SHALL provide a LOT search screen with filters: part number, date range, die number, cavity number, status, location, and origin type. Results SHALL display LOT details with drill-down to genealogy, movements, and production events.</w:t>
       </w:r>
     </w:p>
-    <w:bookmarkEnd w:id="258"/>
     <w:bookmarkEnd w:id="259"/>
-    <w:bookmarkStart w:id="264" w:name="X20e5703298e30073c8ffa1040c87c727e57d853"/>
+    <w:bookmarkEnd w:id="260"/>
+    <w:bookmarkStart w:id="265" w:name="X20e5703298e30073c8ffa1040c87c727e57d853"/>
     <w:p>
       <w:pPr>
         <w:pStyle w:val="Heading3"/>
@@ -22154,7 +23046,7 @@
         <w:t xml:space="preserve">12.3 Production Reports (Replacing Productivity DB)</w:t>
       </w:r>
     </w:p>
-    <w:bookmarkStart w:id="260" w:name="fds-12-005-die-shot-report"/>
+    <w:bookmarkStart w:id="261" w:name="fds-12-005-die-shot-report"/>
     <w:p>
       <w:pPr>
         <w:pStyle w:val="Heading4"/>
@@ -22171,8 +23063,8 @@
         <w:t xml:space="preserve">A report of total shots, good shots, warm-up shots, and reject counts per die per shift. Replaces the paper DCFM production sheet summary. (FRS 5.6.6)</w:t>
       </w:r>
     </w:p>
-    <w:bookmarkEnd w:id="260"/>
-    <w:bookmarkStart w:id="261" w:name="fds-12-006-rejects-report"/>
+    <w:bookmarkEnd w:id="261"/>
+    <w:bookmarkStart w:id="262" w:name="fds-12-006-rejects-report"/>
     <w:p>
       <w:pPr>
         <w:pStyle w:val="Heading4"/>
@@ -22189,8 +23081,8 @@
         <w:t xml:space="preserve">A report of reject counts by defect code, area, machine, and date range. Replaces the PD rejects data entry and reporting. (FRS 3.5.4)</w:t>
       </w:r>
     </w:p>
-    <w:bookmarkEnd w:id="261"/>
-    <w:bookmarkStart w:id="262" w:name="fds-12-007-downtime-report"/>
+    <w:bookmarkEnd w:id="262"/>
+    <w:bookmarkStart w:id="263" w:name="fds-12-007-downtime-report"/>
     <w:p>
       <w:pPr>
         <w:pStyle w:val="Heading4"/>
@@ -22207,8 +23099,8 @@
         <w:t xml:space="preserve">A report of downtime events by reason code, reason type, area, machine, and date range. Includes total downtime minutes per shift. Replaces the PD downtime data entry and reporting. (FRS 3.15.0)</w:t>
       </w:r>
     </w:p>
-    <w:bookmarkEnd w:id="262"/>
-    <w:bookmarkStart w:id="263" w:name="fds-12-008-production-report"/>
+    <w:bookmarkEnd w:id="263"/>
+    <w:bookmarkStart w:id="264" w:name="fds-12-008-production-report"/>
     <w:p>
       <w:pPr>
         <w:pStyle w:val="Heading4"/>
@@ -22225,9 +23117,9 @@
         <w:t xml:space="preserve">A summary report of production output by part number, machine, shift, and date range. Includes good count, reject count, and yield. Replaces the PD production report. (FRS 3.5.4)</w:t>
       </w:r>
     </w:p>
-    <w:bookmarkEnd w:id="263"/>
     <w:bookmarkEnd w:id="264"/>
-    <w:bookmarkStart w:id="268" w:name="operational-reports"/>
+    <w:bookmarkEnd w:id="265"/>
+    <w:bookmarkStart w:id="269" w:name="operational-reports"/>
     <w:p>
       <w:pPr>
         <w:pStyle w:val="Heading3"/>
@@ -22236,7 +23128,7 @@
         <w:t xml:space="preserve">12.4 Operational Reports</w:t>
       </w:r>
     </w:p>
-    <w:bookmarkStart w:id="265" w:name="fds-12-009-in-process-lot-tracking"/>
+    <w:bookmarkStart w:id="266" w:name="fds-12-009-in-process-lot-tracking"/>
     <w:p>
       <w:pPr>
         <w:pStyle w:val="Heading4"/>
@@ -22253,8 +23145,8 @@
         <w:t xml:space="preserve">A real-time view of all active LOTs: current location, piece count, status, age (time since creation). Filterable by area, part number, and status.</w:t>
       </w:r>
     </w:p>
-    <w:bookmarkEnd w:id="265"/>
-    <w:bookmarkStart w:id="266" w:name="fds-12-010-hold-status-report"/>
+    <w:bookmarkEnd w:id="266"/>
+    <w:bookmarkStart w:id="267" w:name="fds-12-010-hold-status-report"/>
     <w:p>
       <w:pPr>
         <w:pStyle w:val="Heading4"/>
@@ -22271,8 +23163,8 @@
         <w:t xml:space="preserve">A report of all LOTs and containers currently on hold: hold type, reason, placed-by, duration on hold. Supports quality management workflow.</w:t>
       </w:r>
     </w:p>
-    <w:bookmarkEnd w:id="266"/>
-    <w:bookmarkStart w:id="267" w:name="fds-12-011-shipping-history"/>
+    <w:bookmarkEnd w:id="267"/>
+    <w:bookmarkStart w:id="268" w:name="fds-12-011-shipping-history"/>
     <w:p>
       <w:pPr>
         <w:pStyle w:val="Heading4"/>
@@ -22296,10 +23188,10 @@
         </w:pict>
       </w:r>
     </w:p>
-    <w:bookmarkEnd w:id="267"/>
     <w:bookmarkEnd w:id="268"/>
     <w:bookmarkEnd w:id="269"/>
-    <w:bookmarkStart w:id="280" w:name="external-system-interfaces-mixed-scope"/>
+    <w:bookmarkEnd w:id="270"/>
+    <w:bookmarkStart w:id="281" w:name="external-system-interfaces-mixed-scope"/>
     <w:p>
       <w:pPr>
         <w:pStyle w:val="Heading2"/>
@@ -22308,7 +23200,7 @@
         <w:t xml:space="preserve">13. External System Interfaces — MIXED SCOPE</w:t>
       </w:r>
     </w:p>
-    <w:bookmarkStart w:id="273" w:name="aim-honda-edi-mvp"/>
+    <w:bookmarkStart w:id="274" w:name="aim-honda-edi-mvp"/>
     <w:p>
       <w:pPr>
         <w:pStyle w:val="Heading3"/>
@@ -22326,7 +23218,7 @@
         <w:t xml:space="preserve">MVP</w:t>
       </w:r>
     </w:p>
-    <w:bookmarkStart w:id="270" w:name="fds-13-001-aim-interface-methods"/>
+    <w:bookmarkStart w:id="271" w:name="fds-13-001-aim-interface-methods"/>
     <w:p>
       <w:pPr>
         <w:pStyle w:val="Heading4"/>
@@ -22658,8 +23550,8 @@
         <w:t xml:space="preserve">(FRS 2.3.1, Appendix L)</w:t>
       </w:r>
     </w:p>
-    <w:bookmarkEnd w:id="270"/>
-    <w:bookmarkStart w:id="271" w:name="fds-13-002-aim-error-handling"/>
+    <w:bookmarkEnd w:id="271"/>
+    <w:bookmarkStart w:id="272" w:name="fds-13-002-aim-error-handling"/>
     <w:p>
       <w:pPr>
         <w:pStyle w:val="Heading4"/>
@@ -22715,8 +23607,8 @@
         <w:t xml:space="preserve">4. The container SHALL remain in its current status until the AIM call succeeds</w:t>
       </w:r>
     </w:p>
-    <w:bookmarkEnd w:id="271"/>
-    <w:bookmarkStart w:id="272" w:name="fds-13-003-aim-availability"/>
+    <w:bookmarkEnd w:id="272"/>
+    <w:bookmarkStart w:id="273" w:name="fds-13-003-aim-availability"/>
     <w:p>
       <w:pPr>
         <w:pStyle w:val="Heading4"/>
@@ -22733,9 +23625,9 @@
         <w:t xml:space="preserve">The system SHALL handle AIM unavailability gracefully. Containers can be completed and staged but SHALL NOT print shipping labels until an AIM shipper ID is assigned. Production SHALL NOT be blocked by AIM outages.</w:t>
       </w:r>
     </w:p>
-    <w:bookmarkEnd w:id="272"/>
     <w:bookmarkEnd w:id="273"/>
-    <w:bookmarkStart w:id="275" w:name="macola-erp-future"/>
+    <w:bookmarkEnd w:id="274"/>
+    <w:bookmarkStart w:id="276" w:name="macola-erp-future"/>
     <w:p>
       <w:pPr>
         <w:pStyle w:val="Heading3"/>
@@ -22753,7 +23645,7 @@
         <w:t xml:space="preserve">FUTURE</w:t>
       </w:r>
     </w:p>
-    <w:bookmarkStart w:id="274" w:name="fds-13-004-macola-scope-boundary"/>
+    <w:bookmarkStart w:id="275" w:name="fds-13-004-macola-scope-boundary"/>
     <w:p>
       <w:pPr>
         <w:pStyle w:val="Heading4"/>
@@ -22785,9 +23677,9 @@
         <w:t xml:space="preserve">for communications), but no integration is implemented in MVP. When activated, the expected interface is CSV import of Items/BOMs from Macola and possible production data export.</w:t>
       </w:r>
     </w:p>
-    <w:bookmarkEnd w:id="274"/>
     <w:bookmarkEnd w:id="275"/>
-    <w:bookmarkStart w:id="277" w:name="intelex-quality-management-future"/>
+    <w:bookmarkEnd w:id="276"/>
+    <w:bookmarkStart w:id="278" w:name="intelex-quality-management-future"/>
     <w:p>
       <w:pPr>
         <w:pStyle w:val="Heading3"/>
@@ -22805,7 +23697,7 @@
         <w:t xml:space="preserve">FUTURE</w:t>
       </w:r>
     </w:p>
-    <w:bookmarkStart w:id="276" w:name="fds-13-005-intelex-scope-boundary"/>
+    <w:bookmarkStart w:id="277" w:name="fds-13-005-intelex-scope-boundary"/>
     <w:p>
       <w:pPr>
         <w:pStyle w:val="Heading4"/>
@@ -22822,9 +23714,9 @@
         <w:t xml:space="preserve">Intelex integration is FUTURE. MPP currently uses Intelex for NCM/failure analysis independently of the MES. When activated, the expected interface is REST API for synchronizing hold events and quality data between MES and Intelex.</w:t>
       </w:r>
     </w:p>
-    <w:bookmarkEnd w:id="276"/>
     <w:bookmarkEnd w:id="277"/>
-    <w:bookmarkStart w:id="279" w:name="scada-process-dashboards-future"/>
+    <w:bookmarkEnd w:id="278"/>
+    <w:bookmarkStart w:id="280" w:name="scada-process-dashboards-future"/>
     <w:p>
       <w:pPr>
         <w:pStyle w:val="Heading3"/>
@@ -22842,7 +23734,7 @@
         <w:t xml:space="preserve">FUTURE</w:t>
       </w:r>
     </w:p>
-    <w:bookmarkStart w:id="278" w:name="fds-13-006-scada-scope-boundary"/>
+    <w:bookmarkStart w:id="279" w:name="fds-13-006-scada-scope-boundary"/>
     <w:p>
       <w:pPr>
         <w:pStyle w:val="Heading4"/>
@@ -22866,10 +23758,10 @@
         </w:pict>
       </w:r>
     </w:p>
-    <w:bookmarkEnd w:id="278"/>
     <w:bookmarkEnd w:id="279"/>
     <w:bookmarkEnd w:id="280"/>
-    <w:bookmarkStart w:id="286" w:name="data-migration-conditional"/>
+    <w:bookmarkEnd w:id="281"/>
+    <w:bookmarkStart w:id="287" w:name="data-migration-conditional"/>
     <w:p>
       <w:pPr>
         <w:pStyle w:val="Heading2"/>
@@ -22887,7 +23779,7 @@
         <w:t xml:space="preserve">CONDITIONAL</w:t>
       </w:r>
     </w:p>
-    <w:bookmarkStart w:id="285" w:name="overview"/>
+    <w:bookmarkStart w:id="286" w:name="overview"/>
     <w:p>
       <w:pPr>
         <w:pStyle w:val="Heading3"/>
@@ -22904,7 +23796,7 @@
         <w:t xml:space="preserve">Data migration covers two sources: the legacy Manufacturing Director MES and the Productivity Database. Migration scope is conditional on MPP approval (80-hour quote per Scope Matrix row 2).</w:t>
       </w:r>
     </w:p>
-    <w:bookmarkStart w:id="281" w:name="fds-14-001-seed-data-mvp-not-conditional"/>
+    <w:bookmarkStart w:id="282" w:name="fds-14-001-seed-data-mvp-not-conditional"/>
     <w:p>
       <w:pPr>
         <w:pStyle w:val="Heading4"/>
@@ -22971,8 +23863,8 @@
         <w:t xml:space="preserve">This is configuration data, not migration — it is required for the system to function.</w:t>
       </w:r>
     </w:p>
-    <w:bookmarkEnd w:id="281"/>
-    <w:bookmarkStart w:id="282" w:name="X1646aa20be375abfef6f88318d0a0c006670709"/>
+    <w:bookmarkEnd w:id="282"/>
+    <w:bookmarkStart w:id="283" w:name="X1646aa20be375abfef6f88318d0a0c006670709"/>
     <w:p>
       <w:pPr>
         <w:pStyle w:val="Heading4"/>
@@ -23015,8 +23907,8 @@
         <w:t xml:space="preserve">Historical production data (completed LOTs, shipped containers) MAY be migrated for reporting continuity, scoped during migration planning.</w:t>
       </w:r>
     </w:p>
-    <w:bookmarkEnd w:id="282"/>
-    <w:bookmarkStart w:id="283" w:name="Xac50ded15830ceb1a14a8e0fd9e01279af92e69"/>
+    <w:bookmarkEnd w:id="283"/>
+    <w:bookmarkStart w:id="284" w:name="Xac50ded15830ceb1a14a8e0fd9e01279af92e69"/>
     <w:p>
       <w:pPr>
         <w:pStyle w:val="Heading4"/>
@@ -23033,8 +23925,8 @@
         <w:t xml:space="preserve">If approved, migration from the Productivity Database SHALL include historical production summaries for reporting continuity. The PD data structure differs from the MES schema — a transformation layer is required.</w:t>
       </w:r>
     </w:p>
-    <w:bookmarkEnd w:id="283"/>
-    <w:bookmarkStart w:id="284" w:name="fds-14-004-migration-validation"/>
+    <w:bookmarkEnd w:id="284"/>
+    <w:bookmarkStart w:id="285" w:name="fds-14-004-migration-validation"/>
     <w:p>
       <w:pPr>
         <w:pStyle w:val="Heading4"/>
@@ -23058,10 +23950,10 @@
         </w:pict>
       </w:r>
     </w:p>
-    <w:bookmarkEnd w:id="284"/>
     <w:bookmarkEnd w:id="285"/>
     <w:bookmarkEnd w:id="286"/>
-    <w:bookmarkStart w:id="297" w:name="deployment-commissioning-mvp"/>
+    <w:bookmarkEnd w:id="287"/>
+    <w:bookmarkStart w:id="298" w:name="deployment-commissioning-mvp"/>
     <w:p>
       <w:pPr>
         <w:pStyle w:val="Heading2"/>
@@ -23079,7 +23971,7 @@
         <w:t xml:space="preserve">MVP</w:t>
       </w:r>
     </w:p>
-    <w:bookmarkStart w:id="293" w:name="deployment-approach"/>
+    <w:bookmarkStart w:id="294" w:name="deployment-approach"/>
     <w:p>
       <w:pPr>
         <w:pStyle w:val="Heading3"/>
@@ -23088,7 +23980,7 @@
         <w:t xml:space="preserve">15.1 Deployment Approach</w:t>
       </w:r>
     </w:p>
-    <w:bookmarkStart w:id="287" w:name="fds-15-001-phased-rollout"/>
+    <w:bookmarkStart w:id="288" w:name="fds-15-001-phased-rollout"/>
     <w:p>
       <w:pPr>
         <w:pStyle w:val="Heading4"/>
@@ -23105,8 +23997,8 @@
         <w:t xml:space="preserve">The MES SHALL be deployed in phases, starting with a single area (recommended: Die Cast, as it is the LOT origin point). Each phase SHALL include: configuration, operator training, shadow commissioning, and go-live. Subsequent areas (Trim, Machining, Assembly, Shipping) SHALL be added in production flow order.</w:t>
       </w:r>
     </w:p>
-    <w:bookmarkEnd w:id="287"/>
-    <w:bookmarkStart w:id="288" w:name="fds-15-002-shadow-commissioning"/>
+    <w:bookmarkEnd w:id="288"/>
+    <w:bookmarkStart w:id="289" w:name="fds-15-002-shadow-commissioning"/>
     <w:p>
       <w:pPr>
         <w:pStyle w:val="Heading4"/>
@@ -23123,8 +24015,8 @@
         <w:t xml:space="preserve">Before go-live in each area, the new MES SHALL run in parallel with the legacy system. Operators SHALL duplicate LOT entries and movements in both systems. The shadow period SHALL validate: WIP state generation, LOT traceability, and report accuracy against legacy data. (FRS 6.1.4)</w:t>
       </w:r>
     </w:p>
-    <w:bookmarkEnd w:id="288"/>
-    <w:bookmarkStart w:id="289" w:name="X84db5f854b4d8f1e0279e36498a1ffa41083c52"/>
+    <w:bookmarkEnd w:id="289"/>
+    <w:bookmarkStart w:id="290" w:name="X84db5f854b4d8f1e0279e36498a1ffa41083c52"/>
     <w:p>
       <w:pPr>
         <w:pStyle w:val="Heading4"/>
@@ -23183,8 +24075,8 @@
         <w:t xml:space="preserve">- All interlock validations (hold blocks production, eligibility checks, duplicate serial rejection)</w:t>
       </w:r>
     </w:p>
-    <w:bookmarkEnd w:id="289"/>
-    <w:bookmarkStart w:id="290" w:name="fds-15-004-site-acceptance-testing-sat"/>
+    <w:bookmarkEnd w:id="290"/>
+    <w:bookmarkStart w:id="291" w:name="fds-15-004-site-acceptance-testing-sat"/>
     <w:p>
       <w:pPr>
         <w:pStyle w:val="Heading4"/>
@@ -23237,8 +24129,8 @@
         <w:t xml:space="preserve">- Performance under actual production volume</w:t>
       </w:r>
     </w:p>
-    <w:bookmarkEnd w:id="290"/>
-    <w:bookmarkStart w:id="291" w:name="fds-15-005-go-live-support"/>
+    <w:bookmarkEnd w:id="291"/>
+    <w:bookmarkStart w:id="292" w:name="fds-15-005-go-live-support"/>
     <w:p>
       <w:pPr>
         <w:pStyle w:val="Heading4"/>
@@ -23255,8 +24147,8 @@
         <w:t xml:space="preserve">Go-live SHALL include on-site support for the first 5 days of production (24-hour coverage). Remote support SHALL continue for 30 days after go-live.</w:t>
       </w:r>
     </w:p>
-    <w:bookmarkEnd w:id="291"/>
-    <w:bookmarkStart w:id="292" w:name="fds-15-006-rollback-plan"/>
+    <w:bookmarkEnd w:id="292"/>
+    <w:bookmarkStart w:id="293" w:name="fds-15-006-rollback-plan"/>
     <w:p>
       <w:pPr>
         <w:pStyle w:val="Heading4"/>
@@ -23273,9 +24165,9 @@
         <w:t xml:space="preserve">A documented rollback plan SHALL exist for each deployment phase. The legacy system SHALL remain operational during the shadow period. If the new MES encounters critical issues, the affected area SHALL revert to the legacy system with no data loss.</w:t>
       </w:r>
     </w:p>
-    <w:bookmarkEnd w:id="292"/>
     <w:bookmarkEnd w:id="293"/>
-    <w:bookmarkStart w:id="296" w:name="change-management"/>
+    <w:bookmarkEnd w:id="294"/>
+    <w:bookmarkStart w:id="297" w:name="change-management"/>
     <w:p>
       <w:pPr>
         <w:pStyle w:val="Heading3"/>
@@ -23284,7 +24176,7 @@
         <w:t xml:space="preserve">15.2 Change Management</w:t>
       </w:r>
     </w:p>
-    <w:bookmarkStart w:id="294" w:name="X33aac50d998a178ce32f93359afcca2067ce0b9"/>
+    <w:bookmarkStart w:id="295" w:name="X33aac50d998a178ce32f93359afcca2067ce0b9"/>
     <w:p>
       <w:pPr>
         <w:pStyle w:val="Heading4"/>
@@ -23301,8 +24193,8 @@
         <w:t xml:space="preserve">The MES replaces the legacy pattern of paper-first, clerk-entry-later with real-time operator data entry at the machine. This is a fundamental process change that requires: operator training, terminal placement review, and management commitment. The MES does NOT require a data entry clerk — all production data is captured at point-of-action. (FRS 5.6.6)</w:t>
       </w:r>
     </w:p>
-    <w:bookmarkEnd w:id="294"/>
-    <w:bookmarkStart w:id="295" w:name="fds-15-008-operator-training"/>
+    <w:bookmarkEnd w:id="295"/>
+    <w:bookmarkStart w:id="296" w:name="fds-15-008-operator-training"/>
     <w:p>
       <w:pPr>
         <w:pStyle w:val="Heading4"/>
@@ -23326,10 +24218,10 @@
         </w:pict>
       </w:r>
     </w:p>
-    <w:bookmarkEnd w:id="295"/>
     <w:bookmarkEnd w:id="296"/>
     <w:bookmarkEnd w:id="297"/>
-    <w:bookmarkStart w:id="306" w:name="appendices"/>
+    <w:bookmarkEnd w:id="298"/>
+    <w:bookmarkStart w:id="307" w:name="appendices"/>
     <w:p>
       <w:pPr>
         <w:pStyle w:val="Heading2"/>
@@ -23338,7 +24230,7 @@
         <w:t xml:space="preserve">Appendices</w:t>
       </w:r>
     </w:p>
-    <w:bookmarkStart w:id="298" w:name="appendix-a-machine-list"/>
+    <w:bookmarkStart w:id="299" w:name="appendix-a-machine-list"/>
     <w:p>
       <w:pPr>
         <w:pStyle w:val="Heading3"/>
@@ -23355,8 +24247,8 @@
         <w:t xml:space="preserve">Seed data from FRS Appendix B. ~230 machines organized by area with attributes (tonnage, cycle times). To be populated during deployment configuration.</w:t>
       </w:r>
     </w:p>
-    <w:bookmarkEnd w:id="298"/>
-    <w:bookmarkStart w:id="299" w:name="appendix-b-downtime-reason-codes"/>
+    <w:bookmarkEnd w:id="299"/>
+    <w:bookmarkStart w:id="300" w:name="appendix-b-downtime-reason-codes"/>
     <w:p>
       <w:pPr>
         <w:pStyle w:val="Heading3"/>
@@ -23373,8 +24265,8 @@
         <w:t xml:space="preserve">Seed data from FRS Appendix D. ~660 codes organized by area and type (Equipment, Mold, Quality, Setup, Miscellaneous, Unscheduled). To be loaded during deployment.</w:t>
       </w:r>
     </w:p>
-    <w:bookmarkEnd w:id="299"/>
-    <w:bookmarkStart w:id="300" w:name="appendix-c-defect-codes"/>
+    <w:bookmarkEnd w:id="300"/>
+    <w:bookmarkStart w:id="301" w:name="appendix-c-defect-codes"/>
     <w:p>
       <w:pPr>
         <w:pStyle w:val="Heading3"/>
@@ -23391,8 +24283,8 @@
         <w:t xml:space="preserve">Seed data from FRS Appendix E. ~145 codes organized by area (Die Cast, Machine Shop, Trim Shop, Production Control, Quality Control, HSP). To be loaded during deployment.</w:t>
       </w:r>
     </w:p>
-    <w:bookmarkEnd w:id="300"/>
-    <w:bookmarkStart w:id="301" w:name="appendix-d-opc-tag-map"/>
+    <w:bookmarkEnd w:id="301"/>
+    <w:bookmarkStart w:id="302" w:name="appendix-d-opc-tag-map"/>
     <w:p>
       <w:pPr>
         <w:pStyle w:val="Heading3"/>
@@ -23409,8 +24301,8 @@
         <w:t xml:space="preserve">Complete OPC tag listing from FRS Appendix C, organized by OPC server (OmniServer, TOPServer) and line. Extended with tag-to-MES-field mappings.</w:t>
       </w:r>
     </w:p>
-    <w:bookmarkEnd w:id="301"/>
-    <w:bookmarkStart w:id="302" w:name="Xae8790957df54d6afc71b3c9b12444c4e20f425"/>
+    <w:bookmarkEnd w:id="302"/>
+    <w:bookmarkStart w:id="303" w:name="Xae8790957df54d6afc71b3c9b12444c4e20f425"/>
     <w:p>
       <w:pPr>
         <w:pStyle w:val="Heading3"/>
@@ -23427,8 +24319,8 @@
         <w:t xml:space="preserve">Touch point definitions from the 5GO_AP4 Automation Touchpoint Agreement, extended to all integrated assembly lines. Includes transaction flow diagrams per line type.</w:t>
       </w:r>
     </w:p>
-    <w:bookmarkEnd w:id="302"/>
-    <w:bookmarkStart w:id="303" w:name="appendix-f-frs-requirements-crosswalk"/>
+    <w:bookmarkEnd w:id="303"/>
+    <w:bookmarkStart w:id="304" w:name="appendix-f-frs-requirements-crosswalk"/>
     <w:p>
       <w:pPr>
         <w:pStyle w:val="Heading3"/>
@@ -23445,8 +24337,8 @@
         <w:t xml:space="preserve">Every FRS 3.x.x requirement mapped to the FDS section and requirement ID that addresses it. Ensures complete coverage.</w:t>
       </w:r>
     </w:p>
-    <w:bookmarkEnd w:id="303"/>
-    <w:bookmarkStart w:id="304" w:name="appendix-g-scope-matrix-crosswalk"/>
+    <w:bookmarkEnd w:id="304"/>
+    <w:bookmarkStart w:id="305" w:name="appendix-g-scope-matrix-crosswalk"/>
     <w:p>
       <w:pPr>
         <w:pStyle w:val="Heading3"/>
@@ -23463,8 +24355,8 @@
         <w:t xml:space="preserve">Every Scope Matrix row mapped to the FDS section, scope tag (MVP/CONDITIONAL/FUTURE), and implementation status.</w:t>
       </w:r>
     </w:p>
-    <w:bookmarkEnd w:id="304"/>
-    <w:bookmarkStart w:id="305" w:name="X0517c9ee0d598571e0cc2e94019c98c2a6ca7f1"/>
+    <w:bookmarkEnd w:id="305"/>
+    <w:bookmarkStart w:id="306" w:name="X0517c9ee0d598571e0cc2e94019c98c2a6ca7f1"/>
     <w:p>
       <w:pPr>
         <w:pStyle w:val="Heading3"/>
@@ -23488,9 +24380,9 @@
         </w:pict>
       </w:r>
     </w:p>
-    <w:bookmarkEnd w:id="305"/>
     <w:bookmarkEnd w:id="306"/>
-    <w:bookmarkStart w:id="307" w:name="open-items-register"/>
+    <w:bookmarkEnd w:id="307"/>
+    <w:bookmarkStart w:id="308" w:name="open-items-register"/>
     <w:p>
       <w:pPr>
         <w:pStyle w:val="Heading2"/>
@@ -24329,8 +25221,8 @@
         </w:tc>
       </w:tr>
     </w:tbl>
-    <w:bookmarkEnd w:id="307"/>
     <w:bookmarkEnd w:id="308"/>
+    <w:bookmarkEnd w:id="309"/>
     <w:sectPr>
       <w:footnotePr>
         <w:numRestart w:val="eachSect"/>
@@ -24627,6 +25519,91 @@
       <w:rPr>
         <w:rFonts w:ascii="Wingdings" w:hAnsi="Wingdings" w:cs="Wingdings" w:hint="default"/>
       </w:rPr>
+    </w:lvl>
+  </w:abstractNum>
+  <w:abstractNum w:abstractNumId="99711">
+    <w:nsid w:val="00A99711"/>
+    <w:multiLevelType w:val="multilevel"/>
+    <w:lvl w:ilvl="0">
+      <w:start w:val="1"/>
+      <w:numFmt w:val="lowerLetter"/>
+      <w:lvlText w:val="%1."/>
+      <w:lvlJc w:val="left"/>
+      <w:pPr>
+        <w:ind w:left="720" w:hanging="360"/>
+      </w:pPr>
+    </w:lvl>
+    <w:lvl w:ilvl="1">
+      <w:start w:val="1"/>
+      <w:numFmt w:val="lowerLetter"/>
+      <w:lvlText w:val="%2."/>
+      <w:lvlJc w:val="left"/>
+      <w:pPr>
+        <w:ind w:left="1440" w:hanging="360"/>
+      </w:pPr>
+    </w:lvl>
+    <w:lvl w:ilvl="2">
+      <w:start w:val="1"/>
+      <w:numFmt w:val="lowerLetter"/>
+      <w:lvlText w:val="%3."/>
+      <w:lvlJc w:val="left"/>
+      <w:pPr>
+        <w:ind w:left="2160" w:hanging="360"/>
+      </w:pPr>
+    </w:lvl>
+    <w:lvl w:ilvl="3">
+      <w:start w:val="1"/>
+      <w:numFmt w:val="lowerLetter"/>
+      <w:lvlText w:val="%4."/>
+      <w:lvlJc w:val="left"/>
+      <w:pPr>
+        <w:ind w:left="2880" w:hanging="360"/>
+      </w:pPr>
+    </w:lvl>
+    <w:lvl w:ilvl="4">
+      <w:start w:val="1"/>
+      <w:numFmt w:val="lowerLetter"/>
+      <w:lvlText w:val="%5."/>
+      <w:lvlJc w:val="left"/>
+      <w:pPr>
+        <w:ind w:left="3600" w:hanging="360"/>
+      </w:pPr>
+    </w:lvl>
+    <w:lvl w:ilvl="5">
+      <w:start w:val="1"/>
+      <w:numFmt w:val="lowerLetter"/>
+      <w:lvlText w:val="%6."/>
+      <w:lvlJc w:val="left"/>
+      <w:pPr>
+        <w:ind w:left="4320" w:hanging="360"/>
+      </w:pPr>
+    </w:lvl>
+    <w:lvl w:ilvl="6">
+      <w:start w:val="1"/>
+      <w:numFmt w:val="lowerLetter"/>
+      <w:lvlText w:val="%7."/>
+      <w:lvlJc w:val="left"/>
+      <w:pPr>
+        <w:ind w:left="5040" w:hanging="360"/>
+      </w:pPr>
+    </w:lvl>
+    <w:lvl w:ilvl="7">
+      <w:start w:val="1"/>
+      <w:numFmt w:val="lowerLetter"/>
+      <w:lvlText w:val="%8."/>
+      <w:lvlJc w:val="left"/>
+      <w:pPr>
+        <w:ind w:left="5760" w:hanging="360"/>
+      </w:pPr>
+    </w:lvl>
+    <w:lvl w:ilvl="8">
+      <w:start w:val="1"/>
+      <w:numFmt w:val="lowerLetter"/>
+      <w:lvlText w:val="%9."/>
+      <w:lvlJc w:val="left"/>
+      <w:pPr>
+        <w:ind w:left="6480" w:hanging="360"/>
+      </w:pPr>
     </w:lvl>
   </w:abstractNum>
   <w:num w:numId="1000">
@@ -24696,15 +25673,75 @@
     </w:lvlOverride>
   </w:num>
   <w:num w:numId="1004">
-    <w:abstractNumId w:val="991"/>
+    <w:abstractNumId w:val="99711"/>
+    <w:lvlOverride w:ilvl="0">
+      <w:startOverride w:val="1"/>
+    </w:lvlOverride>
+    <w:lvlOverride w:ilvl="1">
+      <w:startOverride w:val="1"/>
+    </w:lvlOverride>
+    <w:lvlOverride w:ilvl="2">
+      <w:startOverride w:val="1"/>
+    </w:lvlOverride>
+    <w:lvlOverride w:ilvl="3">
+      <w:startOverride w:val="1"/>
+    </w:lvlOverride>
+    <w:lvlOverride w:ilvl="4">
+      <w:startOverride w:val="1"/>
+    </w:lvlOverride>
+    <w:lvlOverride w:ilvl="5">
+      <w:startOverride w:val="1"/>
+    </w:lvlOverride>
+    <w:lvlOverride w:ilvl="6">
+      <w:startOverride w:val="1"/>
+    </w:lvlOverride>
+    <w:lvlOverride w:ilvl="7">
+      <w:startOverride w:val="1"/>
+    </w:lvlOverride>
+    <w:lvlOverride w:ilvl="8">
+      <w:startOverride w:val="1"/>
+    </w:lvlOverride>
   </w:num>
   <w:num w:numId="1005">
-    <w:abstractNumId w:val="991"/>
+    <w:abstractNumId w:val="99411"/>
+    <w:lvlOverride w:ilvl="0">
+      <w:startOverride w:val="1"/>
+    </w:lvlOverride>
+    <w:lvlOverride w:ilvl="1">
+      <w:startOverride w:val="1"/>
+    </w:lvlOverride>
+    <w:lvlOverride w:ilvl="2">
+      <w:startOverride w:val="1"/>
+    </w:lvlOverride>
+    <w:lvlOverride w:ilvl="3">
+      <w:startOverride w:val="1"/>
+    </w:lvlOverride>
+    <w:lvlOverride w:ilvl="4">
+      <w:startOverride w:val="1"/>
+    </w:lvlOverride>
+    <w:lvlOverride w:ilvl="5">
+      <w:startOverride w:val="1"/>
+    </w:lvlOverride>
+    <w:lvlOverride w:ilvl="6">
+      <w:startOverride w:val="1"/>
+    </w:lvlOverride>
+    <w:lvlOverride w:ilvl="7">
+      <w:startOverride w:val="1"/>
+    </w:lvlOverride>
+    <w:lvlOverride w:ilvl="8">
+      <w:startOverride w:val="1"/>
+    </w:lvlOverride>
   </w:num>
   <w:num w:numId="1006">
     <w:abstractNumId w:val="991"/>
   </w:num>
   <w:num w:numId="1007">
+    <w:abstractNumId w:val="991"/>
+  </w:num>
+  <w:num w:numId="1008">
+    <w:abstractNumId w:val="991"/>
+  </w:num>
+  <w:num w:numId="1009">
     <w:abstractNumId w:val="991"/>
   </w:num>
 </w:numbering>

</xml_diff>

<commit_message>
docs(fds): revision history reordered newest-at-top + entries trimmed
Per Jacques 2026-04-27: the prior table mixed orderings (entries
0.1–0.7 chronological, 0.11i–0.8 reverse) which made the latest
entry hard to find — reading top-to-bottom your eye landed on
v0.8 (2026-04-21) at the bottom of the table thinking it was the
latest, when v0.11i (2026-04-27) was actually the head.

Fixes:
- All 19 entries reordered newest-at-top, uniform throughout.
- Each entry trimmed to: § section(s) — driver/topic. FDS-XX-NNN
  req IDs created or rewritten. Companion data model / OIR / ERD
  versions where applicable. No more multi-paragraph prose.
- One-line orienting note added above the table describing the
  format.

No FDS body content changes — only the revision history table
shape. Same convention to be propagated to Data Model + OIR in a
follow-up pass.
</commit_message>
<xml_diff>
--- a/MPP_MES_FDS.docx
+++ b/MPP_MES_FDS.docx
@@ -123,6 +123,30 @@
       </w:pPr>
       <w:r>
         <w:t xml:space="preserve">Revision History</w:t>
+      </w:r>
+    </w:p>
+    <w:p>
+      <w:pPr>
+        <w:pStyle w:val="BlockText"/>
+      </w:pPr>
+      <w:r>
+        <w:t xml:space="preserve">Newest at top. Each entry:</w:t>
+      </w:r>
+      <w:r>
+        <w:t xml:space="preserve"> </w:t>
+      </w:r>
+      <w:r>
+        <w:rPr>
+          <w:b/>
+          <w:bCs/>
+        </w:rPr>
+        <w:t xml:space="preserve">§ section(s) — driver/topic.</w:t>
+      </w:r>
+      <w:r>
+        <w:t xml:space="preserve"> </w:t>
+      </w:r>
+      <w:r>
+        <w:t xml:space="preserve">Specific FDS-XX-NNN req IDs created or rewritten. Companion data model / OIR / ERD versions where applicable.</w:t>
       </w:r>
     </w:p>
     <w:tbl>
@@ -231,18 +255,18 @@
               <w:pStyle w:val="Compact"/>
             </w:pPr>
             <w:r>
-              <w:t xml:space="preserve">0.1</w:t>
-            </w:r>
-          </w:p>
-        </w:tc>
-        <w:tc>
-          <w:tcPr/>
-          <w:p>
-            <w:pPr>
-              <w:pStyle w:val="Compact"/>
-            </w:pPr>
-            <w:r>
-              <w:t xml:space="preserve">2026-04-06</w:t>
+              <w:t xml:space="preserve">0.11i</w:t>
+            </w:r>
+          </w:p>
+        </w:tc>
+        <w:tc>
+          <w:tcPr/>
+          <w:p>
+            <w:pPr>
+              <w:pStyle w:val="Compact"/>
+            </w:pPr>
+            <w:r>
+              <w:t xml:space="preserve">2026-04-27</w:t>
             </w:r>
           </w:p>
         </w:tc>
@@ -258,401 +282,6 @@
           </w:p>
         </w:tc>
         <w:tc>
-          <w:tcPr/>
-          <w:p>
-            <w:pPr>
-              <w:pStyle w:val="Compact"/>
-            </w:pPr>
-            <w:r>
-              <w:t xml:space="preserve">Initial working draft — front matter, architecture, plant model, master data</w:t>
-            </w:r>
-          </w:p>
-        </w:tc>
-      </w:tr>
-      <w:tr>
-        <w:tc>
-          <w:tcPr>
-            <w:shd w:val="clear" w:color="auto" w:fill="F2F2F2"/>
-          </w:tcPr>
-          <w:tcPr/>
-          <w:p>
-            <w:pPr>
-              <w:pStyle w:val="Compact"/>
-            </w:pPr>
-            <w:r>
-              <w:t xml:space="preserve">0.2</w:t>
-            </w:r>
-          </w:p>
-        </w:tc>
-        <w:tc>
-          <w:tcPr>
-            <w:shd w:val="clear" w:color="auto" w:fill="F2F2F2"/>
-          </w:tcPr>
-          <w:tcPr/>
-          <w:p>
-            <w:pPr>
-              <w:pStyle w:val="Compact"/>
-            </w:pPr>
-            <w:r>
-              <w:t xml:space="preserve">2026-04-09</w:t>
-            </w:r>
-          </w:p>
-        </w:tc>
-        <w:tc>
-          <w:tcPr>
-            <w:shd w:val="clear" w:color="auto" w:fill="F2F2F2"/>
-          </w:tcPr>
-          <w:tcPr/>
-          <w:p>
-            <w:pPr>
-              <w:pStyle w:val="Compact"/>
-            </w:pPr>
-            <w:r>
-              <w:t xml:space="preserve">Blue Ridge Automation</w:t>
-            </w:r>
-          </w:p>
-        </w:tc>
-        <w:tc>
-          <w:tcPr>
-            <w:shd w:val="clear" w:color="auto" w:fill="F2F2F2"/>
-          </w:tcPr>
-          <w:tcPr/>
-          <w:p>
-            <w:pPr>
-              <w:pStyle w:val="Compact"/>
-            </w:pPr>
-            <w:r>
-              <w:t xml:space="preserve">Propagated OI/UJ design decisions. Resolved OI-01 (no outbox), OI-08 (shared terminals as location type), OI-09 (one part at a time). Updated §1.4/1.6 (direct calls + logging), §2.5 (terminal as location type, machine barcode scan), §3.6 (closed OI-09), §4.2 (5-min timeout session model), §5.4 (auto-split into 2 sublots), §5.5 (configurable merge rules), §6.3 (warm-up as downtime), §6.5 (interlock bypass flag), §6.6 (scale feedback), §6.10 (WO MVP-lite), §10.3 (vision auto-hold + override). Added FRS references to OI register.</w:t>
-            </w:r>
-          </w:p>
-        </w:tc>
-      </w:tr>
-      <w:tr>
-        <w:tc>
-          <w:tcPr/>
-          <w:p>
-            <w:pPr>
-              <w:pStyle w:val="Compact"/>
-            </w:pPr>
-            <w:r>
-              <w:t xml:space="preserve">0.3</w:t>
-            </w:r>
-          </w:p>
-        </w:tc>
-        <w:tc>
-          <w:tcPr/>
-          <w:p>
-            <w:pPr>
-              <w:pStyle w:val="Compact"/>
-            </w:pPr>
-            <w:r>
-              <w:t xml:space="preserve">2026-04-09</w:t>
-            </w:r>
-          </w:p>
-        </w:tc>
-        <w:tc>
-          <w:tcPr/>
-          <w:p>
-            <w:pPr>
-              <w:pStyle w:val="Compact"/>
-            </w:pPr>
-            <w:r>
-              <w:t xml:space="preserve">Blue Ridge Automation</w:t>
-            </w:r>
-          </w:p>
-        </w:tc>
-        <w:tc>
-          <w:tcPr/>
-          <w:p>
-            <w:pPr>
-              <w:pStyle w:val="Compact"/>
-            </w:pPr>
-            <w:r>
-              <w:t xml:space="preserve">Naming convention changed from snake_case to UpperCamelCase for all DB identifiers (tables, columns, code values). Merged Department into Area per ISA-95 — Department location type removed, 5 departments become Area-type locations. Added Enterprise (level 0) to hierarchy. Updated §2.2 (FDS-02-001) hierarchy table, §2.3 (FDS-02-003), all defect/downtime filtering references.</w:t>
-            </w:r>
-          </w:p>
-        </w:tc>
-      </w:tr>
-      <w:tr>
-        <w:tc>
-          <w:tcPr>
-            <w:shd w:val="clear" w:color="auto" w:fill="F2F2F2"/>
-          </w:tcPr>
-          <w:tcPr/>
-          <w:p>
-            <w:pPr>
-              <w:pStyle w:val="Compact"/>
-            </w:pPr>
-            <w:r>
-              <w:t xml:space="preserve">0.4</w:t>
-            </w:r>
-          </w:p>
-        </w:tc>
-        <w:tc>
-          <w:tcPr>
-            <w:shd w:val="clear" w:color="auto" w:fill="F2F2F2"/>
-          </w:tcPr>
-          <w:tcPr/>
-          <w:p>
-            <w:pPr>
-              <w:pStyle w:val="Compact"/>
-            </w:pPr>
-            <w:r>
-              <w:t xml:space="preserve">2026-04-10</w:t>
-            </w:r>
-          </w:p>
-        </w:tc>
-        <w:tc>
-          <w:tcPr>
-            <w:shd w:val="clear" w:color="auto" w:fill="F2F2F2"/>
-          </w:tcPr>
-          <w:tcPr/>
-          <w:p>
-            <w:pPr>
-              <w:pStyle w:val="Compact"/>
-            </w:pPr>
-            <w:r>
-              <w:t xml:space="preserve">Blue Ridge Automation</w:t>
-            </w:r>
-          </w:p>
-        </w:tc>
-        <w:tc>
-          <w:tcPr>
-            <w:shd w:val="clear" w:color="auto" w:fill="F2F2F2"/>
-          </w:tcPr>
-          <w:tcPr/>
-          <w:p>
-            <w:pPr>
-              <w:pStyle w:val="Compact"/>
-            </w:pPr>
-            <w:r>
-              <w:t xml:space="preserve">Major restructure of location model: split</w:t>
-            </w:r>
-            <w:r>
-              <w:t xml:space="preserve"> </w:t>
-            </w:r>
-            <w:r>
-              <w:rPr>
-                <w:rStyle w:val="VerbatimChar"/>
-              </w:rPr>
-              <w:t xml:space="preserve">LocationType</w:t>
-            </w:r>
-            <w:r>
-              <w:t xml:space="preserve"> </w:t>
-            </w:r>
-            <w:r>
-              <w:t xml:space="preserve">(5 ISA-95 tiers) from</w:t>
-            </w:r>
-            <w:r>
-              <w:t xml:space="preserve"> </w:t>
-            </w:r>
-            <w:r>
-              <w:rPr>
-                <w:rStyle w:val="VerbatimChar"/>
-              </w:rPr>
-              <w:t xml:space="preserve">LocationTypeDefinition</w:t>
-            </w:r>
-            <w:r>
-              <w:t xml:space="preserve"> </w:t>
-            </w:r>
-            <w:r>
-              <w:t xml:space="preserve">(polymorphic kinds) and introduced</w:t>
-            </w:r>
-            <w:r>
-              <w:t xml:space="preserve"> </w:t>
-            </w:r>
-            <w:r>
-              <w:rPr>
-                <w:rStyle w:val="VerbatimChar"/>
-              </w:rPr>
-              <w:t xml:space="preserve">LocationAttributeDefinition</w:t>
-            </w:r>
-            <w:r>
-              <w:t xml:space="preserve"> </w:t>
-            </w:r>
-            <w:r>
-              <w:t xml:space="preserve">for attribute schemas per kind. Terminal, DieCastMachine, CNCMachine, InventoryLocation, etc. are now</w:t>
-            </w:r>
-            <w:r>
-              <w:t xml:space="preserve"> </w:t>
-            </w:r>
-            <w:r>
-              <w:rPr>
-                <w:rStyle w:val="VerbatimChar"/>
-              </w:rPr>
-              <w:t xml:space="preserve">LocationTypeDefinition</w:t>
-            </w:r>
-            <w:r>
-              <w:t xml:space="preserve"> </w:t>
-            </w:r>
-            <w:r>
-              <w:t xml:space="preserve">rows under the</w:t>
-            </w:r>
-            <w:r>
-              <w:t xml:space="preserve"> </w:t>
-            </w:r>
-            <w:r>
-              <w:rPr>
-                <w:rStyle w:val="VerbatimChar"/>
-              </w:rPr>
-              <w:t xml:space="preserve">Cell</w:t>
-            </w:r>
-            <w:r>
-              <w:t xml:space="preserve"> </w:t>
-            </w:r>
-            <w:r>
-              <w:t xml:space="preserve">type. Rewrote §2.1–2.5. Added §5.3 FDS-05-008 explicit login→scan-location→scan-lot movement workflow. Updated FDS-05-004 and FDS-05-020 to clarify Die Cast uses pre-printed LTTs (no Initial print event). Expanded FDS-06-019 with Pattern A (inline reject) vs Pattern B (split-to-scrap) scrap handling. Added FDS-07-019 clarifying Sort Cage is NOT a LOT merge event. Added bordered + alternating row Word table styling via pandoc reference doc.</w:t>
-            </w:r>
-          </w:p>
-        </w:tc>
-      </w:tr>
-      <w:tr>
-        <w:tc>
-          <w:tcPr/>
-          <w:p>
-            <w:pPr>
-              <w:pStyle w:val="Compact"/>
-            </w:pPr>
-            <w:r>
-              <w:t xml:space="preserve">0.5</w:t>
-            </w:r>
-          </w:p>
-        </w:tc>
-        <w:tc>
-          <w:tcPr/>
-          <w:p>
-            <w:pPr>
-              <w:pStyle w:val="Compact"/>
-            </w:pPr>
-            <w:r>
-              <w:t xml:space="preserve">2026-04-10</w:t>
-            </w:r>
-          </w:p>
-        </w:tc>
-        <w:tc>
-          <w:tcPr/>
-          <w:p>
-            <w:pPr>
-              <w:pStyle w:val="Compact"/>
-            </w:pPr>
-            <w:r>
-              <w:t xml:space="preserve">Blue Ridge Automation</w:t>
-            </w:r>
-          </w:p>
-        </w:tc>
-        <w:tc>
-          <w:tcPr/>
-          <w:p>
-            <w:pPr>
-              <w:pStyle w:val="Compact"/>
-            </w:pPr>
-            <w:r>
-              <w:t xml:space="preserve">§11 Audit &amp; Logging expanded: added fourth log stream</w:t>
-            </w:r>
-            <w:r>
-              <w:t xml:space="preserve"> </w:t>
-            </w:r>
-            <w:r>
-              <w:rPr>
-                <w:rStyle w:val="VerbatimChar"/>
-              </w:rPr>
-              <w:t xml:space="preserve">Audit.FailureLog</w:t>
-            </w:r>
-            <w:r>
-              <w:t xml:space="preserve"> </w:t>
-            </w:r>
-            <w:r>
-              <w:t xml:space="preserve">for attempted-but-rejected operations (new FDS-11-004). High-Fidelity Interface Logging renumbered from FDS-11-004 to FDS-11-005 to make room. Added FDS-11-008 documenting the code-string signatures for the four shared audit procs. Renumbered FDS-11-007 → FDS-11-009 (Retention Policy) and FDS-11-008 → FDS-11-010 (BIGINT Primary Keys) to accommodate. Normalized vocabulary examples in FDS-11-006/007 updated to UpperCamelCase (</w:t>
-            </w:r>
-            <w:r>
-              <w:rPr>
-                <w:rStyle w:val="VerbatimChar"/>
-              </w:rPr>
-              <w:t xml:space="preserve">Created</w:t>
-            </w:r>
-            <w:r>
-              <w:t xml:space="preserve">/</w:t>
-            </w:r>
-            <w:r>
-              <w:rPr>
-                <w:rStyle w:val="VerbatimChar"/>
-              </w:rPr>
-              <w:t xml:space="preserve">Updated</w:t>
-            </w:r>
-            <w:r>
-              <w:t xml:space="preserve">/</w:t>
-            </w:r>
-            <w:r>
-              <w:rPr>
-                <w:rStyle w:val="VerbatimChar"/>
-              </w:rPr>
-              <w:t xml:space="preserve">Deprecated</w:t>
-            </w:r>
-            <w:r>
-              <w:t xml:space="preserve">/</w:t>
-            </w:r>
-            <w:r>
-              <w:rPr>
-                <w:rStyle w:val="VerbatimChar"/>
-              </w:rPr>
-              <w:t xml:space="preserve">LotCreated</w:t>
-            </w:r>
-            <w:r>
-              <w:t xml:space="preserve"> </w:t>
-            </w:r>
-            <w:r>
-              <w:t xml:space="preserve">etc. instead of UPPER_SNAKE).</w:t>
-            </w:r>
-          </w:p>
-        </w:tc>
-      </w:tr>
-      <w:tr>
-        <w:tc>
-          <w:tcPr>
-            <w:shd w:val="clear" w:color="auto" w:fill="F2F2F2"/>
-          </w:tcPr>
-          <w:tcPr/>
-          <w:p>
-            <w:pPr>
-              <w:pStyle w:val="Compact"/>
-            </w:pPr>
-            <w:r>
-              <w:t xml:space="preserve">0.7</w:t>
-            </w:r>
-          </w:p>
-        </w:tc>
-        <w:tc>
-          <w:tcPr>
-            <w:shd w:val="clear" w:color="auto" w:fill="F2F2F2"/>
-          </w:tcPr>
-          <w:tcPr/>
-          <w:p>
-            <w:pPr>
-              <w:pStyle w:val="Compact"/>
-            </w:pPr>
-            <w:r>
-              <w:t xml:space="preserve">2026-04-15</w:t>
-            </w:r>
-          </w:p>
-        </w:tc>
-        <w:tc>
-          <w:tcPr>
-            <w:shd w:val="clear" w:color="auto" w:fill="F2F2F2"/>
-          </w:tcPr>
-          <w:tcPr/>
-          <w:p>
-            <w:pPr>
-              <w:pStyle w:val="Compact"/>
-            </w:pPr>
-            <w:r>
-              <w:t xml:space="preserve">Blue Ridge Automation</w:t>
-            </w:r>
-          </w:p>
-        </w:tc>
-        <w:tc>
-          <w:tcPr>
-            <w:shd w:val="clear" w:color="auto" w:fill="F2F2F2"/>
-          </w:tcPr>
           <w:tcPr/>
           <w:p>
             <w:pPr>
@@ -663,373 +292,19 @@
                 <w:b/>
                 <w:bCs/>
               </w:rPr>
-              <w:t xml:space="preserve">Production data collection capture.</w:t>
+              <w:t xml:space="preserve">§7.2, §7.4 — UJ-04 AIM Shipper ID local pool.</w:t>
             </w:r>
             <w:r>
               <w:t xml:space="preserve"> </w:t>
             </w:r>
             <w:r>
-              <w:t xml:space="preserve">Closed a gap where</w:t>
-            </w:r>
-            <w:r>
-              <w:t xml:space="preserve"> </w:t>
-            </w:r>
-            <w:r>
-              <w:rPr>
-                <w:rStyle w:val="VerbatimChar"/>
-              </w:rPr>
-              <w:t xml:space="preserve">OperationTemplate</w:t>
-            </w:r>
-            <w:r>
-              <w:t xml:space="preserve"> </w:t>
-            </w:r>
-            <w:r>
-              <w:t xml:space="preserve">+</w:t>
-            </w:r>
-            <w:r>
-              <w:t xml:space="preserve"> </w:t>
-            </w:r>
-            <w:r>
-              <w:rPr>
-                <w:rStyle w:val="VerbatimChar"/>
-              </w:rPr>
-              <w:t xml:space="preserve">OperationTemplateField</w:t>
-            </w:r>
-            <w:r>
-              <w:t xml:space="preserve"> </w:t>
-            </w:r>
-            <w:r>
-              <w:t xml:space="preserve">+</w:t>
-            </w:r>
-            <w:r>
-              <w:t xml:space="preserve"> </w:t>
-            </w:r>
-            <w:r>
-              <w:rPr>
-                <w:rStyle w:val="VerbatimChar"/>
-              </w:rPr>
-              <w:t xml:space="preserve">DataCollectionField</w:t>
-            </w:r>
-            <w:r>
-              <w:t xml:space="preserve"> </w:t>
-            </w:r>
-            <w:r>
-              <w:t xml:space="preserve">defined</w:t>
-            </w:r>
-            <w:r>
-              <w:t xml:space="preserve"> </w:t>
-            </w:r>
-            <w:r>
-              <w:rPr>
-                <w:i/>
-                <w:iCs/>
-              </w:rPr>
-              <w:t xml:space="preserve">what</w:t>
-            </w:r>
-            <w:r>
-              <w:t xml:space="preserve"> </w:t>
-            </w:r>
-            <w:r>
-              <w:t xml:space="preserve">to collect but nothing persisted</w:t>
-            </w:r>
-            <w:r>
-              <w:t xml:space="preserve"> </w:t>
-            </w:r>
-            <w:r>
-              <w:rPr>
-                <w:i/>
-                <w:iCs/>
-              </w:rPr>
-              <w:t xml:space="preserve">what was actually collected</w:t>
-            </w:r>
-            <w:r>
-              <w:t xml:space="preserve"> </w:t>
-            </w:r>
-            <w:r>
-              <w:t xml:space="preserve">when a LOT passed through. Updated §3.4 (FDS-03-012 operation-template definition — replaced stale</w:t>
-            </w:r>
-            <w:r>
-              <w:t xml:space="preserve"> </w:t>
-            </w:r>
-            <w:r>
-              <w:rPr>
-                <w:rStyle w:val="VerbatimChar"/>
-              </w:rPr>
-              <w:t xml:space="preserve">Collects*</w:t>
-            </w:r>
-            <w:r>
-              <w:t xml:space="preserve">/</w:t>
-            </w:r>
-            <w:r>
-              <w:rPr>
-                <w:rStyle w:val="VerbatimChar"/>
-              </w:rPr>
-              <w:t xml:space="preserve">Requires*</w:t>
-            </w:r>
-            <w:r>
-              <w:t xml:space="preserve"> </w:t>
-            </w:r>
-            <w:r>
-              <w:t xml:space="preserve">BIT-flag table with the</w:t>
-            </w:r>
-            <w:r>
-              <w:t xml:space="preserve"> </w:t>
-            </w:r>
-            <w:r>
-              <w:rPr>
-                <w:rStyle w:val="VerbatimChar"/>
-              </w:rPr>
-              <w:t xml:space="preserve">OperationTemplateField</w:t>
-            </w:r>
-            <w:r>
-              <w:t xml:space="preserve"> </w:t>
-            </w:r>
-            <w:r>
-              <w:t xml:space="preserve">→</w:t>
-            </w:r>
-            <w:r>
-              <w:t xml:space="preserve"> </w:t>
-            </w:r>
-            <w:r>
-              <w:rPr>
-                <w:rStyle w:val="VerbatimChar"/>
-              </w:rPr>
-              <w:t xml:space="preserve">DataCollectionField</w:t>
-            </w:r>
-            <w:r>
-              <w:t xml:space="preserve"> </w:t>
-            </w:r>
-            <w:r>
-              <w:t xml:space="preserve">junction wording that matches data model rev 0.7+). Updated §6.2 (FDS-06-001 die cast screen — now driven by</w:t>
-            </w:r>
-            <w:r>
-              <w:t xml:space="preserve"> </w:t>
-            </w:r>
-            <w:r>
-              <w:rPr>
-                <w:rStyle w:val="VerbatimChar"/>
-              </w:rPr>
-              <w:t xml:space="preserve">OperationTemplateField</w:t>
-            </w:r>
-            <w:r>
-              <w:t xml:space="preserve"> </w:t>
-            </w:r>
-            <w:r>
-              <w:t xml:space="preserve">rows rather than flags) and FDS-06-003 (die cast production event — now captures</w:t>
-            </w:r>
-            <w:r>
-              <w:t xml:space="preserve"> </w:t>
-            </w:r>
-            <w:r>
-              <w:rPr>
-                <w:rStyle w:val="VerbatimChar"/>
-              </w:rPr>
-              <w:t xml:space="preserve">OperationTemplateId</w:t>
-            </w:r>
-            <w:r>
-              <w:t xml:space="preserve">,</w:t>
-            </w:r>
-            <w:r>
-              <w:t xml:space="preserve"> </w:t>
-            </w:r>
-            <w:r>
-              <w:rPr>
-                <w:rStyle w:val="VerbatimChar"/>
-              </w:rPr>
-              <w:t xml:space="preserve">DieIdentifier</w:t>
-            </w:r>
-            <w:r>
-              <w:t xml:space="preserve">,</w:t>
-            </w:r>
-            <w:r>
-              <w:t xml:space="preserve"> </w:t>
-            </w:r>
-            <w:r>
-              <w:rPr>
-                <w:rStyle w:val="VerbatimChar"/>
-              </w:rPr>
-              <w:t xml:space="preserve">CavityNumber</w:t>
-            </w:r>
-            <w:r>
-              <w:t xml:space="preserve">,</w:t>
-            </w:r>
-            <w:r>
-              <w:t xml:space="preserve"> </w:t>
-            </w:r>
-            <w:r>
-              <w:rPr>
-                <w:rStyle w:val="VerbatimChar"/>
-              </w:rPr>
-              <w:t xml:space="preserve">WeightValue</w:t>
-            </w:r>
-            <w:r>
-              <w:t xml:space="preserve">/</w:t>
-            </w:r>
-            <w:r>
-              <w:rPr>
-                <w:rStyle w:val="VerbatimChar"/>
-              </w:rPr>
-              <w:t xml:space="preserve">WeightUomId</w:t>
-            </w:r>
-            <w:r>
-              <w:t xml:space="preserve"> </w:t>
-            </w:r>
-            <w:r>
-              <w:t xml:space="preserve">as hot columns plus N</w:t>
-            </w:r>
-            <w:r>
-              <w:t xml:space="preserve"> </w:t>
-            </w:r>
-            <w:r>
-              <w:rPr>
-                <w:rStyle w:val="VerbatimChar"/>
-              </w:rPr>
-              <w:t xml:space="preserve">ProductionEventValue</w:t>
-            </w:r>
-            <w:r>
-              <w:t xml:space="preserve"> </w:t>
-            </w:r>
-            <w:r>
-              <w:t xml:space="preserve">children for any other configured field). Added new FDS-03-017a specifying how the Perspective screen resolves operation-template fields into inputs and writes the header+children transactionally. Data model aligned at v1.4 (new</w:t>
-            </w:r>
-            <w:r>
-              <w:t xml:space="preserve"> </w:t>
-            </w:r>
-            <w:r>
-              <w:rPr>
-                <w:rStyle w:val="VerbatimChar"/>
-              </w:rPr>
-              <w:t xml:space="preserve">Workorder.ProductionEventValue</w:t>
-            </w:r>
-            <w:r>
-              <w:t xml:space="preserve"> </w:t>
-            </w:r>
-            <w:r>
-              <w:t xml:space="preserve">table +</w:t>
-            </w:r>
-            <w:r>
-              <w:t xml:space="preserve"> </w:t>
-            </w:r>
-            <w:r>
-              <w:rPr>
-                <w:rStyle w:val="VerbatimChar"/>
-              </w:rPr>
-              <w:t xml:space="preserve">ProductionEvent</w:t>
-            </w:r>
-            <w:r>
-              <w:t xml:space="preserve"> </w:t>
-            </w:r>
-            <w:r>
-              <w:t xml:space="preserve">extensions).</w:t>
+              <w:t xml:space="preserve">FDS-07-005 rewritten, FDS-07-008 amended, FDS-07-010 rewritten; FDS-07-010a/b/c NEW. Data Model v1.9h.</w:t>
             </w:r>
           </w:p>
         </w:tc>
       </w:tr>
       <w:tr>
         <w:tc>
-          <w:tcPr/>
-          <w:p>
-            <w:pPr>
-              <w:pStyle w:val="Compact"/>
-            </w:pPr>
-            <w:r>
-              <w:t xml:space="preserve">0.6</w:t>
-            </w:r>
-          </w:p>
-        </w:tc>
-        <w:tc>
-          <w:tcPr/>
-          <w:p>
-            <w:pPr>
-              <w:pStyle w:val="Compact"/>
-            </w:pPr>
-            <w:r>
-              <w:t xml:space="preserve">2026-04-15</w:t>
-            </w:r>
-          </w:p>
-        </w:tc>
-        <w:tc>
-          <w:tcPr/>
-          <w:p>
-            <w:pPr>
-              <w:pStyle w:val="Compact"/>
-            </w:pPr>
-            <w:r>
-              <w:t xml:space="preserve">Blue Ridge Automation</w:t>
-            </w:r>
-          </w:p>
-        </w:tc>
-        <w:tc>
-          <w:tcPr/>
-          <w:p>
-            <w:pPr>
-              <w:pStyle w:val="Compact"/>
-            </w:pPr>
-            <w:r>
-              <w:t xml:space="preserve">Reflects Phase 5/6 SQL completion and the Ignition JDBC stored-procedure convention change. Data model realigned to v1.3: added HoldEvent place/release lifecycle table, SortOrder + MoveUp/MoveDown pattern on</w:t>
-            </w:r>
-            <w:r>
-              <w:t xml:space="preserve"> </w:t>
-            </w:r>
-            <w:r>
-              <w:rPr>
-                <w:rStyle w:val="VerbatimChar"/>
-              </w:rPr>
-              <w:t xml:space="preserve">Location.Location</w:t>
-            </w:r>
-            <w:r>
-              <w:t xml:space="preserve">, OperationTemplate→DataCollectionField junction (replacing hardcoded BIT flags), and seven new code tables backing all former enum/status columns. Versioning pattern for RouteTemplate, OperationTemplate, and Bom standardized on the three-state</w:t>
-            </w:r>
-            <w:r>
-              <w:t xml:space="preserve"> </w:t>
-            </w:r>
-            <w:r>
-              <w:rPr>
-                <w:rStyle w:val="VerbatimChar"/>
-              </w:rPr>
-              <w:t xml:space="preserve">Draft / Published / Deprecated</w:t>
-            </w:r>
-            <w:r>
-              <w:t xml:space="preserve"> </w:t>
-            </w:r>
-            <w:r>
-              <w:t xml:space="preserve">model (PublishedAt + DeprecatedAt). Added FDS-11-011 documenting the Ignition JDBC single-result-set convention: stored procedures SHALL NOT use</w:t>
-            </w:r>
-            <w:r>
-              <w:t xml:space="preserve"> </w:t>
-            </w:r>
-            <w:r>
-              <w:rPr>
-                <w:rStyle w:val="VerbatimChar"/>
-              </w:rPr>
-              <w:t xml:space="preserve">OUTPUT</w:t>
-            </w:r>
-            <w:r>
-              <w:t xml:space="preserve"> </w:t>
-            </w:r>
-            <w:r>
-              <w:t xml:space="preserve">parameters; mutation procs SHALL return</w:t>
-            </w:r>
-            <w:r>
-              <w:t xml:space="preserve"> </w:t>
-            </w:r>
-            <w:r>
-              <w:rPr>
-                <w:rStyle w:val="VerbatimChar"/>
-              </w:rPr>
-              <w:t xml:space="preserve">SELECT Status, Message, NewId</w:t>
-            </w:r>
-            <w:r>
-              <w:t xml:space="preserve"> </w:t>
-            </w:r>
-            <w:r>
-              <w:t xml:space="preserve">as their sole result set, read procs SHALL return a single result set (empty = not found), and the four shared audit writers SHALL emit no result set (they run inside caller transactions and would otherwise break INSERT-EXEC with ROLLBACK).</w:t>
-            </w:r>
-          </w:p>
-        </w:tc>
-      </w:tr>
-      <w:tr>
-        <w:tc>
           <w:tcPr>
             <w:shd w:val="clear" w:color="auto" w:fill="F2F2F2"/>
           </w:tcPr>
@@ -1039,7 +314,7 @@
               <w:pStyle w:val="Compact"/>
             </w:pPr>
             <w:r>
-              <w:t xml:space="preserve">0.11i</w:t>
+              <w:t xml:space="preserve">0.11h</w:t>
             </w:r>
           </w:p>
         </w:tc>
@@ -1085,249 +360,478 @@
                 <w:b/>
                 <w:bCs/>
               </w:rPr>
-              <w:t xml:space="preserve">§7.2 / §7.4 UJ-04 — AIM Shipper ID local pool (zero-latency container closure).</w:t>
+              <w:t xml:space="preserve">§5.3 — OI-21 Pausable LOT at Workstation.</w:t>
             </w:r>
             <w:r>
               <w:t xml:space="preserve"> </w:t>
             </w:r>
             <w:r>
-              <w:t xml:space="preserve">Per Jacques’s 2026-04-27 design lock:</w:t>
-            </w:r>
-            <w:r>
-              <w:t xml:space="preserve"> </w:t>
-            </w:r>
-            <w:r>
-              <w:rPr>
-                <w:rStyle w:val="VerbatimChar"/>
-              </w:rPr>
-              <w:t xml:space="preserve">Container_Complete</w:t>
-            </w:r>
-            <w:r>
-              <w:t xml:space="preserve"> </w:t>
-            </w:r>
-            <w:r>
-              <w:t xml:space="preserve">SHALL claim a pre-fetched AIM Shipper ID from a local FIFO pool synchronously inside its own transaction — never inline call to AIM, never deferred async assignment. AIM Shipper IDs attach to Containers only (never sub-assemblies). Empty pool =</w:t>
-            </w:r>
-            <w:r>
-              <w:t xml:space="preserve"> </w:t>
-            </w:r>
+              <w:t xml:space="preserve">FDS-05-038 NEW. Data Model v1.9g.</w:t>
+            </w:r>
+          </w:p>
+        </w:tc>
+      </w:tr>
+      <w:tr>
+        <w:tc>
+          <w:tcPr/>
+          <w:p>
+            <w:pPr>
+              <w:pStyle w:val="Compact"/>
+            </w:pPr>
+            <w:r>
+              <w:t xml:space="preserve">0.11g</w:t>
+            </w:r>
+          </w:p>
+        </w:tc>
+        <w:tc>
+          <w:tcPr/>
+          <w:p>
+            <w:pPr>
+              <w:pStyle w:val="Compact"/>
+            </w:pPr>
+            <w:r>
+              <w:t xml:space="preserve">2026-04-24</w:t>
+            </w:r>
+          </w:p>
+        </w:tc>
+        <w:tc>
+          <w:tcPr/>
+          <w:p>
+            <w:pPr>
+              <w:pStyle w:val="Compact"/>
+            </w:pPr>
+            <w:r>
+              <w:t xml:space="preserve">Blue Ridge Automation</w:t>
+            </w:r>
+          </w:p>
+        </w:tc>
+        <w:tc>
+          <w:tcPr/>
+          <w:p>
+            <w:pPr>
+              <w:pStyle w:val="Compact"/>
+            </w:pPr>
             <w:r>
               <w:rPr>
                 <w:b/>
                 <w:bCs/>
               </w:rPr>
-              <w:t xml:space="preserve">hard fail</w:t>
-            </w:r>
-            <w:r>
-              <w:t xml:space="preserve">:</w:t>
+              <w:t xml:space="preserve">§6.10 — OI-16 PLC confirm + RequiresCompletionConfirm LocationAttribute.</w:t>
             </w:r>
             <w:r>
               <w:t xml:space="preserve"> </w:t>
             </w:r>
             <w:r>
-              <w:rPr>
-                <w:rStyle w:val="VerbatimChar"/>
-              </w:rPr>
-              <w:t xml:space="preserve">Container_Complete</w:t>
-            </w:r>
-            <w:r>
-              <w:t xml:space="preserve"> </w:t>
-            </w:r>
-            <w:r>
-              <w:t xml:space="preserve">rejects, operator sees error, line stops. Pool topup is a background Gateway timer script that calls</w:t>
-            </w:r>
-            <w:r>
-              <w:t xml:space="preserve"> </w:t>
-            </w:r>
-            <w:r>
-              <w:rPr>
-                <w:rStyle w:val="VerbatimChar"/>
-              </w:rPr>
-              <w:t xml:space="preserve">AIM.GetNextNumber</w:t>
-            </w:r>
-            <w:r>
-              <w:t xml:space="preserve"> </w:t>
-            </w:r>
-            <w:r>
-              <w:t xml:space="preserve">to refill toward a configurable target depth (default 50) when below the topup threshold (default 30). Two new threshold-driven escalations: warning at depth &lt; 20 (supervisor wallboard tile), critical at depth &lt; 10 (supervisor alarm + IT notification). Once consumed, an AIM Shipper ID NEVER returns to the pool — Honda treats every issued ID as permanently consumed; voided / re-packed containers draw a fresh ID. Honda does not expire IDs; no TTL handling needed.</w:t>
-            </w:r>
-            <w:r>
-              <w:t xml:space="preserve"> </w:t>
-            </w:r>
+              <w:t xml:space="preserve">FDS-06-028 extended. Data Model v1.9f.</w:t>
+            </w:r>
+          </w:p>
+        </w:tc>
+      </w:tr>
+      <w:tr>
+        <w:tc>
+          <w:tcPr>
+            <w:shd w:val="clear" w:color="auto" w:fill="F2F2F2"/>
+          </w:tcPr>
+          <w:tcPr/>
+          <w:p>
+            <w:pPr>
+              <w:pStyle w:val="Compact"/>
+            </w:pPr>
+            <w:r>
+              <w:t xml:space="preserve">0.11f</w:t>
+            </w:r>
+          </w:p>
+        </w:tc>
+        <w:tc>
+          <w:tcPr>
+            <w:shd w:val="clear" w:color="auto" w:fill="F2F2F2"/>
+          </w:tcPr>
+          <w:tcPr/>
+          <w:p>
+            <w:pPr>
+              <w:pStyle w:val="Compact"/>
+            </w:pPr>
+            <w:r>
+              <w:t xml:space="preserve">2026-04-24</w:t>
+            </w:r>
+          </w:p>
+        </w:tc>
+        <w:tc>
+          <w:tcPr>
+            <w:shd w:val="clear" w:color="auto" w:fill="F2F2F2"/>
+          </w:tcPr>
+          <w:tcPr/>
+          <w:p>
+            <w:pPr>
+              <w:pStyle w:val="Compact"/>
+            </w:pPr>
+            <w:r>
+              <w:t xml:space="preserve">Blue Ridge Automation</w:t>
+            </w:r>
+          </w:p>
+        </w:tc>
+        <w:tc>
+          <w:tcPr>
+            <w:shd w:val="clear" w:color="auto" w:fill="F2F2F2"/>
+          </w:tcPr>
+          <w:tcPr/>
+          <w:p>
+            <w:pPr>
+              <w:pStyle w:val="Compact"/>
+            </w:pPr>
             <w:r>
               <w:rPr>
                 <w:b/>
                 <w:bCs/>
               </w:rPr>
-              <w:t xml:space="preserve">FDS-07-005 rewritten</w:t>
+              <w:t xml:space="preserve">§5.1 — OI-23 Lot derived quantities as a view.</w:t>
             </w:r>
             <w:r>
               <w:t xml:space="preserve"> </w:t>
             </w:r>
             <w:r>
-              <w:t xml:space="preserve">— container closure is synchronous and atomic with pool claim (no AIM call inline).</w:t>
-            </w:r>
-            <w:r>
-              <w:t xml:space="preserve"> </w:t>
-            </w:r>
+              <w:t xml:space="preserve">FDS-05-031 rewritten. Data Model v1.9e.</w:t>
+            </w:r>
+          </w:p>
+        </w:tc>
+      </w:tr>
+      <w:tr>
+        <w:tc>
+          <w:tcPr/>
+          <w:p>
+            <w:pPr>
+              <w:pStyle w:val="Compact"/>
+            </w:pPr>
+            <w:r>
+              <w:t xml:space="preserve">0.11e</w:t>
+            </w:r>
+          </w:p>
+        </w:tc>
+        <w:tc>
+          <w:tcPr/>
+          <w:p>
+            <w:pPr>
+              <w:pStyle w:val="Compact"/>
+            </w:pPr>
+            <w:r>
+              <w:t xml:space="preserve">2026-04-24</w:t>
+            </w:r>
+          </w:p>
+        </w:tc>
+        <w:tc>
+          <w:tcPr/>
+          <w:p>
+            <w:pPr>
+              <w:pStyle w:val="Compact"/>
+            </w:pPr>
+            <w:r>
+              <w:t xml:space="preserve">Blue Ridge Automation</w:t>
+            </w:r>
+          </w:p>
+        </w:tc>
+        <w:tc>
+          <w:tcPr/>
+          <w:p>
+            <w:pPr>
+              <w:pStyle w:val="Compact"/>
+            </w:pPr>
             <w:r>
               <w:rPr>
                 <w:b/>
                 <w:bCs/>
               </w:rPr>
-              <w:t xml:space="preserve">FDS-07-008 amended</w:t>
+              <w:t xml:space="preserve">§2.5, §4 — OI-08 Terminal mode by parent Location tier.</w:t>
             </w:r>
             <w:r>
               <w:t xml:space="preserve"> </w:t>
             </w:r>
             <w:r>
-              <w:t xml:space="preserve">— voided containers do not return ID to pool.</w:t>
-            </w:r>
-            <w:r>
-              <w:t xml:space="preserve"> </w:t>
-            </w:r>
+              <w:t xml:space="preserve">FDS-02-010, FDS-04-003 rewritten. (No data model change.)</w:t>
+            </w:r>
+          </w:p>
+        </w:tc>
+      </w:tr>
+      <w:tr>
+        <w:tc>
+          <w:tcPr>
+            <w:shd w:val="clear" w:color="auto" w:fill="F2F2F2"/>
+          </w:tcPr>
+          <w:tcPr/>
+          <w:p>
+            <w:pPr>
+              <w:pStyle w:val="Compact"/>
+            </w:pPr>
+            <w:r>
+              <w:t xml:space="preserve">0.11d</w:t>
+            </w:r>
+          </w:p>
+        </w:tc>
+        <w:tc>
+          <w:tcPr>
+            <w:shd w:val="clear" w:color="auto" w:fill="F2F2F2"/>
+          </w:tcPr>
+          <w:tcPr/>
+          <w:p>
+            <w:pPr>
+              <w:pStyle w:val="Compact"/>
+            </w:pPr>
+            <w:r>
+              <w:t xml:space="preserve">2026-04-24</w:t>
+            </w:r>
+          </w:p>
+        </w:tc>
+        <w:tc>
+          <w:tcPr>
+            <w:shd w:val="clear" w:color="auto" w:fill="F2F2F2"/>
+          </w:tcPr>
+          <w:tcPr/>
+          <w:p>
+            <w:pPr>
+              <w:pStyle w:val="Compact"/>
+            </w:pPr>
+            <w:r>
+              <w:t xml:space="preserve">Blue Ridge Automation</w:t>
+            </w:r>
+          </w:p>
+        </w:tc>
+        <w:tc>
+          <w:tcPr>
+            <w:shd w:val="clear" w:color="auto" w:fill="F2F2F2"/>
+          </w:tcPr>
+          <w:tcPr/>
+          <w:p>
+            <w:pPr>
+              <w:pStyle w:val="Compact"/>
+            </w:pPr>
             <w:r>
               <w:rPr>
                 <w:b/>
                 <w:bCs/>
               </w:rPr>
-              <w:t xml:space="preserve">FDS-07-010 fully rewritten</w:t>
+              <w:t xml:space="preserve">§3.5 — OI-18 ItemLocation hierarchy cascade.</w:t>
             </w:r>
             <w:r>
               <w:t xml:space="preserve"> </w:t>
             </w:r>
             <w:r>
-              <w:t xml:space="preserve">— pool model, topup state machine, drain script cadence (~30s timer), claim ordering.</w:t>
-            </w:r>
-            <w:r>
-              <w:t xml:space="preserve"> </w:t>
-            </w:r>
+              <w:t xml:space="preserve">FDS-03-014 rewritten; FDS-03-015, FDS-03-018 extended. Data Model v1.9d.</w:t>
+            </w:r>
+          </w:p>
+        </w:tc>
+      </w:tr>
+      <w:tr>
+        <w:tc>
+          <w:tcPr/>
+          <w:p>
+            <w:pPr>
+              <w:pStyle w:val="Compact"/>
+            </w:pPr>
+            <w:r>
+              <w:t xml:space="preserve">0.11c</w:t>
+            </w:r>
+          </w:p>
+        </w:tc>
+        <w:tc>
+          <w:tcPr/>
+          <w:p>
+            <w:pPr>
+              <w:pStyle w:val="Compact"/>
+            </w:pPr>
+            <w:r>
+              <w:t xml:space="preserve">2026-04-24</w:t>
+            </w:r>
+          </w:p>
+        </w:tc>
+        <w:tc>
+          <w:tcPr/>
+          <w:p>
+            <w:pPr>
+              <w:pStyle w:val="Compact"/>
+            </w:pPr>
+            <w:r>
+              <w:t xml:space="preserve">Blue Ridge Automation</w:t>
+            </w:r>
+          </w:p>
+        </w:tc>
+        <w:tc>
+          <w:tcPr/>
+          <w:p>
+            <w:pPr>
+              <w:pStyle w:val="Compact"/>
+            </w:pPr>
             <w:r>
               <w:rPr>
                 <w:b/>
                 <w:bCs/>
               </w:rPr>
-              <w:t xml:space="preserve">FDS-07-010a NEW</w:t>
+              <w:t xml:space="preserve">§3.6 — OI-12 MaxParts moved to Parts.Item.</w:t>
             </w:r>
             <w:r>
               <w:t xml:space="preserve"> </w:t>
             </w:r>
             <w:r>
-              <w:t xml:space="preserve">— empty-pool hard-fail behavior.</w:t>
-            </w:r>
-            <w:r>
-              <w:t xml:space="preserve"> </w:t>
-            </w:r>
+              <w:t xml:space="preserve">FDS-03-019 rewritten. Data Model v1.9c.</w:t>
+            </w:r>
+          </w:p>
+        </w:tc>
+      </w:tr>
+      <w:tr>
+        <w:tc>
+          <w:tcPr>
+            <w:shd w:val="clear" w:color="auto" w:fill="F2F2F2"/>
+          </w:tcPr>
+          <w:tcPr/>
+          <w:p>
+            <w:pPr>
+              <w:pStyle w:val="Compact"/>
+            </w:pPr>
+            <w:r>
+              <w:t xml:space="preserve">0.11b</w:t>
+            </w:r>
+          </w:p>
+        </w:tc>
+        <w:tc>
+          <w:tcPr>
+            <w:shd w:val="clear" w:color="auto" w:fill="F2F2F2"/>
+          </w:tcPr>
+          <w:tcPr/>
+          <w:p>
+            <w:pPr>
+              <w:pStyle w:val="Compact"/>
+            </w:pPr>
+            <w:r>
+              <w:t xml:space="preserve">2026-04-24</w:t>
+            </w:r>
+          </w:p>
+        </w:tc>
+        <w:tc>
+          <w:tcPr>
+            <w:shd w:val="clear" w:color="auto" w:fill="F2F2F2"/>
+          </w:tcPr>
+          <w:tcPr/>
+          <w:p>
+            <w:pPr>
+              <w:pStyle w:val="Compact"/>
+            </w:pPr>
+            <w:r>
+              <w:t xml:space="preserve">Blue Ridge Automation</w:t>
+            </w:r>
+          </w:p>
+        </w:tc>
+        <w:tc>
+          <w:tcPr>
+            <w:shd w:val="clear" w:color="auto" w:fill="F2F2F2"/>
+          </w:tcPr>
+          <w:tcPr/>
+          <w:p>
+            <w:pPr>
+              <w:pStyle w:val="Compact"/>
+            </w:pPr>
             <w:r>
               <w:rPr>
                 <w:b/>
                 <w:bCs/>
               </w:rPr>
-              <w:t xml:space="preserve">FDS-07-010b NEW</w:t>
+              <w:t xml:space="preserve">§6.10 — OI-07 WorkOrderType corrected to single Production seed.</w:t>
             </w:r>
             <w:r>
               <w:t xml:space="preserve"> </w:t>
             </w:r>
             <w:r>
-              <w:t xml:space="preserve">— alarm thresholds + IT notification routing.</w:t>
-            </w:r>
-            <w:r>
-              <w:t xml:space="preserve"> </w:t>
-            </w:r>
+              <w:t xml:space="preserve">FDS-06-022 renamed; FDS-06-027 deleted; FDS-06-025, FDS-06-028 updated. Data Model v1.9b.</w:t>
+            </w:r>
+          </w:p>
+        </w:tc>
+      </w:tr>
+      <w:tr>
+        <w:tc>
+          <w:tcPr/>
+          <w:p>
+            <w:pPr>
+              <w:pStyle w:val="Compact"/>
+            </w:pPr>
+            <w:r>
+              <w:t xml:space="preserve">0.11</w:t>
+            </w:r>
+          </w:p>
+        </w:tc>
+        <w:tc>
+          <w:tcPr/>
+          <w:p>
+            <w:pPr>
+              <w:pStyle w:val="Compact"/>
+            </w:pPr>
+            <w:r>
+              <w:t xml:space="preserve">2026-04-24</w:t>
+            </w:r>
+          </w:p>
+        </w:tc>
+        <w:tc>
+          <w:tcPr/>
+          <w:p>
+            <w:pPr>
+              <w:pStyle w:val="Compact"/>
+            </w:pPr>
+            <w:r>
+              <w:t xml:space="preserve">Blue Ridge Automation</w:t>
+            </w:r>
+          </w:p>
+        </w:tc>
+        <w:tc>
+          <w:tcPr/>
+          <w:p>
+            <w:pPr>
+              <w:pStyle w:val="Compact"/>
+            </w:pPr>
             <w:r>
               <w:rPr>
                 <w:b/>
                 <w:bCs/>
               </w:rPr>
-              <w:t xml:space="preserve">FDS-07-010c NEW</w:t>
+              <w:t xml:space="preserve">§3.4, §5.1, §5.2, §5.3, §5.4, §5.5, §6.2, §6.10, §16 (NEW) — Arc 2 model revisions (Tool/Cavity on Lot, ProductionEvent checkpoint shape, IdentifierSequence, cavity-parallel LOTs as peers).</w:t>
             </w:r>
             <w:r>
               <w:t xml:space="preserve"> </w:t>
             </w:r>
             <w:r>
-              <w:t xml:space="preserve">— Configuration Tool exposure of the four thresholds via</w:t>
-            </w:r>
-            <w:r>
-              <w:t xml:space="preserve"> </w:t>
-            </w:r>
-            <w:r>
-              <w:rPr>
-                <w:rStyle w:val="VerbatimChar"/>
-              </w:rPr>
-              <w:t xml:space="preserve">Lots.AimPoolConfig_Get</w:t>
-            </w:r>
-            <w:r>
-              <w:t xml:space="preserve"> </w:t>
-            </w:r>
-            <w:r>
-              <w:t xml:space="preserve">/</w:t>
-            </w:r>
-            <w:r>
-              <w:t xml:space="preserve"> </w:t>
-            </w:r>
-            <w:r>
-              <w:rPr>
-                <w:rStyle w:val="VerbatimChar"/>
-              </w:rPr>
-              <w:t xml:space="preserve">_Update</w:t>
-            </w:r>
-            <w:r>
-              <w:t xml:space="preserve">. Data Model v1.9h carries new tables</w:t>
-            </w:r>
-            <w:r>
-              <w:t xml:space="preserve"> </w:t>
-            </w:r>
-            <w:r>
-              <w:rPr>
-                <w:rStyle w:val="VerbatimChar"/>
-              </w:rPr>
-              <w:t xml:space="preserve">Lots.AimShipperIdPool</w:t>
-            </w:r>
-            <w:r>
-              <w:t xml:space="preserve"> </w:t>
-            </w:r>
-            <w:r>
-              <w:t xml:space="preserve">and</w:t>
-            </w:r>
-            <w:r>
-              <w:t xml:space="preserve"> </w:t>
-            </w:r>
-            <w:r>
-              <w:rPr>
-                <w:rStyle w:val="VerbatimChar"/>
-              </w:rPr>
-              <w:t xml:space="preserve">Lots.AimPoolConfig</w:t>
-            </w:r>
-            <w:r>
-              <w:t xml:space="preserve">. SQL deferred to Arc 2 Phase 7.</w:t>
+              <w:t xml:space="preserve">FDS-03-017a rewritten; FDS-05-003 revised; FDS-05-030, -034, -035, -036, -037 NEW; FDS-06-003 revised; FDS-06-030 NEW; FDS-16-001..003 NEW. Data Model v1.9.</w:t>
             </w:r>
           </w:p>
         </w:tc>
       </w:tr>
       <w:tr>
         <w:tc>
-          <w:tcPr/>
-          <w:p>
-            <w:pPr>
-              <w:pStyle w:val="Compact"/>
-            </w:pPr>
-            <w:r>
-              <w:t xml:space="preserve">0.11h</w:t>
-            </w:r>
-          </w:p>
-        </w:tc>
-        <w:tc>
-          <w:tcPr/>
-          <w:p>
-            <w:pPr>
-              <w:pStyle w:val="Compact"/>
-            </w:pPr>
-            <w:r>
-              <w:t xml:space="preserve">2026-04-27</w:t>
-            </w:r>
-          </w:p>
-        </w:tc>
-        <w:tc>
+          <w:tcPr>
+            <w:shd w:val="clear" w:color="auto" w:fill="F2F2F2"/>
+          </w:tcPr>
+          <w:tcPr/>
+          <w:p>
+            <w:pPr>
+              <w:pStyle w:val="Compact"/>
+            </w:pPr>
+            <w:r>
+              <w:t xml:space="preserve">0.10-rev</w:t>
+            </w:r>
+          </w:p>
+        </w:tc>
+        <w:tc>
+          <w:tcPr>
+            <w:shd w:val="clear" w:color="auto" w:fill="F2F2F2"/>
+          </w:tcPr>
+          <w:tcPr/>
+          <w:p>
+            <w:pPr>
+              <w:pStyle w:val="Compact"/>
+            </w:pPr>
+            <w:r>
+              <w:t xml:space="preserve">2026-04-22</w:t>
+            </w:r>
+          </w:p>
+        </w:tc>
+        <w:tc>
+          <w:tcPr>
+            <w:shd w:val="clear" w:color="auto" w:fill="F2F2F2"/>
+          </w:tcPr>
           <w:tcPr/>
           <w:p>
             <w:pPr>
@@ -1339,6 +843,9 @@
           </w:p>
         </w:tc>
         <w:tc>
+          <w:tcPr>
+            <w:shd w:val="clear" w:color="auto" w:fill="F2F2F2"/>
+          </w:tcPr>
           <w:tcPr/>
           <w:p>
             <w:pPr>
@@ -1349,266 +856,289 @@
                 <w:b/>
                 <w:bCs/>
               </w:rPr>
-              <w:t xml:space="preserve">§5.3 OI-21 — Pausable LOT at Workstation,</w:t>
-            </w:r>
+              <w:t xml:space="preserve">§5.10 — OI-11 Casting → Trim via 1-line BOM (no new schema).</w:t>
+            </w:r>
+            <w:r>
+              <w:t xml:space="preserve"> </w:t>
+            </w:r>
+            <w:r>
+              <w:t xml:space="preserve">FDS-05-033..035 consolidated into FDS-05-033. Data Model v1.8-rev.</w:t>
+            </w:r>
+          </w:p>
+        </w:tc>
+      </w:tr>
+      <w:tr>
+        <w:tc>
+          <w:tcPr/>
+          <w:p>
+            <w:pPr>
+              <w:pStyle w:val="Compact"/>
+            </w:pPr>
+            <w:r>
+              <w:t xml:space="preserve">0.10</w:t>
+            </w:r>
+          </w:p>
+        </w:tc>
+        <w:tc>
+          <w:tcPr/>
+          <w:p>
+            <w:pPr>
+              <w:pStyle w:val="Compact"/>
+            </w:pPr>
+            <w:r>
+              <w:t xml:space="preserve">2026-04-22</w:t>
+            </w:r>
+          </w:p>
+        </w:tc>
+        <w:tc>
+          <w:tcPr/>
+          <w:p>
+            <w:pPr>
+              <w:pStyle w:val="Compact"/>
+            </w:pPr>
+            <w:r>
+              <w:t xml:space="preserve">Blue Ridge Automation</w:t>
+            </w:r>
+          </w:p>
+        </w:tc>
+        <w:tc>
+          <w:tcPr/>
+          <w:p>
+            <w:pPr>
+              <w:pStyle w:val="Compact"/>
+            </w:pPr>
             <w:r>
               <w:rPr>
                 <w:b/>
                 <w:bCs/>
               </w:rPr>
+              <w:t xml:space="preserve">§1.4, §3.1, §3.5, §3.6, §4.3, §5.1, §5.3, §5.10, §6.8, §6.10, §8.2, §12.5, §14 — Phase E of OI review refactor (OI-11..23).</w:t>
+            </w:r>
+            <w:r>
               <w:t xml:space="preserve"> </w:t>
             </w:r>
             <w:r>
-              <w:rPr>
-                <w:rStyle w:val="VerbatimChar"/>
-                <w:b/>
-                <w:bCs/>
-              </w:rPr>
-              <w:t xml:space="preserve">Lots.PauseEvent</w:t>
-            </w:r>
+              <w:t xml:space="preserve">FDS-01-013, FDS-03-018, FDS-03-019, FDS-03-020, FDS-05-031, FDS-05-032, FDS-05-033, FDS-06-023a, FDS-06-028, FDS-06-029, FDS-08-007a, FDS-12-009..011 NEW; FDS-03-001, FDS-04-007 extended. Data Model v1.8.</w:t>
+            </w:r>
+          </w:p>
+        </w:tc>
+      </w:tr>
+      <w:tr>
+        <w:tc>
+          <w:tcPr>
+            <w:shd w:val="clear" w:color="auto" w:fill="F2F2F2"/>
+          </w:tcPr>
+          <w:tcPr/>
+          <w:p>
+            <w:pPr>
+              <w:pStyle w:val="Compact"/>
+            </w:pPr>
+            <w:r>
+              <w:t xml:space="preserve">0.9</w:t>
+            </w:r>
+          </w:p>
+        </w:tc>
+        <w:tc>
+          <w:tcPr>
+            <w:shd w:val="clear" w:color="auto" w:fill="F2F2F2"/>
+          </w:tcPr>
+          <w:tcPr/>
+          <w:p>
+            <w:pPr>
+              <w:pStyle w:val="Compact"/>
+            </w:pPr>
+            <w:r>
+              <w:t xml:space="preserve">2026-04-21</w:t>
+            </w:r>
+          </w:p>
+        </w:tc>
+        <w:tc>
+          <w:tcPr>
+            <w:shd w:val="clear" w:color="auto" w:fill="F2F2F2"/>
+          </w:tcPr>
+          <w:tcPr/>
+          <w:p>
+            <w:pPr>
+              <w:pStyle w:val="Compact"/>
+            </w:pPr>
+            <w:r>
+              <w:t xml:space="preserve">Blue Ridge Automation</w:t>
+            </w:r>
+          </w:p>
+        </w:tc>
+        <w:tc>
+          <w:tcPr>
+            <w:shd w:val="clear" w:color="auto" w:fill="F2F2F2"/>
+          </w:tcPr>
+          <w:tcPr/>
+          <w:p>
+            <w:pPr>
+              <w:pStyle w:val="Compact"/>
+            </w:pPr>
             <w:r>
               <w:rPr>
                 <w:b/>
                 <w:bCs/>
               </w:rPr>
+              <w:t xml:space="preserve">§2.5, §5.4, §5.5, §6.10, §9.4, §10.3 — Phase D of OI review refactor (OI-04, -05, -07, -08 addenda, -09 addenda, -03).</w:t>
+            </w:r>
+            <w:r>
               <w:t xml:space="preserve"> </w:t>
             </w:r>
+            <w:r>
+              <w:t xml:space="preserve">FDS-02-010..014, FDS-05-022..024 NEW; FDS-05-025..027 (merge rules); FDS-06-025..027; FDS-09-012..014 NEW; FDS-10-005 rewritten; FDS-10-009..012 NEW. Data Model v1.7.</w:t>
+            </w:r>
+          </w:p>
+        </w:tc>
+      </w:tr>
+      <w:tr>
+        <w:tc>
+          <w:tcPr/>
+          <w:p>
+            <w:pPr>
+              <w:pStyle w:val="Compact"/>
+            </w:pPr>
+            <w:r>
+              <w:t xml:space="preserve">0.8</w:t>
+            </w:r>
+          </w:p>
+        </w:tc>
+        <w:tc>
+          <w:tcPr/>
+          <w:p>
+            <w:pPr>
+              <w:pStyle w:val="Compact"/>
+            </w:pPr>
+            <w:r>
+              <w:t xml:space="preserve">2026-04-21</w:t>
+            </w:r>
+          </w:p>
+        </w:tc>
+        <w:tc>
+          <w:tcPr/>
+          <w:p>
+            <w:pPr>
+              <w:pStyle w:val="Compact"/>
+            </w:pPr>
+            <w:r>
+              <w:t xml:space="preserve">Blue Ridge Automation</w:t>
+            </w:r>
+          </w:p>
+        </w:tc>
+        <w:tc>
+          <w:tcPr/>
+          <w:p>
+            <w:pPr>
+              <w:pStyle w:val="Compact"/>
+            </w:pPr>
             <w:r>
               <w:rPr>
                 <w:b/>
                 <w:bCs/>
               </w:rPr>
-              <w:t xml:space="preserve">(FDS-05-038 NEW).</w:t>
+              <w:t xml:space="preserve">§1.6, §4 — OI-06 security rewrite (initials-based operator presence; AD elevation per-action; clock# + PIN removed).</w:t>
             </w:r>
             <w:r>
               <w:t xml:space="preserve"> </w:t>
             </w:r>
             <w:r>
-              <w:t xml:space="preserve">Per Jacques’s 2026-04-27 design lock: pause is a</w:t>
-            </w:r>
-            <w:r>
-              <w:t xml:space="preserve"> </w:t>
-            </w:r>
-            <w:r>
-              <w:rPr>
-                <w:rStyle w:val="VerbatimChar"/>
-              </w:rPr>
-              <w:t xml:space="preserve">(Lot, Location)</w:t>
-            </w:r>
-            <w:r>
-              <w:t xml:space="preserve"> </w:t>
-            </w:r>
-            <w:r>
-              <w:t xml:space="preserve">lifecycle event, not a</w:t>
-            </w:r>
-            <w:r>
-              <w:t xml:space="preserve"> </w:t>
-            </w:r>
-            <w:r>
-              <w:rPr>
-                <w:rStyle w:val="VerbatimChar"/>
-              </w:rPr>
-              <w:t xml:space="preserve">Workorder.WorkOrderStatus</w:t>
-            </w:r>
-            <w:r>
-              <w:t xml:space="preserve"> </w:t>
-            </w:r>
-            <w:r>
-              <w:t xml:space="preserve">extension. New</w:t>
-            </w:r>
-            <w:r>
-              <w:t xml:space="preserve"> </w:t>
-            </w:r>
-            <w:r>
-              <w:rPr>
-                <w:rStyle w:val="VerbatimChar"/>
-              </w:rPr>
-              <w:t xml:space="preserve">Lots.PauseEvent</w:t>
-            </w:r>
-            <w:r>
-              <w:t xml:space="preserve"> </w:t>
-            </w:r>
-            <w:r>
-              <w:t xml:space="preserve">append-only place/close-lifecycle table (mirrors</w:t>
-            </w:r>
-            <w:r>
-              <w:t xml:space="preserve"> </w:t>
-            </w:r>
-            <w:r>
-              <w:rPr>
-                <w:rStyle w:val="VerbatimChar"/>
-              </w:rPr>
-              <w:t xml:space="preserve">Quality.HoldEvent</w:t>
-            </w:r>
-            <w:r>
-              <w:t xml:space="preserve">). Same LOT MAY be paused at multiple Cells simultaneously (Machining + Assembly partial-progress); no auto-prompt on starting another LOT at a Cell with paused work — every workstation screen instead surfaces a</w:t>
-            </w:r>
-            <w:r>
-              <w:t xml:space="preserve"> </w:t>
-            </w:r>
+              <w:t xml:space="preserve">FDS-01-010 updated; FDS-04-001..010 (entire section rewritten); FDS-04-009, FDS-04-010 NEW. Data Model v1.6.</w:t>
+            </w:r>
+          </w:p>
+        </w:tc>
+      </w:tr>
+      <w:tr>
+        <w:tc>
+          <w:tcPr>
+            <w:shd w:val="clear" w:color="auto" w:fill="F2F2F2"/>
+          </w:tcPr>
+          <w:tcPr/>
+          <w:p>
+            <w:pPr>
+              <w:pStyle w:val="Compact"/>
+            </w:pPr>
+            <w:r>
+              <w:t xml:space="preserve">0.7</w:t>
+            </w:r>
+          </w:p>
+        </w:tc>
+        <w:tc>
+          <w:tcPr>
+            <w:shd w:val="clear" w:color="auto" w:fill="F2F2F2"/>
+          </w:tcPr>
+          <w:tcPr/>
+          <w:p>
+            <w:pPr>
+              <w:pStyle w:val="Compact"/>
+            </w:pPr>
+            <w:r>
+              <w:t xml:space="preserve">2026-04-15</w:t>
+            </w:r>
+          </w:p>
+        </w:tc>
+        <w:tc>
+          <w:tcPr>
+            <w:shd w:val="clear" w:color="auto" w:fill="F2F2F2"/>
+          </w:tcPr>
+          <w:tcPr/>
+          <w:p>
+            <w:pPr>
+              <w:pStyle w:val="Compact"/>
+            </w:pPr>
+            <w:r>
+              <w:t xml:space="preserve">Blue Ridge Automation</w:t>
+            </w:r>
+          </w:p>
+        </w:tc>
+        <w:tc>
+          <w:tcPr>
+            <w:shd w:val="clear" w:color="auto" w:fill="F2F2F2"/>
+          </w:tcPr>
+          <w:tcPr/>
+          <w:p>
+            <w:pPr>
+              <w:pStyle w:val="Compact"/>
+            </w:pPr>
             <w:r>
               <w:rPr>
                 <w:b/>
                 <w:bCs/>
               </w:rPr>
-              <w:t xml:space="preserve">Paused-LOT indicator</w:t>
+              <w:t xml:space="preserve">§3.4, §6.2 — Production data collection capture (template→event gap closed).</w:t>
             </w:r>
             <w:r>
               <w:t xml:space="preserve"> </w:t>
             </w:r>
             <w:r>
-              <w:t xml:space="preserve">(count + tap-through detail list). No TTL — paused LOTs persist across shifts and operators (different operator MAY resume someone else’s pause). PausedReason and ResumedRemarks both optional. Pause does NOT transition</w:t>
-            </w:r>
-            <w:r>
-              <w:t xml:space="preserve"> </w:t>
-            </w:r>
-            <w:r>
-              <w:rPr>
-                <w:rStyle w:val="VerbatimChar"/>
-              </w:rPr>
-              <w:t xml:space="preserve">WorkOrderStatus</w:t>
-            </w:r>
-            <w:r>
-              <w:t xml:space="preserve">,</w:t>
-            </w:r>
-            <w:r>
-              <w:t xml:space="preserve"> </w:t>
-            </w:r>
-            <w:r>
-              <w:rPr>
-                <w:rStyle w:val="VerbatimChar"/>
-              </w:rPr>
-              <w:t xml:space="preserve">OperationStatus</w:t>
-            </w:r>
-            <w:r>
-              <w:t xml:space="preserve">, or</w:t>
-            </w:r>
-            <w:r>
-              <w:t xml:space="preserve"> </w:t>
-            </w:r>
-            <w:r>
-              <w:rPr>
-                <w:rStyle w:val="VerbatimChar"/>
-              </w:rPr>
-              <w:t xml:space="preserve">LotStatusCode</w:t>
-            </w:r>
-            <w:r>
-              <w:t xml:space="preserve"> </w:t>
-            </w:r>
-            <w:r>
-              <w:t xml:space="preserve">and does NOT write a</w:t>
-            </w:r>
-            <w:r>
-              <w:t xml:space="preserve"> </w:t>
-            </w:r>
-            <w:r>
-              <w:rPr>
-                <w:rStyle w:val="VerbatimChar"/>
-              </w:rPr>
-              <w:t xml:space="preserve">DowntimeEvent</w:t>
-            </w:r>
-            <w:r>
-              <w:t xml:space="preserve"> </w:t>
-            </w:r>
-            <w:r>
-              <w:t xml:space="preserve">— pause is a LOT-Location operator-focus state record only. Procs land in Arc 2 Phase 1 alongside</w:t>
-            </w:r>
-            <w:r>
-              <w:t xml:space="preserve"> </w:t>
-            </w:r>
-            <w:r>
-              <w:rPr>
-                <w:rStyle w:val="VerbatimChar"/>
-              </w:rPr>
-              <w:t xml:space="preserve">Lots.Lot</w:t>
-            </w:r>
-            <w:r>
-              <w:t xml:space="preserve">:</w:t>
-            </w:r>
-            <w:r>
-              <w:t xml:space="preserve"> </w:t>
-            </w:r>
-            <w:r>
-              <w:rPr>
-                <w:rStyle w:val="VerbatimChar"/>
-              </w:rPr>
-              <w:t xml:space="preserve">Lots.LotPause_Place</w:t>
-            </w:r>
-            <w:r>
-              <w:t xml:space="preserve">,</w:t>
-            </w:r>
-            <w:r>
-              <w:t xml:space="preserve"> </w:t>
-            </w:r>
-            <w:r>
-              <w:rPr>
-                <w:rStyle w:val="VerbatimChar"/>
-              </w:rPr>
-              <w:t xml:space="preserve">_Resume</w:t>
-            </w:r>
-            <w:r>
-              <w:t xml:space="preserve">,</w:t>
-            </w:r>
-            <w:r>
-              <w:t xml:space="preserve"> </w:t>
-            </w:r>
-            <w:r>
-              <w:rPr>
-                <w:rStyle w:val="VerbatimChar"/>
-              </w:rPr>
-              <w:t xml:space="preserve">_GetByLocation</w:t>
-            </w:r>
-            <w:r>
-              <w:t xml:space="preserve">,</w:t>
-            </w:r>
-            <w:r>
-              <w:t xml:space="preserve"> </w:t>
-            </w:r>
-            <w:r>
-              <w:rPr>
-                <w:rStyle w:val="VerbatimChar"/>
-              </w:rPr>
-              <w:t xml:space="preserve">_GetCountsByLocation</w:t>
-            </w:r>
-            <w:r>
-              <w:t xml:space="preserve">. Data Model v1.9g. OIR v2.11 (OI-21 design locked).</w:t>
+              <w:t xml:space="preserve">FDS-03-012 rewritten; FDS-03-017a NEW; FDS-06-001, FDS-06-003 rewritten. Data Model v1.4.</w:t>
             </w:r>
           </w:p>
         </w:tc>
       </w:tr>
       <w:tr>
         <w:tc>
-          <w:tcPr>
-            <w:shd w:val="clear" w:color="auto" w:fill="F2F2F2"/>
-          </w:tcPr>
-          <w:tcPr/>
-          <w:p>
-            <w:pPr>
-              <w:pStyle w:val="Compact"/>
-            </w:pPr>
-            <w:r>
-              <w:t xml:space="preserve">0.11g</w:t>
-            </w:r>
-          </w:p>
-        </w:tc>
-        <w:tc>
-          <w:tcPr>
-            <w:shd w:val="clear" w:color="auto" w:fill="F2F2F2"/>
-          </w:tcPr>
-          <w:tcPr/>
-          <w:p>
-            <w:pPr>
-              <w:pStyle w:val="Compact"/>
-            </w:pPr>
-            <w:r>
-              <w:t xml:space="preserve">2026-04-24</w:t>
-            </w:r>
-          </w:p>
-        </w:tc>
-        <w:tc>
-          <w:tcPr>
-            <w:shd w:val="clear" w:color="auto" w:fill="F2F2F2"/>
-          </w:tcPr>
+          <w:tcPr/>
+          <w:p>
+            <w:pPr>
+              <w:pStyle w:val="Compact"/>
+            </w:pPr>
+            <w:r>
+              <w:t xml:space="preserve">0.6</w:t>
+            </w:r>
+          </w:p>
+        </w:tc>
+        <w:tc>
+          <w:tcPr/>
+          <w:p>
+            <w:pPr>
+              <w:pStyle w:val="Compact"/>
+            </w:pPr>
+            <w:r>
+              <w:t xml:space="preserve">2026-04-15</w:t>
+            </w:r>
+          </w:p>
+        </w:tc>
+        <w:tc>
           <w:tcPr/>
           <w:p>
             <w:pPr>
@@ -1620,9 +1150,6 @@
           </w:p>
         </w:tc>
         <w:tc>
-          <w:tcPr>
-            <w:shd w:val="clear" w:color="auto" w:fill="F2F2F2"/>
-          </w:tcPr>
           <w:tcPr/>
           <w:p>
             <w:pPr>
@@ -1633,105 +1160,205 @@
                 <w:b/>
                 <w:bCs/>
               </w:rPr>
-              <w:t xml:space="preserve">§6.10 OI-16 — PLC confirmation BIT +</w:t>
-            </w:r>
+              <w:t xml:space="preserve">§11 — Phase 5/6 SQL completion + Ignition JDBC convention.</w:t>
+            </w:r>
+            <w:r>
+              <w:t xml:space="preserve"> </w:t>
+            </w:r>
+            <w:r>
+              <w:t xml:space="preserve">FDS-11-011 NEW (single-result-set / no-OUTPUT-params rule). Data Model v1.3.</w:t>
+            </w:r>
+          </w:p>
+        </w:tc>
+      </w:tr>
+      <w:tr>
+        <w:tc>
+          <w:tcPr>
+            <w:shd w:val="clear" w:color="auto" w:fill="F2F2F2"/>
+          </w:tcPr>
+          <w:tcPr/>
+          <w:p>
+            <w:pPr>
+              <w:pStyle w:val="Compact"/>
+            </w:pPr>
+            <w:r>
+              <w:t xml:space="preserve">0.5</w:t>
+            </w:r>
+          </w:p>
+        </w:tc>
+        <w:tc>
+          <w:tcPr>
+            <w:shd w:val="clear" w:color="auto" w:fill="F2F2F2"/>
+          </w:tcPr>
+          <w:tcPr/>
+          <w:p>
+            <w:pPr>
+              <w:pStyle w:val="Compact"/>
+            </w:pPr>
+            <w:r>
+              <w:t xml:space="preserve">2026-04-10</w:t>
+            </w:r>
+          </w:p>
+        </w:tc>
+        <w:tc>
+          <w:tcPr>
+            <w:shd w:val="clear" w:color="auto" w:fill="F2F2F2"/>
+          </w:tcPr>
+          <w:tcPr/>
+          <w:p>
+            <w:pPr>
+              <w:pStyle w:val="Compact"/>
+            </w:pPr>
+            <w:r>
+              <w:t xml:space="preserve">Blue Ridge Automation</w:t>
+            </w:r>
+          </w:p>
+        </w:tc>
+        <w:tc>
+          <w:tcPr>
+            <w:shd w:val="clear" w:color="auto" w:fill="F2F2F2"/>
+          </w:tcPr>
+          <w:tcPr/>
+          <w:p>
+            <w:pPr>
+              <w:pStyle w:val="Compact"/>
+            </w:pPr>
             <w:r>
               <w:rPr>
                 <w:b/>
                 <w:bCs/>
               </w:rPr>
+              <w:t xml:space="preserve">§11 — Audit fourth log stream (FailureLog).</w:t>
+            </w:r>
+            <w:r>
               <w:t xml:space="preserve"> </w:t>
             </w:r>
             <w:r>
-              <w:rPr>
-                <w:rStyle w:val="VerbatimChar"/>
-                <w:b/>
-                <w:bCs/>
-              </w:rPr>
-              <w:t xml:space="preserve">RequiresCompletionConfirm</w:t>
-            </w:r>
+              <w:t xml:space="preserve">FDS-11-004 NEW; FDS-11-005..010 renumbered.</w:t>
+            </w:r>
+          </w:p>
+        </w:tc>
+      </w:tr>
+      <w:tr>
+        <w:tc>
+          <w:tcPr/>
+          <w:p>
+            <w:pPr>
+              <w:pStyle w:val="Compact"/>
+            </w:pPr>
+            <w:r>
+              <w:t xml:space="preserve">0.4</w:t>
+            </w:r>
+          </w:p>
+        </w:tc>
+        <w:tc>
+          <w:tcPr/>
+          <w:p>
+            <w:pPr>
+              <w:pStyle w:val="Compact"/>
+            </w:pPr>
+            <w:r>
+              <w:t xml:space="preserve">2026-04-10</w:t>
+            </w:r>
+          </w:p>
+        </w:tc>
+        <w:tc>
+          <w:tcPr/>
+          <w:p>
+            <w:pPr>
+              <w:pStyle w:val="Compact"/>
+            </w:pPr>
+            <w:r>
+              <w:t xml:space="preserve">Blue Ridge Automation</w:t>
+            </w:r>
+          </w:p>
+        </w:tc>
+        <w:tc>
+          <w:tcPr/>
+          <w:p>
+            <w:pPr>
+              <w:pStyle w:val="Compact"/>
+            </w:pPr>
             <w:r>
               <w:rPr>
                 <w:b/>
                 <w:bCs/>
               </w:rPr>
+              <w:t xml:space="preserve">§2.1–2.5, §5.3, §5.20, §6.19, §7.19 — Location model restructure (LocationType / LocationTypeDefinition / LocationAttributeDefinition).</w:t>
+            </w:r>
+            <w:r>
               <w:t xml:space="preserve"> </w:t>
             </w:r>
+            <w:r>
+              <w:t xml:space="preserve">FDS-05-008 NEW; FDS-05-004, FDS-05-020, FDS-06-019, FDS-07-019 updated. Word table styling added.</w:t>
+            </w:r>
+          </w:p>
+        </w:tc>
+      </w:tr>
+      <w:tr>
+        <w:tc>
+          <w:tcPr>
+            <w:shd w:val="clear" w:color="auto" w:fill="F2F2F2"/>
+          </w:tcPr>
+          <w:tcPr/>
+          <w:p>
+            <w:pPr>
+              <w:pStyle w:val="Compact"/>
+            </w:pPr>
+            <w:r>
+              <w:t xml:space="preserve">0.3</w:t>
+            </w:r>
+          </w:p>
+        </w:tc>
+        <w:tc>
+          <w:tcPr>
+            <w:shd w:val="clear" w:color="auto" w:fill="F2F2F2"/>
+          </w:tcPr>
+          <w:tcPr/>
+          <w:p>
+            <w:pPr>
+              <w:pStyle w:val="Compact"/>
+            </w:pPr>
+            <w:r>
+              <w:t xml:space="preserve">2026-04-09</w:t>
+            </w:r>
+          </w:p>
+        </w:tc>
+        <w:tc>
+          <w:tcPr>
+            <w:shd w:val="clear" w:color="auto" w:fill="F2F2F2"/>
+          </w:tcPr>
+          <w:tcPr/>
+          <w:p>
+            <w:pPr>
+              <w:pStyle w:val="Compact"/>
+            </w:pPr>
+            <w:r>
+              <w:t xml:space="preserve">Blue Ridge Automation</w:t>
+            </w:r>
+          </w:p>
+        </w:tc>
+        <w:tc>
+          <w:tcPr>
+            <w:shd w:val="clear" w:color="auto" w:fill="F2F2F2"/>
+          </w:tcPr>
+          <w:tcPr/>
+          <w:p>
+            <w:pPr>
+              <w:pStyle w:val="Compact"/>
+            </w:pPr>
             <w:r>
               <w:rPr>
                 <w:b/>
                 <w:bCs/>
               </w:rPr>
-              <w:t xml:space="preserve">LocationAttribute.</w:t>
+              <w:t xml:space="preserve">§2.2, §2.3 — Naming convention to UpperCamelCase; Department merged into Area; Enterprise added to ISA-95 hierarchy.</w:t>
             </w:r>
             <w:r>
               <w:t xml:space="preserve"> </w:t>
             </w:r>
             <w:r>
-              <w:t xml:space="preserve">Per Jacques’s 2026-04-24 OIR review, Auto-Finish on Target (FDS-06-028) gains two additions: (1) a PLC confirmation BIT that must fire before the WO-close event — belt-and-suspenders with the cumulative-count threshold (count crosses target AND PLC confirms, not either-or); (2) a per-Terminal</w:t>
-            </w:r>
-            <w:r>
-              <w:t xml:space="preserve"> </w:t>
-            </w:r>
-            <w:r>
-              <w:rPr>
-                <w:rStyle w:val="VerbatimChar"/>
-              </w:rPr>
-              <w:t xml:space="preserve">RequiresCompletionConfirm</w:t>
-            </w:r>
-            <w:r>
-              <w:t xml:space="preserve"> </w:t>
-            </w:r>
-            <w:r>
-              <w:t xml:space="preserve">LocationAttribute that toggles a large</w:t>
-            </w:r>
-            <w:r>
-              <w:t xml:space="preserve"> </w:t>
-            </w:r>
-            <w:r>
-              <w:t xml:space="preserve">“Confirm Completion”</w:t>
-            </w:r>
-            <w:r>
-              <w:t xml:space="preserve"> </w:t>
-            </w:r>
-            <w:r>
-              <w:t xml:space="preserve">button UX vs a passive popup (</w:t>
-            </w:r>
-            <w:r>
-              <w:t xml:space="preserve">“WorkOrder/Tray/Container Completed”</w:t>
-            </w:r>
-            <w:r>
-              <w:t xml:space="preserve">). Some lines require physical operator acknowledgement at a fixed 1:1 terminal, others don’t. FDS-06-028 extended. New</w:t>
-            </w:r>
-            <w:r>
-              <w:t xml:space="preserve"> </w:t>
-            </w:r>
-            <w:r>
-              <w:rPr>
-                <w:rStyle w:val="VerbatimChar"/>
-              </w:rPr>
-              <w:t xml:space="preserve">LocationAttributeDefinition</w:t>
-            </w:r>
-            <w:r>
-              <w:t xml:space="preserve"> </w:t>
-            </w:r>
-            <w:r>
-              <w:t xml:space="preserve">seed row on</w:t>
-            </w:r>
-            <w:r>
-              <w:t xml:space="preserve"> </w:t>
-            </w:r>
-            <w:r>
-              <w:rPr>
-                <w:rStyle w:val="VerbatimChar"/>
-              </w:rPr>
-              <w:t xml:space="preserve">Terminal</w:t>
-            </w:r>
-            <w:r>
-              <w:t xml:space="preserve"> </w:t>
-            </w:r>
-            <w:r>
-              <w:t xml:space="preserve">LocationTypeDefinition. ERD + Arc 2 Plan Phase 6 updated.</w:t>
+              <w:t xml:space="preserve">FDS-02-001, FDS-02-003 updated.</w:t>
             </w:r>
           </w:p>
         </w:tc>
@@ -1744,18 +1371,18 @@
               <w:pStyle w:val="Compact"/>
             </w:pPr>
             <w:r>
-              <w:t xml:space="preserve">0.11f</w:t>
-            </w:r>
-          </w:p>
-        </w:tc>
-        <w:tc>
-          <w:tcPr/>
-          <w:p>
-            <w:pPr>
-              <w:pStyle w:val="Compact"/>
-            </w:pPr>
-            <w:r>
-              <w:t xml:space="preserve">2026-04-24</w:t>
+              <w:t xml:space="preserve">0.2</w:t>
+            </w:r>
+          </w:p>
+        </w:tc>
+        <w:tc>
+          <w:tcPr/>
+          <w:p>
+            <w:pPr>
+              <w:pStyle w:val="Compact"/>
+            </w:pPr>
+            <w:r>
+              <w:t xml:space="preserve">2026-04-09</w:t>
             </w:r>
           </w:p>
         </w:tc>
@@ -1781,121 +1408,13 @@
                 <w:b/>
                 <w:bCs/>
               </w:rPr>
-              <w:t xml:space="preserve">§5.1 OI-23 — LOT derived quantities implemented as a view, not materialized columns.</w:t>
+              <w:t xml:space="preserve">§1.4, §1.6, §2.5, §3.6, §4.2, §5.4, §5.5, §6.3, §6.5, §6.6, §6.10, §10.3 — OI/UJ design decisions integrated (OI-01, OI-08, OI-09 resolved).</w:t>
             </w:r>
             <w:r>
               <w:t xml:space="preserve"> </w:t>
             </w:r>
             <w:r>
-              <w:t xml:space="preserve">Per Jacques’s 2026-04-24 OIR review: use a SQL view (</w:t>
-            </w:r>
-            <w:r>
-              <w:rPr>
-                <w:rStyle w:val="VerbatimChar"/>
-              </w:rPr>
-              <w:t xml:space="preserve">Lots.v_LotDerivedQuantities</w:t>
-            </w:r>
-            <w:r>
-              <w:t xml:space="preserve">) computing</w:t>
-            </w:r>
-            <w:r>
-              <w:t xml:space="preserve"> </w:t>
-            </w:r>
-            <w:r>
-              <w:rPr>
-                <w:rStyle w:val="VerbatimChar"/>
-              </w:rPr>
-              <w:t xml:space="preserve">TotalInProcess</w:t>
-            </w:r>
-            <w:r>
-              <w:t xml:space="preserve"> </w:t>
-            </w:r>
-            <w:r>
-              <w:t xml:space="preserve">and</w:t>
-            </w:r>
-            <w:r>
-              <w:t xml:space="preserve"> </w:t>
-            </w:r>
-            <w:r>
-              <w:rPr>
-                <w:rStyle w:val="VerbatimChar"/>
-              </w:rPr>
-              <w:t xml:space="preserve">InventoryAvailable</w:t>
-            </w:r>
-            <w:r>
-              <w:t xml:space="preserve"> </w:t>
-            </w:r>
-            <w:r>
-              <w:t xml:space="preserve">at read time from</w:t>
-            </w:r>
-            <w:r>
-              <w:t xml:space="preserve"> </w:t>
-            </w:r>
-            <w:r>
-              <w:rPr>
-                <w:rStyle w:val="VerbatimChar"/>
-              </w:rPr>
-              <w:t xml:space="preserve">Lots.Lot.PieceCount</w:t>
-            </w:r>
-            <w:r>
-              <w:t xml:space="preserve"> </w:t>
-            </w:r>
-            <w:r>
-              <w:t xml:space="preserve">+</w:t>
-            </w:r>
-            <w:r>
-              <w:t xml:space="preserve"> </w:t>
-            </w:r>
-            <w:r>
-              <w:rPr>
-                <w:rStyle w:val="VerbatimChar"/>
-              </w:rPr>
-              <w:t xml:space="preserve">Workorder.ProductionEvent</w:t>
-            </w:r>
-            <w:r>
-              <w:t xml:space="preserve"> </w:t>
-            </w:r>
-            <w:r>
-              <w:t xml:space="preserve">+</w:t>
-            </w:r>
-            <w:r>
-              <w:t xml:space="preserve"> </w:t>
-            </w:r>
-            <w:r>
-              <w:rPr>
-                <w:rStyle w:val="VerbatimChar"/>
-              </w:rPr>
-              <w:t xml:space="preserve">Workorder.ConsumptionEvent</w:t>
-            </w:r>
-            <w:r>
-              <w:t xml:space="preserve"> </w:t>
-            </w:r>
-            <w:r>
-              <w:t xml:space="preserve">aggregations. No materialized columns on</w:t>
-            </w:r>
-            <w:r>
-              <w:t xml:space="preserve"> </w:t>
-            </w:r>
-            <w:r>
-              <w:rPr>
-                <w:rStyle w:val="VerbatimChar"/>
-              </w:rPr>
-              <w:t xml:space="preserve">Lots.Lot</w:t>
-            </w:r>
-            <w:r>
-              <w:t xml:space="preserve">; no update-on-write. FDS-05-031 rewritten to specify the view-backed derivation and drop the</w:t>
-            </w:r>
-            <w:r>
-              <w:t xml:space="preserve"> </w:t>
-            </w:r>
-            <w:r>
-              <w:t xml:space="preserve">“may be materialized in a future phase”</w:t>
-            </w:r>
-            <w:r>
-              <w:t xml:space="preserve"> </w:t>
-            </w:r>
-            <w:r>
-              <w:t xml:space="preserve">option. Data Model v1.9e documents the view. Arc 2 Plan Phase 2 migration gains the view creation.</w:t>
+              <w:t xml:space="preserve">FRS references added throughout OI register.</w:t>
             </w:r>
           </w:p>
         </w:tc>
@@ -1911,7 +1430,7 @@
               <w:pStyle w:val="Compact"/>
             </w:pPr>
             <w:r>
-              <w:t xml:space="preserve">0.11e</w:t>
+              <w:t xml:space="preserve">0.1</w:t>
             </w:r>
           </w:p>
         </w:tc>
@@ -1925,7 +1444,7 @@
               <w:pStyle w:val="Compact"/>
             </w:pPr>
             <w:r>
-              <w:t xml:space="preserve">2026-04-24</w:t>
+              <w:t xml:space="preserve">2026-04-06</w:t>
             </w:r>
           </w:p>
         </w:tc>
@@ -1953,2288 +1472,7 @@
               <w:pStyle w:val="Compact"/>
             </w:pPr>
             <w:r>
-              <w:rPr>
-                <w:b/>
-                <w:bCs/>
-              </w:rPr>
-              <w:t xml:space="preserve">§2.5 / §4 OI-08 terminal-mode-by-assignment rule.</w:t>
-            </w:r>
-            <w:r>
-              <w:t xml:space="preserve"> </w:t>
-            </w:r>
-            <w:r>
-              <w:t xml:space="preserve">Per Jacques’s 2026-04-24 OIR review: the Terminal’s</w:t>
-            </w:r>
-            <w:r>
-              <w:t xml:space="preserve"> </w:t>
-            </w:r>
-            <w:r>
-              <w:rPr>
-                <w:b/>
-                <w:bCs/>
-              </w:rPr>
-              <w:t xml:space="preserve">parent Location tier determines its mode</w:t>
-            </w:r>
-            <w:r>
-              <w:t xml:space="preserve"> </w:t>
-            </w:r>
-            <w:r>
-              <w:t xml:space="preserve">— no separate</w:t>
-            </w:r>
-            <w:r>
-              <w:t xml:space="preserve"> </w:t>
-            </w:r>
-            <w:r>
-              <w:rPr>
-                <w:rStyle w:val="VerbatimChar"/>
-              </w:rPr>
-              <w:t xml:space="preserve">TerminalMode</w:t>
-            </w:r>
-            <w:r>
-              <w:t xml:space="preserve"> </w:t>
-            </w:r>
-            <w:r>
-              <w:t xml:space="preserve">LocationAttribute needed. A Terminal whose parent Location is a WorkCenter (or Cell) is Dedicated; a Terminal whose parent Location is an Area is Shared. FDS-02-010 rewritten with the parent-tier-derived rule. FDS-04-003 rewritten to match (same Dedicated/Shared semantics, different derivation). The</w:t>
-            </w:r>
-            <w:r>
-              <w:t xml:space="preserve"> </w:t>
-            </w:r>
-            <w:r>
-              <w:rPr>
-                <w:rStyle w:val="VerbatimChar"/>
-              </w:rPr>
-              <w:t xml:space="preserve">TerminalMode</w:t>
-            </w:r>
-            <w:r>
-              <w:t xml:space="preserve"> </w:t>
-            </w:r>
-            <w:r>
-              <w:t xml:space="preserve">LocationAttribute is superseded; the</w:t>
-            </w:r>
-            <w:r>
-              <w:t xml:space="preserve"> </w:t>
-            </w:r>
-            <w:r>
-              <w:rPr>
-                <w:rStyle w:val="VerbatimChar"/>
-              </w:rPr>
-              <w:t xml:space="preserve">DedicatedMachineLocationId</w:t>
-            </w:r>
-            <w:r>
-              <w:t xml:space="preserve"> </w:t>
-            </w:r>
-            <w:r>
-              <w:t xml:space="preserve">attribute is also retired (the machine context IS the parent when Dedicated). FDS-02-011 machine-context-lock rule unchanged. Arc 2 Plan Phase 1</w:t>
-            </w:r>
-            <w:r>
-              <w:t xml:space="preserve"> </w:t>
-            </w:r>
-            <w:r>
-              <w:rPr>
-                <w:rStyle w:val="VerbatimChar"/>
-              </w:rPr>
-              <w:t xml:space="preserve">Terminal_ResolveFromSession</w:t>
-            </w:r>
-            <w:r>
-              <w:t xml:space="preserve"> </w:t>
-            </w:r>
-            <w:r>
-              <w:t xml:space="preserve">proc spec already updated. ERD Location tab scope notes follow. No data-model schema change.</w:t>
-            </w:r>
-          </w:p>
-        </w:tc>
-      </w:tr>
-      <w:tr>
-        <w:tc>
-          <w:tcPr/>
-          <w:p>
-            <w:pPr>
-              <w:pStyle w:val="Compact"/>
-            </w:pPr>
-            <w:r>
-              <w:t xml:space="preserve">0.11d</w:t>
-            </w:r>
-          </w:p>
-        </w:tc>
-        <w:tc>
-          <w:tcPr/>
-          <w:p>
-            <w:pPr>
-              <w:pStyle w:val="Compact"/>
-            </w:pPr>
-            <w:r>
-              <w:t xml:space="preserve">2026-04-24</w:t>
-            </w:r>
-          </w:p>
-        </w:tc>
-        <w:tc>
-          <w:tcPr/>
-          <w:p>
-            <w:pPr>
-              <w:pStyle w:val="Compact"/>
-            </w:pPr>
-            <w:r>
-              <w:t xml:space="preserve">Blue Ridge Automation</w:t>
-            </w:r>
-          </w:p>
-        </w:tc>
-        <w:tc>
-          <w:tcPr/>
-          <w:p>
-            <w:pPr>
-              <w:pStyle w:val="Compact"/>
-            </w:pPr>
-            <w:r>
-              <w:rPr>
-                <w:b/>
-                <w:bCs/>
-              </w:rPr>
-              <w:t xml:space="preserve">§3.5 OI-18 extension — ItemLocation hierarchy cascade.</w:t>
-            </w:r>
-            <w:r>
-              <w:t xml:space="preserve"> </w:t>
-            </w:r>
-            <w:r>
-              <w:t xml:space="preserve">Per Jacques’s 2026-04-24 OIR review,</w:t>
-            </w:r>
-            <w:r>
-              <w:t xml:space="preserve"> </w:t>
-            </w:r>
-            <w:r>
-              <w:rPr>
-                <w:rStyle w:val="VerbatimChar"/>
-              </w:rPr>
-              <w:t xml:space="preserve">Parts.ItemLocation.LocationId</w:t>
-            </w:r>
-            <w:r>
-              <w:t xml:space="preserve"> </w:t>
-            </w:r>
-            <w:r>
-              <w:t xml:space="preserve">is broadened to support Area / WorkCenter / Cell tiers. Eligibility at a specific Cell = exact-match row OR any ancestor row. FDS-03-014 (Eligibility Map) rewritten with the cascade algorithm. FDS-03-015 (Eligibility Management) extended with Config Tool UI note for tier selection. FDS-03-018 (Consumption Metadata) clarified — metadata lives on the ItemLocation row at whatever tier is declared; when a Cell scan-in resolves to an ancestor ItemLocation row, that row’s consumption metadata applies. New helper proc</w:t>
-            </w:r>
-            <w:r>
-              <w:t xml:space="preserve"> </w:t>
-            </w:r>
-            <w:r>
-              <w:rPr>
-                <w:rStyle w:val="VerbatimChar"/>
-              </w:rPr>
-              <w:t xml:space="preserve">Parts.ItemLocation_IsEligible</w:t>
-            </w:r>
-            <w:r>
-              <w:t xml:space="preserve"> </w:t>
-            </w:r>
-            <w:r>
-              <w:t xml:space="preserve">specified. No column changes — the existing generic</w:t>
-            </w:r>
-            <w:r>
-              <w:t xml:space="preserve"> </w:t>
-            </w:r>
-            <w:r>
-              <w:rPr>
-                <w:rStyle w:val="VerbatimChar"/>
-              </w:rPr>
-              <w:t xml:space="preserve">LocationId</w:t>
-            </w:r>
-            <w:r>
-              <w:t xml:space="preserve"> </w:t>
-            </w:r>
-            <w:r>
-              <w:t xml:space="preserve">FK already supports any tier.</w:t>
-            </w:r>
-          </w:p>
-        </w:tc>
-      </w:tr>
-      <w:tr>
-        <w:tc>
-          <w:tcPr>
-            <w:shd w:val="clear" w:color="auto" w:fill="F2F2F2"/>
-          </w:tcPr>
-          <w:tcPr/>
-          <w:p>
-            <w:pPr>
-              <w:pStyle w:val="Compact"/>
-            </w:pPr>
-            <w:r>
-              <w:t xml:space="preserve">0.11c</w:t>
-            </w:r>
-          </w:p>
-        </w:tc>
-        <w:tc>
-          <w:tcPr>
-            <w:shd w:val="clear" w:color="auto" w:fill="F2F2F2"/>
-          </w:tcPr>
-          <w:tcPr/>
-          <w:p>
-            <w:pPr>
-              <w:pStyle w:val="Compact"/>
-            </w:pPr>
-            <w:r>
-              <w:t xml:space="preserve">2026-04-24</w:t>
-            </w:r>
-          </w:p>
-        </w:tc>
-        <w:tc>
-          <w:tcPr>
-            <w:shd w:val="clear" w:color="auto" w:fill="F2F2F2"/>
-          </w:tcPr>
-          <w:tcPr/>
-          <w:p>
-            <w:pPr>
-              <w:pStyle w:val="Compact"/>
-            </w:pPr>
-            <w:r>
-              <w:t xml:space="preserve">Blue Ridge Automation</w:t>
-            </w:r>
-          </w:p>
-        </w:tc>
-        <w:tc>
-          <w:tcPr>
-            <w:shd w:val="clear" w:color="auto" w:fill="F2F2F2"/>
-          </w:tcPr>
-          <w:tcPr/>
-          <w:p>
-            <w:pPr>
-              <w:pStyle w:val="Compact"/>
-            </w:pPr>
-            <w:r>
-              <w:rPr>
-                <w:b/>
-                <w:bCs/>
-              </w:rPr>
-              <w:t xml:space="preserve">§3 OI-12 correction —</w:t>
-            </w:r>
-            <w:r>
-              <w:rPr>
-                <w:b/>
-                <w:bCs/>
-              </w:rPr>
-              <w:t xml:space="preserve"> </w:t>
-            </w:r>
-            <w:r>
-              <w:rPr>
-                <w:rStyle w:val="VerbatimChar"/>
-                <w:b/>
-                <w:bCs/>
-              </w:rPr>
-              <w:t xml:space="preserve">MaxParts</w:t>
-            </w:r>
-            <w:r>
-              <w:rPr>
-                <w:b/>
-                <w:bCs/>
-              </w:rPr>
-              <w:t xml:space="preserve"> </w:t>
-            </w:r>
-            <w:r>
-              <w:rPr>
-                <w:b/>
-                <w:bCs/>
-              </w:rPr>
-              <w:t xml:space="preserve">reclassified as a Part attribute.</w:t>
-            </w:r>
-            <w:r>
-              <w:t xml:space="preserve"> </w:t>
-            </w:r>
-            <w:r>
-              <w:t xml:space="preserve">Per Jacques’s 2026-04-24 OIR review, the</w:t>
-            </w:r>
-            <w:r>
-              <w:t xml:space="preserve"> </w:t>
-            </w:r>
-            <w:r>
-              <w:rPr>
-                <w:rStyle w:val="VerbatimChar"/>
-              </w:rPr>
-              <w:t xml:space="preserve">MaxParts</w:t>
-            </w:r>
-            <w:r>
-              <w:t xml:space="preserve"> </w:t>
-            </w:r>
-            <w:r>
-              <w:t xml:space="preserve">cap belongs on</w:t>
-            </w:r>
-            <w:r>
-              <w:t xml:space="preserve"> </w:t>
-            </w:r>
-            <w:r>
-              <w:rPr>
-                <w:rStyle w:val="VerbatimChar"/>
-              </w:rPr>
-              <w:t xml:space="preserve">Parts.Item</w:t>
-            </w:r>
-            <w:r>
-              <w:t xml:space="preserve">, not on</w:t>
-            </w:r>
-            <w:r>
-              <w:t xml:space="preserve"> </w:t>
-            </w:r>
-            <w:r>
-              <w:rPr>
-                <w:rStyle w:val="VerbatimChar"/>
-              </w:rPr>
-              <w:t xml:space="preserve">Parts.ContainerConfig</w:t>
-            </w:r>
-            <w:r>
-              <w:t xml:space="preserve"> </w:t>
-            </w:r>
-            <w:r>
-              <w:t xml:space="preserve">— it’s evaluated when inventory is checked into a Location, against the Part identity. FDS-03-019 rewritten: target is</w:t>
-            </w:r>
-            <w:r>
-              <w:t xml:space="preserve"> </w:t>
-            </w:r>
-            <w:r>
-              <w:rPr>
-                <w:rStyle w:val="VerbatimChar"/>
-              </w:rPr>
-              <w:t xml:space="preserve">Parts.Item.MaxParts</w:t>
-            </w:r>
-            <w:r>
-              <w:t xml:space="preserve"> </w:t>
-            </w:r>
-            <w:r>
-              <w:t xml:space="preserve">(per-Item per-Location cap); validation fires on</w:t>
-            </w:r>
-            <w:r>
-              <w:t xml:space="preserve"> </w:t>
-            </w:r>
-            <w:r>
-              <w:rPr>
-                <w:rStyle w:val="VerbatimChar"/>
-              </w:rPr>
-              <w:t xml:space="preserve">LotMovement</w:t>
-            </w:r>
-            <w:r>
-              <w:t xml:space="preserve"> </w:t>
-            </w:r>
-            <w:r>
-              <w:t xml:space="preserve">to a Cell, summing existing pieces of this Item already at the destination Location + incoming quantity. Complementary FDS-03-020 (Location-scoped</w:t>
-            </w:r>
-            <w:r>
-              <w:t xml:space="preserve"> </w:t>
-            </w:r>
-            <w:r>
-              <w:rPr>
-                <w:rStyle w:val="VerbatimChar"/>
-              </w:rPr>
-              <w:t xml:space="preserve">LinesideLimit</w:t>
-            </w:r>
-            <w:r>
-              <w:t xml:space="preserve">) unchanged; the two caps are orthogonal. Data Model v1.9c carries the column relocation. SQL correction migration queued (DROP</w:t>
-            </w:r>
-            <w:r>
-              <w:t xml:space="preserve"> </w:t>
-            </w:r>
-            <w:r>
-              <w:rPr>
-                <w:rStyle w:val="VerbatimChar"/>
-              </w:rPr>
-              <w:t xml:space="preserve">Parts.ContainerConfig.MaxParts</w:t>
-            </w:r>
-            <w:r>
-              <w:t xml:space="preserve">, ADD</w:t>
-            </w:r>
-            <w:r>
-              <w:t xml:space="preserve"> </w:t>
-            </w:r>
-            <w:r>
-              <w:rPr>
-                <w:rStyle w:val="VerbatimChar"/>
-              </w:rPr>
-              <w:t xml:space="preserve">Parts.Item.MaxParts</w:t>
-            </w:r>
-            <w:r>
-              <w:t xml:space="preserve">, test 0019 update).</w:t>
-            </w:r>
-          </w:p>
-        </w:tc>
-      </w:tr>
-      <w:tr>
-        <w:tc>
-          <w:tcPr/>
-          <w:p>
-            <w:pPr>
-              <w:pStyle w:val="Compact"/>
-            </w:pPr>
-            <w:r>
-              <w:t xml:space="preserve">0.11b</w:t>
-            </w:r>
-          </w:p>
-        </w:tc>
-        <w:tc>
-          <w:tcPr/>
-          <w:p>
-            <w:pPr>
-              <w:pStyle w:val="Compact"/>
-            </w:pPr>
-            <w:r>
-              <w:t xml:space="preserve">2026-04-24</w:t>
-            </w:r>
-          </w:p>
-        </w:tc>
-        <w:tc>
-          <w:tcPr/>
-          <w:p>
-            <w:pPr>
-              <w:pStyle w:val="Compact"/>
-            </w:pPr>
-            <w:r>
-              <w:t xml:space="preserve">Blue Ridge Automation</w:t>
-            </w:r>
-          </w:p>
-        </w:tc>
-        <w:tc>
-          <w:tcPr/>
-          <w:p>
-            <w:pPr>
-              <w:pStyle w:val="Compact"/>
-            </w:pPr>
-            <w:r>
-              <w:rPr>
-                <w:b/>
-                <w:bCs/>
-              </w:rPr>
-              <w:t xml:space="preserve">§6.10 WorkOrderType correction (OI-07).</w:t>
-            </w:r>
-            <w:r>
-              <w:t xml:space="preserve"> </w:t>
-            </w:r>
-            <w:r>
-              <w:t xml:space="preserve">Jacques clarified 2026-04-24 that the 2026-04-20</w:t>
-            </w:r>
-            <w:r>
-              <w:t xml:space="preserve"> </w:t>
-            </w:r>
-            <w:r>
-              <w:t xml:space="preserve">“Recipe”</w:t>
-            </w:r>
-            <w:r>
-              <w:t xml:space="preserve"> </w:t>
-            </w:r>
-            <w:r>
-              <w:t xml:space="preserve">meeting note was mis-recorded — it was describing the</w:t>
-            </w:r>
-            <w:r>
-              <w:t xml:space="preserve"> </w:t>
-            </w:r>
-            <w:r>
-              <w:rPr>
-                <w:b/>
-                <w:bCs/>
-              </w:rPr>
-              <w:t xml:space="preserve">Production</w:t>
-            </w:r>
-            <w:r>
-              <w:t xml:space="preserve"> </w:t>
-            </w:r>
-            <w:r>
-              <w:t xml:space="preserve">work orders (MVP-LITE, invisible to operators) already in the design, not a separate type. Under MPP’s taxonomy,</w:t>
-            </w:r>
-            <w:r>
-              <w:t xml:space="preserve"> </w:t>
-            </w:r>
-            <w:r>
-              <w:rPr>
-                <w:rStyle w:val="VerbatimChar"/>
-              </w:rPr>
-              <w:t xml:space="preserve">Demand</w:t>
-            </w:r>
-            <w:r>
-              <w:t xml:space="preserve"> </w:t>
-            </w:r>
-            <w:r>
-              <w:t xml:space="preserve">= planned PM and</w:t>
-            </w:r>
-            <w:r>
-              <w:t xml:space="preserve"> </w:t>
-            </w:r>
-            <w:r>
-              <w:rPr>
-                <w:rStyle w:val="VerbatimChar"/>
-              </w:rPr>
-              <w:t xml:space="preserve">Maintenance</w:t>
-            </w:r>
-            <w:r>
-              <w:t xml:space="preserve"> </w:t>
-            </w:r>
-            <w:r>
-              <w:t xml:space="preserve">= emergency, both genuinely separate but both FUTURE (out of scope for this project). §6.10 edits: FDS-06-022 renamed</w:t>
-            </w:r>
-            <w:r>
-              <w:t xml:space="preserve"> </w:t>
-            </w:r>
-            <w:r>
-              <w:t xml:space="preserve">“Work Order Auto-Generation (Demand Type)”</w:t>
-            </w:r>
-            <w:r>
-              <w:t xml:space="preserve"> </w:t>
-            </w:r>
-            <w:r>
-              <w:t xml:space="preserve">→</w:t>
-            </w:r>
-            <w:r>
-              <w:t xml:space="preserve"> </w:t>
-            </w:r>
-            <w:r>
-              <w:t xml:space="preserve">“(Production Type)”</w:t>
-            </w:r>
-            <w:r>
-              <w:t xml:space="preserve">; FDS-06-025 seed table reduced from 3 active rows to 1 (</w:t>
-            </w:r>
-            <w:r>
-              <w:rPr>
-                <w:rStyle w:val="VerbatimChar"/>
-              </w:rPr>
-              <w:t xml:space="preserve">Production</w:t>
-            </w:r>
-            <w:r>
-              <w:t xml:space="preserve">), with</w:t>
-            </w:r>
-            <w:r>
-              <w:t xml:space="preserve"> </w:t>
-            </w:r>
-            <w:r>
-              <w:rPr>
-                <w:rStyle w:val="VerbatimChar"/>
-              </w:rPr>
-              <w:t xml:space="preserve">Demand</w:t>
-            </w:r>
-            <w:r>
-              <w:t xml:space="preserve"> </w:t>
-            </w:r>
-            <w:r>
-              <w:t xml:space="preserve">and</w:t>
-            </w:r>
-            <w:r>
-              <w:t xml:space="preserve"> </w:t>
-            </w:r>
-            <w:r>
-              <w:rPr>
-                <w:rStyle w:val="VerbatimChar"/>
-              </w:rPr>
-              <w:t xml:space="preserve">Maintenance</w:t>
-            </w:r>
-            <w:r>
-              <w:t xml:space="preserve"> </w:t>
-            </w:r>
-            <w:r>
-              <w:t xml:space="preserve">moved to a FUTURE-only list; FDS-06-026 Maintenance FUTURE section retained as the schema-hook reference;</w:t>
-            </w:r>
-            <w:r>
-              <w:t xml:space="preserve"> </w:t>
-            </w:r>
-            <w:r>
-              <w:rPr>
-                <w:b/>
-                <w:bCs/>
-              </w:rPr>
-              <w:t xml:space="preserve">FDS-06-027 Recipe Work Orders — DELETED entirely</w:t>
-            </w:r>
-            <w:r>
-              <w:t xml:space="preserve"> </w:t>
-            </w:r>
-            <w:r>
-              <w:t xml:space="preserve">(no such concept exists); FDS-06-028 auto-finish language updated from</w:t>
-            </w:r>
-            <w:r>
-              <w:t xml:space="preserve"> </w:t>
-            </w:r>
-            <w:r>
-              <w:t xml:space="preserve">“Demand Work Orders”</w:t>
-            </w:r>
-            <w:r>
-              <w:t xml:space="preserve"> </w:t>
-            </w:r>
-            <w:r>
-              <w:t xml:space="preserve">→</w:t>
-            </w:r>
-            <w:r>
-              <w:t xml:space="preserve"> </w:t>
-            </w:r>
-            <w:r>
-              <w:t xml:space="preserve">“Production Work Orders”</w:t>
-            </w:r>
-            <w:r>
-              <w:t xml:space="preserve">. Data model v1.9b, OIR v2.9, Arc 2 Plan v0.2, and ERD updated in matching commits. SQL seed correction queued (versioned migration + test 0019 update) — not executed this turn.</w:t>
-            </w:r>
-          </w:p>
-        </w:tc>
-      </w:tr>
-      <w:tr>
-        <w:tc>
-          <w:tcPr>
-            <w:shd w:val="clear" w:color="auto" w:fill="F2F2F2"/>
-          </w:tcPr>
-          <w:tcPr/>
-          <w:p>
-            <w:pPr>
-              <w:pStyle w:val="Compact"/>
-            </w:pPr>
-            <w:r>
-              <w:t xml:space="preserve">0.11</w:t>
-            </w:r>
-          </w:p>
-        </w:tc>
-        <w:tc>
-          <w:tcPr>
-            <w:shd w:val="clear" w:color="auto" w:fill="F2F2F2"/>
-          </w:tcPr>
-          <w:tcPr/>
-          <w:p>
-            <w:pPr>
-              <w:pStyle w:val="Compact"/>
-            </w:pPr>
-            <w:r>
-              <w:t xml:space="preserve">2026-04-24</w:t>
-            </w:r>
-          </w:p>
-        </w:tc>
-        <w:tc>
-          <w:tcPr>
-            <w:shd w:val="clear" w:color="auto" w:fill="F2F2F2"/>
-          </w:tcPr>
-          <w:tcPr/>
-          <w:p>
-            <w:pPr>
-              <w:pStyle w:val="Compact"/>
-            </w:pPr>
-            <w:r>
-              <w:t xml:space="preserve">Blue Ridge Automation</w:t>
-            </w:r>
-          </w:p>
-        </w:tc>
-        <w:tc>
-          <w:tcPr>
-            <w:shd w:val="clear" w:color="auto" w:fill="F2F2F2"/>
-          </w:tcPr>
-          <w:tcPr/>
-          <w:p>
-            <w:pPr>
-              <w:pStyle w:val="Compact"/>
-            </w:pPr>
-            <w:r>
-              <w:rPr>
-                <w:b/>
-                <w:bCs/>
-              </w:rPr>
-              <w:t xml:space="preserve">Arc 2 model revisions (2026-04-23 session) — Tool/Cavity on Lot, ProductionEvent checkpoint shape, Identifier Sequences, cavity-parallel LOT pattern codified.</w:t>
-            </w:r>
-            <w:r>
-              <w:t xml:space="preserve"> </w:t>
-            </w:r>
-            <w:r>
-              <w:t xml:space="preserve">New requirements land across §§3.4, 5.1, 5.2, 5.3, 5.4, 5.5, 6.2, 6.10, plus a new section on identifier sequences:</w:t>
-            </w:r>
-            <w:r>
-              <w:t xml:space="preserve">•</w:t>
-            </w:r>
-            <w:r>
-              <w:t xml:space="preserve"> </w:t>
-            </w:r>
-            <w:r>
-              <w:rPr>
-                <w:b/>
-                <w:bCs/>
-              </w:rPr>
-              <w:t xml:space="preserve">§3.4 FDS-03-017a rewritten</w:t>
-            </w:r>
-            <w:r>
-              <w:t xml:space="preserve"> </w:t>
-            </w:r>
-            <w:r>
-              <w:t xml:space="preserve">—</w:t>
-            </w:r>
-            <w:r>
-              <w:t xml:space="preserve"> </w:t>
-            </w:r>
-            <w:r>
-              <w:rPr>
-                <w:rStyle w:val="VerbatimChar"/>
-              </w:rPr>
-              <w:t xml:space="preserve">ProductionEvent</w:t>
-            </w:r>
-            <w:r>
-              <w:t xml:space="preserve"> </w:t>
-            </w:r>
-            <w:r>
-              <w:t xml:space="preserve">is now a checkpoint shape (cumulative</w:t>
-            </w:r>
-            <w:r>
-              <w:t xml:space="preserve"> </w:t>
-            </w:r>
-            <w:r>
-              <w:rPr>
-                <w:rStyle w:val="VerbatimChar"/>
-              </w:rPr>
-              <w:t xml:space="preserve">ShotCount</w:t>
-            </w:r>
-            <w:r>
-              <w:t xml:space="preserve">/</w:t>
-            </w:r>
-            <w:r>
-              <w:rPr>
-                <w:rStyle w:val="VerbatimChar"/>
-              </w:rPr>
-              <w:t xml:space="preserve">ScrapCount</w:t>
-            </w:r>
-            <w:r>
-              <w:t xml:space="preserve">, no</w:t>
-            </w:r>
-            <w:r>
-              <w:t xml:space="preserve"> </w:t>
-            </w:r>
-            <w:r>
-              <w:rPr>
-                <w:rStyle w:val="VerbatimChar"/>
-              </w:rPr>
-              <w:t xml:space="preserve">DieIdentifier</w:t>
-            </w:r>
-            <w:r>
-              <w:t xml:space="preserve">/</w:t>
-            </w:r>
-            <w:r>
-              <w:rPr>
-                <w:rStyle w:val="VerbatimChar"/>
-              </w:rPr>
-              <w:t xml:space="preserve">CavityNumber</w:t>
-            </w:r>
-            <w:r>
-              <w:t xml:space="preserve">/</w:t>
-            </w:r>
-            <w:r>
-              <w:rPr>
-                <w:rStyle w:val="VerbatimChar"/>
-              </w:rPr>
-              <w:t xml:space="preserve">LocationId</w:t>
-            </w:r>
-            <w:r>
-              <w:t xml:space="preserve">/</w:t>
-            </w:r>
-            <w:r>
-              <w:rPr>
-                <w:rStyle w:val="VerbatimChar"/>
-              </w:rPr>
-              <w:t xml:space="preserve">ItemId</w:t>
-            </w:r>
-            <w:r>
-              <w:t xml:space="preserve">/per-event</w:t>
-            </w:r>
-            <w:r>
-              <w:t xml:space="preserve"> </w:t>
-            </w:r>
-            <w:r>
-              <w:rPr>
-                <w:rStyle w:val="VerbatimChar"/>
-              </w:rPr>
-              <w:t xml:space="preserve">GoodCount</w:t>
-            </w:r>
-            <w:r>
-              <w:t xml:space="preserve">/</w:t>
-            </w:r>
-            <w:r>
-              <w:rPr>
-                <w:rStyle w:val="VerbatimChar"/>
-              </w:rPr>
-              <w:t xml:space="preserve">NoGoodCount</w:t>
-            </w:r>
-            <w:r>
-              <w:t xml:space="preserve">).</w:t>
-            </w:r>
-            <w:r>
-              <w:t xml:space="preserve"> </w:t>
-            </w:r>
-            <w:r>
-              <w:rPr>
-                <w:rStyle w:val="VerbatimChar"/>
-              </w:rPr>
-              <w:t xml:space="preserve">Lot.ToolId</w:t>
-            </w:r>
-            <w:r>
-              <w:t xml:space="preserve">/</w:t>
-            </w:r>
-            <w:r>
-              <w:rPr>
-                <w:rStyle w:val="VerbatimChar"/>
-              </w:rPr>
-              <w:t xml:space="preserve">Lot.ToolCavityId</w:t>
-            </w:r>
-            <w:r>
-              <w:t xml:space="preserve"> </w:t>
-            </w:r>
-            <w:r>
-              <w:t xml:space="preserve">are the system of record — derived at read time via join, not stored on the event.</w:t>
-            </w:r>
-            <w:r>
-              <w:t xml:space="preserve">•</w:t>
-            </w:r>
-            <w:r>
-              <w:t xml:space="preserve"> </w:t>
-            </w:r>
-            <w:r>
-              <w:rPr>
-                <w:b/>
-                <w:bCs/>
-              </w:rPr>
-              <w:t xml:space="preserve">§5.1 FDS-05-003 revised</w:t>
-            </w:r>
-            <w:r>
-              <w:t xml:space="preserve"> </w:t>
-            </w:r>
-            <w:r>
-              <w:t xml:space="preserve">—</w:t>
-            </w:r>
-            <w:r>
-              <w:t xml:space="preserve"> </w:t>
-            </w:r>
-            <w:r>
-              <w:rPr>
-                <w:rStyle w:val="VerbatimChar"/>
-              </w:rPr>
-              <w:t xml:space="preserve">Lot.ToolId</w:t>
-            </w:r>
-            <w:r>
-              <w:t xml:space="preserve"> </w:t>
-            </w:r>
-            <w:r>
-              <w:t xml:space="preserve">+</w:t>
-            </w:r>
-            <w:r>
-              <w:t xml:space="preserve"> </w:t>
-            </w:r>
-            <w:r>
-              <w:rPr>
-                <w:rStyle w:val="VerbatimChar"/>
-              </w:rPr>
-              <w:t xml:space="preserve">Lot.ToolCavityId</w:t>
-            </w:r>
-            <w:r>
-              <w:t xml:space="preserve"> </w:t>
-            </w:r>
-            <w:r>
-              <w:t xml:space="preserve">added to the LOT attributes table. Pre-v0.11</w:t>
-            </w:r>
-            <w:r>
-              <w:t xml:space="preserve"> </w:t>
-            </w:r>
-            <w:r>
-              <w:rPr>
-                <w:rStyle w:val="VerbatimChar"/>
-              </w:rPr>
-              <w:t xml:space="preserve">DieNumber</w:t>
-            </w:r>
-            <w:r>
-              <w:t xml:space="preserve">/</w:t>
-            </w:r>
-            <w:r>
-              <w:rPr>
-                <w:rStyle w:val="VerbatimChar"/>
-              </w:rPr>
-              <w:t xml:space="preserve">CavityNumber</w:t>
-            </w:r>
-            <w:r>
-              <w:t xml:space="preserve"> </w:t>
-            </w:r>
-            <w:r>
-              <w:t xml:space="preserve">NVARCHAR attributes marked legacy.</w:t>
-            </w:r>
-            <w:r>
-              <w:t xml:space="preserve">•</w:t>
-            </w:r>
-            <w:r>
-              <w:t xml:space="preserve"> </w:t>
-            </w:r>
-            <w:r>
-              <w:rPr>
-                <w:b/>
-                <w:bCs/>
-              </w:rPr>
-              <w:t xml:space="preserve">§5.1 FDS-05-034 (NEW)</w:t>
-            </w:r>
-            <w:r>
-              <w:t xml:space="preserve"> </w:t>
-            </w:r>
-            <w:r>
-              <w:t xml:space="preserve">— Die-cast-origin LOTs SHALL require</w:t>
-            </w:r>
-            <w:r>
-              <w:t xml:space="preserve"> </w:t>
-            </w:r>
-            <w:r>
-              <w:rPr>
-                <w:rStyle w:val="VerbatimChar"/>
-              </w:rPr>
-              <w:t xml:space="preserve">ToolId</w:t>
-            </w:r>
-            <w:r>
-              <w:t xml:space="preserve"> </w:t>
-            </w:r>
-            <w:r>
-              <w:t xml:space="preserve">+</w:t>
-            </w:r>
-            <w:r>
-              <w:t xml:space="preserve"> </w:t>
-            </w:r>
-            <w:r>
-              <w:rPr>
-                <w:rStyle w:val="VerbatimChar"/>
-              </w:rPr>
-              <w:t xml:space="preserve">ToolCavityId</w:t>
-            </w:r>
-            <w:r>
-              <w:t xml:space="preserve"> </w:t>
-            </w:r>
-            <w:r>
-              <w:t xml:space="preserve">at</w:t>
-            </w:r>
-            <w:r>
-              <w:t xml:space="preserve"> </w:t>
-            </w:r>
-            <w:r>
-              <w:rPr>
-                <w:rStyle w:val="VerbatimChar"/>
-              </w:rPr>
-              <w:t xml:space="preserve">Lot_Create</w:t>
-            </w:r>
-            <w:r>
-              <w:t xml:space="preserve">, validated against active</w:t>
-            </w:r>
-            <w:r>
-              <w:t xml:space="preserve"> </w:t>
-            </w:r>
-            <w:r>
-              <w:rPr>
-                <w:rStyle w:val="VerbatimChar"/>
-              </w:rPr>
-              <w:t xml:space="preserve">Tools.ToolAssignment</w:t>
-            </w:r>
-            <w:r>
-              <w:t xml:space="preserve"> </w:t>
-            </w:r>
-            <w:r>
-              <w:t xml:space="preserve">on the Cell +</w:t>
-            </w:r>
-            <w:r>
-              <w:t xml:space="preserve"> </w:t>
-            </w:r>
-            <w:r>
-              <w:rPr>
-                <w:rStyle w:val="VerbatimChar"/>
-              </w:rPr>
-              <w:t xml:space="preserve">ToolCavity</w:t>
-            </w:r>
-            <w:r>
-              <w:t xml:space="preserve"> </w:t>
-            </w:r>
-            <w:r>
-              <w:t xml:space="preserve">belongs to Tool + Cavity Active.</w:t>
-            </w:r>
-            <w:r>
-              <w:t xml:space="preserve">•</w:t>
-            </w:r>
-            <w:r>
-              <w:t xml:space="preserve"> </w:t>
-            </w:r>
-            <w:r>
-              <w:rPr>
-                <w:b/>
-                <w:bCs/>
-              </w:rPr>
-              <w:t xml:space="preserve">§5.1 FDS-05-035 (NEW)</w:t>
-            </w:r>
-            <w:r>
-              <w:t xml:space="preserve"> </w:t>
-            </w:r>
-            <w:r>
-              <w:t xml:space="preserve">— Tools system-of-record rule: Tool / Cavity live on</w:t>
-            </w:r>
-            <w:r>
-              <w:t xml:space="preserve"> </w:t>
-            </w:r>
-            <w:r>
-              <w:rPr>
-                <w:rStyle w:val="VerbatimChar"/>
-              </w:rPr>
-              <w:t xml:space="preserve">Lot</w:t>
-            </w:r>
-            <w:r>
-              <w:t xml:space="preserve">, NOT on</w:t>
-            </w:r>
-            <w:r>
-              <w:t xml:space="preserve"> </w:t>
-            </w:r>
-            <w:r>
-              <w:rPr>
-                <w:rStyle w:val="VerbatimChar"/>
-              </w:rPr>
-              <w:t xml:space="preserve">ProductionEvent</w:t>
-            </w:r>
-            <w:r>
-              <w:t xml:space="preserve">. Downstream LOTs do NOT carry the FKs — Honda-trace via</w:t>
-            </w:r>
-            <w:r>
-              <w:t xml:space="preserve"> </w:t>
-            </w:r>
-            <w:r>
-              <w:rPr>
-                <w:rStyle w:val="VerbatimChar"/>
-              </w:rPr>
-              <w:t xml:space="preserve">LotGenealogy</w:t>
-            </w:r>
-            <w:r>
-              <w:t xml:space="preserve"> </w:t>
-            </w:r>
-            <w:r>
-              <w:t xml:space="preserve">recursive traversal.</w:t>
-            </w:r>
-            <w:r>
-              <w:t xml:space="preserve">•</w:t>
-            </w:r>
-            <w:r>
-              <w:t xml:space="preserve"> </w:t>
-            </w:r>
-            <w:r>
-              <w:rPr>
-                <w:b/>
-                <w:bCs/>
-              </w:rPr>
-              <w:t xml:space="preserve">§5.2 FDS-05-004 revised</w:t>
-            </w:r>
-            <w:r>
-              <w:t xml:space="preserve"> </w:t>
-            </w:r>
-            <w:r>
-              <w:t xml:space="preserve">— Die Cast LOT creation step now auto-populates Tool from</w:t>
-            </w:r>
-            <w:r>
-              <w:t xml:space="preserve"> </w:t>
-            </w:r>
-            <w:r>
-              <w:rPr>
-                <w:rStyle w:val="VerbatimChar"/>
-              </w:rPr>
-              <w:t xml:space="preserve">ToolAssignment_ListActiveByCell</w:t>
-            </w:r>
-            <w:r>
-              <w:t xml:space="preserve">; operator confirms; elevated Edit triggers inline</w:t>
-            </w:r>
-            <w:r>
-              <w:t xml:space="preserve"> </w:t>
-            </w:r>
-            <w:r>
-              <w:rPr>
-                <w:rStyle w:val="VerbatimChar"/>
-              </w:rPr>
-              <w:t xml:space="preserve">ToolAssignment_Release</w:t>
-            </w:r>
-            <w:r>
-              <w:t xml:space="preserve">/</w:t>
-            </w:r>
-            <w:r>
-              <w:rPr>
-                <w:rStyle w:val="VerbatimChar"/>
-              </w:rPr>
-              <w:t xml:space="preserve">_Assign</w:t>
-            </w:r>
-            <w:r>
-              <w:t xml:space="preserve">. Other areas (trim, machining, assembly) do not require operator Tool validation at LOT create.</w:t>
-            </w:r>
-            <w:r>
-              <w:t xml:space="preserve">•</w:t>
-            </w:r>
-            <w:r>
-              <w:t xml:space="preserve"> </w:t>
-            </w:r>
-            <w:r>
-              <w:rPr>
-                <w:b/>
-                <w:bCs/>
-              </w:rPr>
-              <w:t xml:space="preserve">§5.3 FDS-05-036 (NEW)</w:t>
-            </w:r>
-            <w:r>
-              <w:t xml:space="preserve"> </w:t>
-            </w:r>
-            <w:r>
-              <w:t xml:space="preserve">— LOT creation is</w:t>
-            </w:r>
-            <w:r>
-              <w:t xml:space="preserve"> </w:t>
-            </w:r>
-            <w:r>
-              <w:rPr>
-                <w:b/>
-                <w:bCs/>
-              </w:rPr>
-              <w:t xml:space="preserve">lazy and operator-driven</w:t>
-            </w:r>
-            <w:r>
-              <w:t xml:space="preserve">. No auto-create of N LOTs at run start. Physical-but-unlogged baskets exist until the operator logs them. Tool+Cavity assignment happens at</w:t>
-            </w:r>
-            <w:r>
-              <w:t xml:space="preserve"> </w:t>
-            </w:r>
-            <w:r>
-              <w:rPr>
-                <w:rStyle w:val="VerbatimChar"/>
-              </w:rPr>
-              <w:t xml:space="preserve">Lot_Create</w:t>
-            </w:r>
-            <w:r>
-              <w:t xml:space="preserve"> </w:t>
-            </w:r>
-            <w:r>
-              <w:t xml:space="preserve">time.</w:t>
-            </w:r>
-            <w:r>
-              <w:t xml:space="preserve">•</w:t>
-            </w:r>
-            <w:r>
-              <w:t xml:space="preserve"> </w:t>
-            </w:r>
-            <w:r>
-              <w:rPr>
-                <w:b/>
-                <w:bCs/>
-              </w:rPr>
-              <w:t xml:space="preserve">§5.3 FDS-05-037 (NEW)</w:t>
-            </w:r>
-            <w:r>
-              <w:t xml:space="preserve"> </w:t>
-            </w:r>
-            <w:r>
-              <w:t xml:space="preserve">— LOT close semantics: Component LOTs (Die Cast, Trim, intermediate Machining) close via explicit operator</w:t>
-            </w:r>
-            <w:r>
-              <w:t xml:space="preserve"> </w:t>
-            </w:r>
-            <w:r>
-              <w:t xml:space="preserve">“Complete + Move”</w:t>
-            </w:r>
-            <w:r>
-              <w:t xml:space="preserve"> </w:t>
-            </w:r>
-            <w:r>
-              <w:t xml:space="preserve">action — combined status transition + movement in one atomic UI action. Cavity state changes do NOT auto-close LOTs. Finished-goods LOTs MAY auto-close on container fill (§6 — Container_Complete).</w:t>
-            </w:r>
-            <w:r>
-              <w:t xml:space="preserve">•</w:t>
-            </w:r>
-            <w:r>
-              <w:t xml:space="preserve"> </w:t>
-            </w:r>
-            <w:r>
-              <w:rPr>
-                <w:b/>
-                <w:bCs/>
-              </w:rPr>
-              <w:t xml:space="preserve">§5.4 restated</w:t>
-            </w:r>
-            <w:r>
-              <w:t xml:space="preserve"> </w:t>
-            </w:r>
-            <w:r>
-              <w:t xml:space="preserve">— Cavity-parallel LOTs at Die Cast are</w:t>
-            </w:r>
-            <w:r>
-              <w:t xml:space="preserve"> </w:t>
-            </w:r>
-            <w:r>
-              <w:rPr>
-                <w:b/>
-                <w:bCs/>
-              </w:rPr>
-              <w:t xml:space="preserve">peers, not sublots</w:t>
-            </w:r>
-            <w:r>
-              <w:t xml:space="preserve"> </w:t>
-            </w:r>
-            <w:r>
-              <w:t xml:space="preserve">(N active cavities → N parallel independent LOTs, no parent/child FK). Machining sub-LOT split remains a sublot pattern (parent FK + split genealogy). The 2026-04-20 FDS-05-023 per-cavity-sublot requirement is superseded — per-cavity LOTs are now first-class LOTs with</w:t>
-            </w:r>
-            <w:r>
-              <w:t xml:space="preserve"> </w:t>
-            </w:r>
-            <w:r>
-              <w:rPr>
-                <w:rStyle w:val="VerbatimChar"/>
-              </w:rPr>
-              <w:t xml:space="preserve">ToolCavityId</w:t>
-            </w:r>
-            <w:r>
-              <w:t xml:space="preserve"> </w:t>
-            </w:r>
-            <w:r>
-              <w:t xml:space="preserve">set.</w:t>
-            </w:r>
-            <w:r>
-              <w:t xml:space="preserve">•</w:t>
-            </w:r>
-            <w:r>
-              <w:t xml:space="preserve"> </w:t>
-            </w:r>
-            <w:r>
-              <w:rPr>
-                <w:b/>
-                <w:bCs/>
-              </w:rPr>
-              <w:t xml:space="preserve">§5.5 FDS-05-030 (NEW)</w:t>
-            </w:r>
-            <w:r>
-              <w:t xml:space="preserve"> </w:t>
-            </w:r>
-            <w:r>
-              <w:t xml:space="preserve">— Post-merge LOT SHALL have</w:t>
-            </w:r>
-            <w:r>
-              <w:t xml:space="preserve"> </w:t>
-            </w:r>
-            <w:r>
-              <w:rPr>
-                <w:rStyle w:val="VerbatimChar"/>
-              </w:rPr>
-              <w:t xml:space="preserve">ToolId = NULL</w:t>
-            </w:r>
-            <w:r>
-              <w:t xml:space="preserve"> </w:t>
-            </w:r>
-            <w:r>
-              <w:t xml:space="preserve">and</w:t>
-            </w:r>
-            <w:r>
-              <w:t xml:space="preserve"> </w:t>
-            </w:r>
-            <w:r>
-              <w:rPr>
-                <w:rStyle w:val="VerbatimChar"/>
-              </w:rPr>
-              <w:t xml:space="preserve">ToolCavityId = NULL</w:t>
-            </w:r>
-            <w:r>
-              <w:t xml:space="preserve"> </w:t>
-            </w:r>
-            <w:r>
-              <w:t xml:space="preserve">— blended-origin material can’t denormalize multiple Tools into a single FK pair. Tool-specific trace reconstructed via</w:t>
-            </w:r>
-            <w:r>
-              <w:t xml:space="preserve"> </w:t>
-            </w:r>
-            <w:r>
-              <w:rPr>
-                <w:rStyle w:val="VerbatimChar"/>
-              </w:rPr>
-              <w:t xml:space="preserve">LotGenealogy</w:t>
-            </w:r>
-            <w:r>
-              <w:t xml:space="preserve"> </w:t>
-            </w:r>
-            <w:r>
-              <w:t xml:space="preserve">walk of pre-merge source LOTs.</w:t>
-            </w:r>
-            <w:r>
-              <w:t xml:space="preserve">•</w:t>
-            </w:r>
-            <w:r>
-              <w:t xml:space="preserve"> </w:t>
-            </w:r>
-            <w:r>
-              <w:rPr>
-                <w:b/>
-                <w:bCs/>
-              </w:rPr>
-              <w:t xml:space="preserve">§6.2 FDS-06-003 revised</w:t>
-            </w:r>
-            <w:r>
-              <w:t xml:space="preserve"> </w:t>
-            </w:r>
-            <w:r>
-              <w:t xml:space="preserve">— Die Cast</w:t>
-            </w:r>
-            <w:r>
-              <w:t xml:space="preserve"> </w:t>
-            </w:r>
-            <w:r>
-              <w:rPr>
-                <w:rStyle w:val="VerbatimChar"/>
-              </w:rPr>
-              <w:t xml:space="preserve">ProductionEvent</w:t>
-            </w:r>
-            <w:r>
-              <w:t xml:space="preserve"> </w:t>
-            </w:r>
-            <w:r>
-              <w:t xml:space="preserve">capture aligned to checkpoint shape (cumulative counters + delta via</w:t>
-            </w:r>
-            <w:r>
-              <w:t xml:space="preserve"> </w:t>
-            </w:r>
-            <w:r>
-              <w:rPr>
-                <w:rStyle w:val="VerbatimChar"/>
-              </w:rPr>
-              <w:t xml:space="preserve">LAG()</w:t>
-            </w:r>
-            <w:r>
-              <w:t xml:space="preserve">; no per-event</w:t>
-            </w:r>
-            <w:r>
-              <w:t xml:space="preserve"> </w:t>
-            </w:r>
-            <w:r>
-              <w:rPr>
-                <w:rStyle w:val="VerbatimChar"/>
-              </w:rPr>
-              <w:t xml:space="preserve">GoodCount</w:t>
-            </w:r>
-            <w:r>
-              <w:t xml:space="preserve">/</w:t>
-            </w:r>
-            <w:r>
-              <w:rPr>
-                <w:rStyle w:val="VerbatimChar"/>
-              </w:rPr>
-              <w:t xml:space="preserve">NoGoodCount</w:t>
-            </w:r>
-            <w:r>
-              <w:t xml:space="preserve">; no</w:t>
-            </w:r>
-            <w:r>
-              <w:t xml:space="preserve"> </w:t>
-            </w:r>
-            <w:r>
-              <w:rPr>
-                <w:rStyle w:val="VerbatimChar"/>
-              </w:rPr>
-              <w:t xml:space="preserve">DieIdentifier</w:t>
-            </w:r>
-            <w:r>
-              <w:t xml:space="preserve">/</w:t>
-            </w:r>
-            <w:r>
-              <w:rPr>
-                <w:rStyle w:val="VerbatimChar"/>
-              </w:rPr>
-              <w:t xml:space="preserve">CavityNumber</w:t>
-            </w:r>
-            <w:r>
-              <w:t xml:space="preserve"> </w:t>
-            </w:r>
-            <w:r>
-              <w:t xml:space="preserve">on event — derived from Lot).</w:t>
-            </w:r>
-            <w:r>
-              <w:t xml:space="preserve">•</w:t>
-            </w:r>
-            <w:r>
-              <w:t xml:space="preserve"> </w:t>
-            </w:r>
-            <w:r>
-              <w:rPr>
-                <w:b/>
-                <w:bCs/>
-              </w:rPr>
-              <w:t xml:space="preserve">§6.10 FDS-06-030 (NEW)</w:t>
-            </w:r>
-            <w:r>
-              <w:t xml:space="preserve"> </w:t>
-            </w:r>
-            <w:r>
-              <w:t xml:space="preserve">— Phase 0 MPP input item: WorkOrder BIT-flag enumeration (Flexware</w:t>
-            </w:r>
-            <w:r>
-              <w:t xml:space="preserve"> </w:t>
-            </w:r>
-            <w:r>
-              <w:rPr>
-                <w:rStyle w:val="VerbatimChar"/>
-              </w:rPr>
-              <w:t xml:space="preserve">IsCameraProcessingEnabled</w:t>
-            </w:r>
-            <w:r>
-              <w:t xml:space="preserve">,</w:t>
-            </w:r>
-            <w:r>
-              <w:t xml:space="preserve"> </w:t>
-            </w:r>
-            <w:r>
-              <w:rPr>
-                <w:rStyle w:val="VerbatimChar"/>
-              </w:rPr>
-              <w:t xml:space="preserve">IsScaleProcessingEnabled</w:t>
-            </w:r>
-            <w:r>
-              <w:t xml:space="preserve">,</w:t>
-            </w:r>
-            <w:r>
-              <w:t xml:space="preserve"> </w:t>
-            </w:r>
-            <w:r>
-              <w:rPr>
-                <w:rStyle w:val="VerbatimChar"/>
-              </w:rPr>
-              <w:t xml:space="preserve">GroupTargetWeight</w:t>
-            </w:r>
-            <w:r>
-              <w:t xml:space="preserve">,</w:t>
-            </w:r>
-            <w:r>
-              <w:t xml:space="preserve"> </w:t>
-            </w:r>
-            <w:r>
-              <w:rPr>
-                <w:rStyle w:val="VerbatimChar"/>
-              </w:rPr>
-              <w:t xml:space="preserve">GroupTargetWeightTolerance</w:t>
-            </w:r>
-            <w:r>
-              <w:t xml:space="preserve">,</w:t>
-            </w:r>
-            <w:r>
-              <w:t xml:space="preserve"> </w:t>
-            </w:r>
-            <w:r>
-              <w:rPr>
-                <w:rStyle w:val="VerbatimChar"/>
-              </w:rPr>
-              <w:t xml:space="preserve">TargetWeightUnitOfMeasureID</w:t>
-            </w:r>
-            <w:r>
-              <w:t xml:space="preserve">,</w:t>
-            </w:r>
-            <w:r>
-              <w:t xml:space="preserve"> </w:t>
-            </w:r>
-            <w:r>
-              <w:rPr>
-                <w:rStyle w:val="VerbatimChar"/>
-              </w:rPr>
-              <w:t xml:space="preserve">RecipeNumber</w:t>
-            </w:r>
-            <w:r>
-              <w:t xml:space="preserve">,</w:t>
-            </w:r>
-            <w:r>
-              <w:t xml:space="preserve"> </w:t>
-            </w:r>
-            <w:r>
-              <w:rPr>
-                <w:rStyle w:val="VerbatimChar"/>
-              </w:rPr>
-              <w:t xml:space="preserve">TrayQuantity</w:t>
-            </w:r>
-            <w:r>
-              <w:t xml:space="preserve">,</w:t>
-            </w:r>
-            <w:r>
-              <w:t xml:space="preserve"> </w:t>
-            </w:r>
-            <w:r>
-              <w:rPr>
-                <w:rStyle w:val="VerbatimChar"/>
-              </w:rPr>
-              <w:t xml:space="preserve">ReturnableDunnageCode</w:t>
-            </w:r>
-            <w:r>
-              <w:t xml:space="preserve">,</w:t>
-            </w:r>
-            <w:r>
-              <w:t xml:space="preserve"> </w:t>
-            </w:r>
-            <w:r>
-              <w:rPr>
-                <w:rStyle w:val="VerbatimChar"/>
-              </w:rPr>
-              <w:t xml:space="preserve">Customer</w:t>
-            </w:r>
-            <w:r>
-              <w:t xml:space="preserve">). Live flags become columns on</w:t>
-            </w:r>
-            <w:r>
-              <w:t xml:space="preserve"> </w:t>
-            </w:r>
-            <w:r>
-              <w:rPr>
-                <w:rStyle w:val="VerbatimChar"/>
-              </w:rPr>
-              <w:t xml:space="preserve">Workorder.WorkOrder</w:t>
-            </w:r>
-            <w:r>
-              <w:t xml:space="preserve"> </w:t>
-            </w:r>
-            <w:r>
-              <w:t xml:space="preserve">at Arc 2 Phase 1 CREATE; dead flags don’t ship.</w:t>
-            </w:r>
-            <w:r>
-              <w:t xml:space="preserve">•</w:t>
-            </w:r>
-            <w:r>
-              <w:t xml:space="preserve"> </w:t>
-            </w:r>
-            <w:r>
-              <w:rPr>
-                <w:b/>
-                <w:bCs/>
-              </w:rPr>
-              <w:t xml:space="preserve">NEW §16 Identifier Sequences</w:t>
-            </w:r>
-            <w:r>
-              <w:t xml:space="preserve"> </w:t>
-            </w:r>
-            <w:r>
-              <w:t xml:space="preserve">—</w:t>
-            </w:r>
-            <w:r>
-              <w:t xml:space="preserve"> </w:t>
-            </w:r>
-            <w:r>
-              <w:rPr>
-                <w:rStyle w:val="VerbatimChar"/>
-              </w:rPr>
-              <w:t xml:space="preserve">Lots.IdentifierSequence</w:t>
-            </w:r>
-            <w:r>
-              <w:t xml:space="preserve"> </w:t>
-            </w:r>
-            <w:r>
-              <w:t xml:space="preserve">table +</w:t>
-            </w:r>
-            <w:r>
-              <w:t xml:space="preserve"> </w:t>
-            </w:r>
-            <w:r>
-              <w:rPr>
-                <w:rStyle w:val="VerbatimChar"/>
-              </w:rPr>
-              <w:t xml:space="preserve">IdentifierSequence_Next @Code</w:t>
-            </w:r>
-            <w:r>
-              <w:t xml:space="preserve"> </w:t>
-            </w:r>
-            <w:r>
-              <w:t xml:space="preserve">proc. Seeded at cutover from Flexware</w:t>
-            </w:r>
-            <w:r>
-              <w:t xml:space="preserve"> </w:t>
-            </w:r>
-            <w:r>
-              <w:rPr>
-                <w:rStyle w:val="VerbatimChar"/>
-              </w:rPr>
-              <w:t xml:space="preserve">LastCounterValue</w:t>
-            </w:r>
-            <w:r>
-              <w:t xml:space="preserve"> </w:t>
-            </w:r>
-            <w:r>
-              <w:t xml:space="preserve">for</w:t>
-            </w:r>
-            <w:r>
-              <w:t xml:space="preserve"> </w:t>
-            </w:r>
-            <w:r>
-              <w:rPr>
-                <w:rStyle w:val="VerbatimChar"/>
-              </w:rPr>
-              <w:t xml:space="preserve">Lot</w:t>
-            </w:r>
-            <w:r>
-              <w:t xml:space="preserve"> </w:t>
-            </w:r>
-            <w:r>
-              <w:t xml:space="preserve">(</w:t>
-            </w:r>
-            <w:r>
-              <w:rPr>
-                <w:rStyle w:val="VerbatimChar"/>
-              </w:rPr>
-              <w:t xml:space="preserve">MESL{0:D7}</w:t>
-            </w:r>
-            <w:r>
-              <w:t xml:space="preserve">) and</w:t>
-            </w:r>
-            <w:r>
-              <w:t xml:space="preserve"> </w:t>
-            </w:r>
-            <w:r>
-              <w:rPr>
-                <w:rStyle w:val="VerbatimChar"/>
-              </w:rPr>
-              <w:t xml:space="preserve">SerializedItem</w:t>
-            </w:r>
-            <w:r>
-              <w:t xml:space="preserve"> </w:t>
-            </w:r>
-            <w:r>
-              <w:t xml:space="preserve">(</w:t>
-            </w:r>
-            <w:r>
-              <w:rPr>
-                <w:rStyle w:val="VerbatimChar"/>
-              </w:rPr>
-              <w:t xml:space="preserve">MESI{0:D7}</w:t>
-            </w:r>
-            <w:r>
-              <w:t xml:space="preserve">). FDS-16-001..003.</w:t>
-            </w:r>
-            <w:r>
-              <w:t xml:space="preserve">•</w:t>
-            </w:r>
-            <w:r>
-              <w:t xml:space="preserve"> </w:t>
-            </w:r>
-            <w:r>
-              <w:rPr>
-                <w:b/>
-                <w:bCs/>
-              </w:rPr>
-              <w:t xml:space="preserve">Cross-cutting guidance</w:t>
-            </w:r>
-            <w:r>
-              <w:t xml:space="preserve"> </w:t>
-            </w:r>
-            <w:r>
-              <w:t xml:space="preserve">— Per-terminal-function purpose-built Perspective views; LocationAttribute used for business policies only, never UI config. Flexware’s</w:t>
-            </w:r>
-            <w:r>
-              <w:t xml:space="preserve"> </w:t>
-            </w:r>
-            <w:r>
-              <w:rPr>
-                <w:rStyle w:val="VerbatimChar"/>
-              </w:rPr>
-              <w:t xml:space="preserve">*DashboardConfiguration</w:t>
-            </w:r>
-            <w:r>
-              <w:t xml:space="preserve"> </w:t>
-            </w:r>
-            <w:r>
-              <w:t xml:space="preserve">family and</w:t>
-            </w:r>
-            <w:r>
-              <w:t xml:space="preserve"> </w:t>
-            </w:r>
-            <w:r>
-              <w:rPr>
-                <w:rStyle w:val="VerbatimChar"/>
-              </w:rPr>
-              <w:t xml:space="preserve">UserInterfaceScript</w:t>
-            </w:r>
-            <w:r>
-              <w:t xml:space="preserve"> </w:t>
-            </w:r>
-            <w:r>
-              <w:t xml:space="preserve">DB-stored-code pattern are NOT reproduced.</w:t>
-            </w:r>
-            <w:r>
-              <w:t xml:space="preserve">Source:</w:t>
-            </w:r>
-            <w:r>
-              <w:t xml:space="preserve"> </w:t>
-            </w:r>
-            <w:r>
-              <w:rPr>
-                <w:rStyle w:val="VerbatimChar"/>
-              </w:rPr>
-              <w:t xml:space="preserve">docs/superpowers/specs/2026-04-23-arc2-model-revisions.md</w:t>
-            </w:r>
-            <w:r>
-              <w:t xml:space="preserve">. Companion changes: Data Model v1.9, User Journeys v0.8, Arc 2 phased plan refresh.</w:t>
-            </w:r>
-          </w:p>
-        </w:tc>
-      </w:tr>
-      <w:tr>
-        <w:tc>
-          <w:tcPr/>
-          <w:p>
-            <w:pPr>
-              <w:pStyle w:val="Compact"/>
-            </w:pPr>
-            <w:r>
-              <w:t xml:space="preserve">0.10-rev</w:t>
-            </w:r>
-          </w:p>
-        </w:tc>
-        <w:tc>
-          <w:tcPr/>
-          <w:p>
-            <w:pPr>
-              <w:pStyle w:val="Compact"/>
-            </w:pPr>
-            <w:r>
-              <w:t xml:space="preserve">2026-04-22</w:t>
-            </w:r>
-          </w:p>
-        </w:tc>
-        <w:tc>
-          <w:tcPr/>
-          <w:p>
-            <w:pPr>
-              <w:pStyle w:val="Compact"/>
-            </w:pPr>
-            <w:r>
-              <w:t xml:space="preserve">Blue Ridge Automation</w:t>
-            </w:r>
-          </w:p>
-        </w:tc>
-        <w:tc>
-          <w:tcPr/>
-          <w:p>
-            <w:pPr>
-              <w:pStyle w:val="Compact"/>
-            </w:pPr>
-            <w:r>
-              <w:rPr>
-                <w:b/>
-                <w:bCs/>
-              </w:rPr>
-              <w:t xml:space="preserve">OI-11 reversal.</w:t>
-            </w:r>
-            <w:r>
-              <w:t xml:space="preserve"> </w:t>
-            </w:r>
-            <w:r>
-              <w:t xml:space="preserve">The initial v0.10 draft added §5.10 + FDS-05-033..035 covering a new</w:t>
-            </w:r>
-            <w:r>
-              <w:t xml:space="preserve"> </w:t>
-            </w:r>
-            <w:r>
-              <w:rPr>
-                <w:rStyle w:val="VerbatimChar"/>
-              </w:rPr>
-              <w:t xml:space="preserve">Parts.ItemTransform</w:t>
-            </w:r>
-            <w:r>
-              <w:t xml:space="preserve"> </w:t>
-            </w:r>
-            <w:r>
-              <w:t xml:space="preserve">table to bridge the Casting → Trim part rename. On review the table was redundant with</w:t>
-            </w:r>
-            <w:r>
-              <w:t xml:space="preserve"> </w:t>
-            </w:r>
-            <w:r>
-              <w:rPr>
-                <w:rStyle w:val="VerbatimChar"/>
-              </w:rPr>
-              <w:t xml:space="preserve">Workorder.ConsumptionEvent</w:t>
-            </w:r>
-            <w:r>
-              <w:t xml:space="preserve"> </w:t>
-            </w:r>
-            <w:r>
-              <w:t xml:space="preserve">(every column duplicated). §5.10 retained as a section but rewritten: the Casting → Trim boundary is modelled as a</w:t>
-            </w:r>
-            <w:r>
-              <w:t xml:space="preserve"> </w:t>
-            </w:r>
-            <w:r>
-              <w:rPr>
-                <w:b/>
-                <w:bCs/>
-              </w:rPr>
-              <w:t xml:space="preserve">degenerate 1-line BOM consumption</w:t>
-            </w:r>
-            <w:r>
-              <w:t xml:space="preserve"> </w:t>
-            </w:r>
-            <w:r>
-              <w:t xml:space="preserve">(trim part has cast part as its sole component at QtyPer=1). FDS-05-033..035 consolidated into a single FDS-05-033 describing the BOM-driven scan-in flow. No new schema — existing</w:t>
-            </w:r>
-            <w:r>
-              <w:t xml:space="preserve"> </w:t>
-            </w:r>
-            <w:r>
-              <w:rPr>
-                <w:rStyle w:val="VerbatimChar"/>
-              </w:rPr>
-              <w:t xml:space="preserve">Parts.Bom</w:t>
-            </w:r>
-            <w:r>
-              <w:t xml:space="preserve">,</w:t>
-            </w:r>
-            <w:r>
-              <w:t xml:space="preserve"> </w:t>
-            </w:r>
-            <w:r>
-              <w:rPr>
-                <w:rStyle w:val="VerbatimChar"/>
-              </w:rPr>
-              <w:t xml:space="preserve">Workorder.ConsumptionEvent</w:t>
-            </w:r>
-            <w:r>
-              <w:t xml:space="preserve">, and</w:t>
-            </w:r>
-            <w:r>
-              <w:t xml:space="preserve"> </w:t>
-            </w:r>
-            <w:r>
-              <w:rPr>
-                <w:rStyle w:val="VerbatimChar"/>
-              </w:rPr>
-              <w:t xml:space="preserve">Lots.LotGenealogy</w:t>
-            </w:r>
-            <w:r>
-              <w:t xml:space="preserve"> </w:t>
-            </w:r>
-            <w:r>
-              <w:t xml:space="preserve">carry it. OI-11 moves to ✅ Resolved in the Open Issues Register v2.6. Data Model v1.8 updated accordingly (ItemTransform table section replaced with a ✅ Resolved callout).</w:t>
-            </w:r>
-          </w:p>
-        </w:tc>
-      </w:tr>
-      <w:tr>
-        <w:tc>
-          <w:tcPr>
-            <w:shd w:val="clear" w:color="auto" w:fill="F2F2F2"/>
-          </w:tcPr>
-          <w:tcPr/>
-          <w:p>
-            <w:pPr>
-              <w:pStyle w:val="Compact"/>
-            </w:pPr>
-            <w:r>
-              <w:t xml:space="preserve">0.10</w:t>
-            </w:r>
-          </w:p>
-        </w:tc>
-        <w:tc>
-          <w:tcPr>
-            <w:shd w:val="clear" w:color="auto" w:fill="F2F2F2"/>
-          </w:tcPr>
-          <w:tcPr/>
-          <w:p>
-            <w:pPr>
-              <w:pStyle w:val="Compact"/>
-            </w:pPr>
-            <w:r>
-              <w:t xml:space="preserve">2026-04-22</w:t>
-            </w:r>
-          </w:p>
-        </w:tc>
-        <w:tc>
-          <w:tcPr>
-            <w:shd w:val="clear" w:color="auto" w:fill="F2F2F2"/>
-          </w:tcPr>
-          <w:tcPr/>
-          <w:p>
-            <w:pPr>
-              <w:pStyle w:val="Compact"/>
-            </w:pPr>
-            <w:r>
-              <w:t xml:space="preserve">Blue Ridge Automation</w:t>
-            </w:r>
-          </w:p>
-        </w:tc>
-        <w:tc>
-          <w:tcPr>
-            <w:shd w:val="clear" w:color="auto" w:fill="F2F2F2"/>
-          </w:tcPr>
-          <w:tcPr/>
-          <w:p>
-            <w:pPr>
-              <w:pStyle w:val="Compact"/>
-            </w:pPr>
-            <w:r>
-              <w:rPr>
-                <w:b/>
-                <w:bCs/>
-              </w:rPr>
-              <w:t xml:space="preserve">Phase E of the 2026-04-20 OI review refactor — design + doc additions for OI-11..23.</w:t>
-            </w:r>
-            <w:r>
-              <w:t xml:space="preserve"> </w:t>
-            </w:r>
-            <w:r>
-              <w:t xml:space="preserve">Closes 13 items discovered across the 2026-04-20 MPP meeting (OI-11..14) and the 2026-04-22 legacy-MES screenshot review (OI-15..23). New sections: §3.6 extended with FDS-03-019 per-container MaxParts cap (OI-12) and FDS-03-020 lineside inventory cap (OI-12); §3.5 extended with FDS-03-018 ItemLocation consumption metadata (OI-18); §3.1 FDS-03-001 extended for Country of Origin (OI-19); §5.10 Part Identity Change — Casting to Trim, new subsection with FDS-05-033..035 (OI-11); §5.1 FDS-05-031 LOT computed quantities (TotalInProcess, InventoryAvailable) (OI-23); §5.3 FDS-05-032 partial start / partial complete confirmation (OI-21); §6.8 FDS-06-023a Scrap Source distinction (Inventory vs Location) (OI-20); §6.10 FDS-06-028 auto-finish-on-target WO + FDS-06-029 tray-divisibility validation (OI-16, OI-17); §8.2 FDS-08-007a dedicated Hold Management screen (OI-22); §12.5 Global Trace Tool, new subsection with FDS-12-009..011 (OI-15); §1.4 FDS-01-013 BOM import from Flexware @ .919 (OI-13); §4.3 Elevation Model extended with admin remove-item entry (OI-14); §14 Data Migration extended with Flexware BOM one-shot import (OI-13). Data model companion change: v1.7 → v1.8 adds</w:t>
-            </w:r>
-            <w:r>
-              <w:t xml:space="preserve"> </w:t>
-            </w:r>
-            <w:r>
-              <w:rPr>
-                <w:rStyle w:val="VerbatimChar"/>
-              </w:rPr>
-              <w:t xml:space="preserve">Parts.ItemTransform</w:t>
-            </w:r>
-            <w:r>
-              <w:t xml:space="preserve">,</w:t>
-            </w:r>
-            <w:r>
-              <w:t xml:space="preserve"> </w:t>
-            </w:r>
-            <w:r>
-              <w:rPr>
-                <w:rStyle w:val="VerbatimChar"/>
-              </w:rPr>
-              <w:t xml:space="preserve">Workorder.ScrapSource</w:t>
-            </w:r>
-            <w:r>
-              <w:t xml:space="preserve">,</w:t>
-            </w:r>
-            <w:r>
-              <w:t xml:space="preserve"> </w:t>
-            </w:r>
-            <w:r>
-              <w:rPr>
-                <w:rStyle w:val="VerbatimChar"/>
-              </w:rPr>
-              <w:t xml:space="preserve">Parts.ContainerConfig.MaxParts</w:t>
-            </w:r>
-            <w:r>
-              <w:t xml:space="preserve">,</w:t>
-            </w:r>
-            <w:r>
-              <w:t xml:space="preserve"> </w:t>
-            </w:r>
-            <w:r>
-              <w:rPr>
-                <w:rStyle w:val="VerbatimChar"/>
-              </w:rPr>
-              <w:t xml:space="preserve">Parts.ItemLocation</w:t>
-            </w:r>
-            <w:r>
-              <w:t xml:space="preserve"> </w:t>
-            </w:r>
-            <w:r>
-              <w:t xml:space="preserve">consumption cols,</w:t>
-            </w:r>
-            <w:r>
-              <w:t xml:space="preserve"> </w:t>
-            </w:r>
-            <w:r>
-              <w:rPr>
-                <w:rStyle w:val="VerbatimChar"/>
-              </w:rPr>
-              <w:t xml:space="preserve">Parts.Item.CountryOfOrigin</w:t>
-            </w:r>
-            <w:r>
-              <w:t xml:space="preserve">,</w:t>
-            </w:r>
-            <w:r>
-              <w:t xml:space="preserve"> </w:t>
-            </w:r>
-            <w:r>
-              <w:rPr>
-                <w:rStyle w:val="VerbatimChar"/>
-              </w:rPr>
-              <w:t xml:space="preserve">Workorder.ProductionEvent.ScrapSourceId</w:t>
-            </w:r>
-            <w:r>
-              <w:t xml:space="preserve">. All changes additive — no breaking re-numbering. Discovery items OI-24..30 remain parked for MPP input. Source:</w:t>
-            </w:r>
-            <w:r>
-              <w:t xml:space="preserve"> </w:t>
-            </w:r>
-            <w:r>
-              <w:rPr>
-                <w:rStyle w:val="VerbatimChar"/>
-              </w:rPr>
-              <w:t xml:space="preserve">MPP_MES_Open_Issues_Register.md</w:t>
-            </w:r>
-            <w:r>
-              <w:t xml:space="preserve"> </w:t>
-            </w:r>
-            <w:r>
-              <w:t xml:space="preserve">v2.5,</w:t>
-            </w:r>
-            <w:r>
-              <w:t xml:space="preserve"> </w:t>
-            </w:r>
-            <w:r>
-              <w:rPr>
-                <w:rStyle w:val="VerbatimChar"/>
-              </w:rPr>
-              <w:t xml:space="preserve">Meeting_Notes/2026-04-20_OI_Review_Status_Summary.md</w:t>
-            </w:r>
-            <w:r>
-              <w:t xml:space="preserve"> </w:t>
-            </w:r>
-            <w:r>
-              <w:t xml:space="preserve">v1.1.</w:t>
-            </w:r>
-          </w:p>
-        </w:tc>
-      </w:tr>
-      <w:tr>
-        <w:tc>
-          <w:tcPr/>
-          <w:p>
-            <w:pPr>
-              <w:pStyle w:val="Compact"/>
-            </w:pPr>
-            <w:r>
-              <w:t xml:space="preserve">0.9</w:t>
-            </w:r>
-          </w:p>
-        </w:tc>
-        <w:tc>
-          <w:tcPr/>
-          <w:p>
-            <w:pPr>
-              <w:pStyle w:val="Compact"/>
-            </w:pPr>
-            <w:r>
-              <w:t xml:space="preserve">2026-04-21</w:t>
-            </w:r>
-          </w:p>
-        </w:tc>
-        <w:tc>
-          <w:tcPr/>
-          <w:p>
-            <w:pPr>
-              <w:pStyle w:val="Compact"/>
-            </w:pPr>
-            <w:r>
-              <w:t xml:space="preserve">Blue Ridge Automation</w:t>
-            </w:r>
-          </w:p>
-        </w:tc>
-        <w:tc>
-          <w:tcPr/>
-          <w:p>
-            <w:pPr>
-              <w:pStyle w:val="Compact"/>
-            </w:pPr>
-            <w:r>
-              <w:rPr>
-                <w:b/>
-                <w:bCs/>
-              </w:rPr>
-              <w:t xml:space="preserve">Phase D of the 2026-04-20 OI review refactor — six FDS sections rewritten.</w:t>
-            </w:r>
-            <w:r>
-              <w:t xml:space="preserve"> </w:t>
-            </w:r>
-            <w:r>
-              <w:t xml:space="preserve">§2.5 Terminals gains OI-08 addenda:</w:t>
-            </w:r>
-            <w:r>
-              <w:t xml:space="preserve"> </w:t>
-            </w:r>
-            <w:r>
-              <w:rPr>
-                <w:rStyle w:val="VerbatimChar"/>
-              </w:rPr>
-              <w:t xml:space="preserve">TerminalMode</w:t>
-            </w:r>
-            <w:r>
-              <w:t xml:space="preserve"> </w:t>
-            </w:r>
-            <w:r>
-              <w:t xml:space="preserve">LocationAttribute (Dedicated ≈80% / Shared ≈20%) via FDS-02-010, terminal machine-context lock (FDS-02-011, no UI navigation off-machine), part↔machine validity via</w:t>
-            </w:r>
-            <w:r>
-              <w:t xml:space="preserve"> </w:t>
-            </w:r>
-            <w:r>
-              <w:rPr>
-                <w:rStyle w:val="VerbatimChar"/>
-              </w:rPr>
-              <w:t xml:space="preserve">Parts.ItemLocation</w:t>
-            </w:r>
-            <w:r>
-              <w:t xml:space="preserve"> </w:t>
-            </w:r>
-            <w:r>
-              <w:t xml:space="preserve">(FDS-02-012), mobile-friendly tablet design input for Die Cast (FDS-02-013), Honda RFID forward-compatibility note (FDS-02-014 FUTURE). §5.4 Sub-LOT Splitting — formalised the sublot pattern for OI-09 addenda: general parent-FK + sublot semantics (FDS-05-022), per-cavity concurrent sublots at Die Cast (FDS-05-023), sublot label parent reference (FDS-05-024); retained existing auto-split workflow as one specific case. §5.5 LOT Merging — OI-05 revised: replaced loose</w:t>
-            </w:r>
-            <w:r>
-              <w:t xml:space="preserve"> </w:t>
-            </w:r>
-            <w:r>
-              <w:t xml:space="preserve">“configurable”</w:t>
-            </w:r>
-            <w:r>
-              <w:t xml:space="preserve"> </w:t>
-            </w:r>
-            <w:r>
-              <w:t xml:space="preserve">wording with concrete rules: post-sort only (FDS-05-023), same-part-number (FDS-05-024), die-rank compatibility via</w:t>
-            </w:r>
-            <w:r>
-              <w:t xml:space="preserve"> </w:t>
-            </w:r>
-            <w:r>
-              <w:rPr>
-                <w:rStyle w:val="VerbatimChar"/>
-              </w:rPr>
-              <w:t xml:space="preserve">Tools.DieRankCompatibility</w:t>
-            </w:r>
-            <w:r>
-              <w:t xml:space="preserve"> </w:t>
-            </w:r>
-            <w:r>
-              <w:t xml:space="preserve">with supervisor AD override (FDS-05-025), quality-status gating with no override for mixed status (FDS-05-026), machining FIFO-by-cavity is not a merge (FDS-05-027). §6.10 Work Orders — OI-07 three-type model: Demand / Maintenance / Recipe;</w:t>
-            </w:r>
-            <w:r>
-              <w:t xml:space="preserve"> </w:t>
-            </w:r>
-            <w:r>
-              <w:rPr>
-                <w:rStyle w:val="VerbatimChar"/>
-              </w:rPr>
-              <w:t xml:space="preserve">WorkOrderType</w:t>
-            </w:r>
-            <w:r>
-              <w:t xml:space="preserve"> </w:t>
-            </w:r>
-            <w:r>
-              <w:t xml:space="preserve">code table (FDS-06-025); Demand retains MVP-LITE auto-generation; Maintenance is</w:t>
-            </w:r>
-            <w:r>
-              <w:t xml:space="preserve"> </w:t>
-            </w:r>
-            <w:r>
-              <w:rPr>
-                <w:rStyle w:val="VerbatimChar"/>
-              </w:rPr>
-              <w:t xml:space="preserve">FUTURE</w:t>
-            </w:r>
-            <w:r>
-              <w:t xml:space="preserve"> </w:t>
-            </w:r>
-            <w:r>
-              <w:t xml:space="preserve">flow with schema hook only (FDS-06-026); Recipe is hidden from operator (FDS-06-027). §9.4 Shift Management — OI-03 closed: availability</w:t>
-            </w:r>
-            <w:r>
-              <w:t xml:space="preserve"> </w:t>
-            </w:r>
-            <w:r>
-              <w:rPr>
-                <w:b/>
-                <w:bCs/>
-              </w:rPr>
-              <w:t xml:space="preserve">derived from events</w:t>
-            </w:r>
-            <w:r>
-              <w:t xml:space="preserve">, not adjustable start/end columns; import schedules from MPP spreadsheet (FDS-09-012); break logging is end-of-shift only, no live per-break entry (FDS-09-013); early starts auto-increase availability because events drive runtime (FDS-09-014). §10.3 Non-Serialized Line Integration — OI-04 revised: line-stop semantics replace LOT auto-hold (FDS-10-005 rewritten), 10-consecutive-fail leader escalation with configurable threshold (FDS-10-009), failure-type branching (wrong part → immediate flag; wrong orientation → threshold only — FDS-10-010), hold-release paths via Quality or CRT (FDS-10-011), Controlled Run Tag workflow with mandatory 200%-inspect and missed-CRT re-run rule (FDS-10-012). Related Documents table updated to reference data model v1.7 (8 schemas, ~70 tables). Open Items Register grid refreshed to show revised statuses and the four new items (OI-11 part rename at Casting→Trim, OI-12 lineside inventory caps, OI-13 BOM source Flexware@.919, OI-14 admin remove-item).</w:t>
-            </w:r>
-          </w:p>
-        </w:tc>
-      </w:tr>
-      <w:tr>
-        <w:tc>
-          <w:tcPr>
-            <w:shd w:val="clear" w:color="auto" w:fill="F2F2F2"/>
-          </w:tcPr>
-          <w:tcPr/>
-          <w:p>
-            <w:pPr>
-              <w:pStyle w:val="Compact"/>
-            </w:pPr>
-            <w:r>
-              <w:t xml:space="preserve">0.8</w:t>
-            </w:r>
-          </w:p>
-        </w:tc>
-        <w:tc>
-          <w:tcPr>
-            <w:shd w:val="clear" w:color="auto" w:fill="F2F2F2"/>
-          </w:tcPr>
-          <w:tcPr/>
-          <w:p>
-            <w:pPr>
-              <w:pStyle w:val="Compact"/>
-            </w:pPr>
-            <w:r>
-              <w:t xml:space="preserve">2026-04-21</w:t>
-            </w:r>
-          </w:p>
-        </w:tc>
-        <w:tc>
-          <w:tcPr>
-            <w:shd w:val="clear" w:color="auto" w:fill="F2F2F2"/>
-          </w:tcPr>
-          <w:tcPr/>
-          <w:p>
-            <w:pPr>
-              <w:pStyle w:val="Compact"/>
-            </w:pPr>
-            <w:r>
-              <w:t xml:space="preserve">Blue Ridge Automation</w:t>
-            </w:r>
-          </w:p>
-        </w:tc>
-        <w:tc>
-          <w:tcPr>
-            <w:shd w:val="clear" w:color="auto" w:fill="F2F2F2"/>
-          </w:tcPr>
-          <w:tcPr/>
-          <w:p>
-            <w:pPr>
-              <w:pStyle w:val="Compact"/>
-            </w:pPr>
-            <w:r>
-              <w:rPr>
-                <w:b/>
-                <w:bCs/>
-              </w:rPr>
-              <w:t xml:space="preserve">Security model rewrite (OI-06 closed — Phase C of the 2026-04-20 OI review refactor).</w:t>
-            </w:r>
-            <w:r>
-              <w:t xml:space="preserve"> </w:t>
-            </w:r>
-            <w:r>
-              <w:t xml:space="preserve">Replaced §4 Authentication &amp; Session Management end-to-end. Operators no longer authenticate — they are identified by</w:t>
-            </w:r>
-            <w:r>
-              <w:t xml:space="preserve"> </w:t>
-            </w:r>
-            <w:r>
-              <w:rPr>
-                <w:b/>
-                <w:bCs/>
-              </w:rPr>
-              <w:t xml:space="preserve">initials</w:t>
-            </w:r>
-            <w:r>
-              <w:t xml:space="preserve"> </w:t>
-            </w:r>
-            <w:r>
-              <w:t xml:space="preserve">entered at the terminal (no clock number, no PIN), which establish an operator presence context that stamps</w:t>
-            </w:r>
-            <w:r>
-              <w:t xml:space="preserve"> </w:t>
-            </w:r>
-            <w:r>
-              <w:rPr>
-                <w:rStyle w:val="VerbatimChar"/>
-              </w:rPr>
-              <w:t xml:space="preserve">AppUserId</w:t>
-            </w:r>
-            <w:r>
-              <w:t xml:space="preserve"> </w:t>
-            </w:r>
-            <w:r>
-              <w:t xml:space="preserve">on events. Interactive users (Quality, Supervisor, Engineering, Admin) continue to authenticate via Active Directory. All clock-number and PIN terminology removed. Elevated actions are per-action AD re-prompts (no 5-minute-timeout, no session-sticky elevation). Introduced dedicated-vs-shared terminal modes via</w:t>
-            </w:r>
-            <w:r>
-              <w:t xml:space="preserve"> </w:t>
-            </w:r>
-            <w:r>
-              <w:rPr>
-                <w:rStyle w:val="VerbatimChar"/>
-              </w:rPr>
-              <w:t xml:space="preserve">LocationAttribute</w:t>
-            </w:r>
-            <w:r>
-              <w:t xml:space="preserve">. Added 30-minute idle re-confirmation overlay. Added pre-populated-and-defeasible initials field on every mutation screen. Operator</w:t>
-            </w:r>
-            <w:r>
-              <w:t xml:space="preserve"> </w:t>
-            </w:r>
-            <w:r>
-              <w:rPr>
-                <w:rStyle w:val="VerbatimChar"/>
-              </w:rPr>
-              <w:t xml:space="preserve">AppUser</w:t>
-            </w:r>
-            <w:r>
-              <w:t xml:space="preserve"> </w:t>
-            </w:r>
-            <w:r>
-              <w:t xml:space="preserve">rows are managed via the Configuration Tool (Admin screen). Updated §1.6 FDS-01-010. New FDS-04-009, FDS-04-010.</w:t>
+              <w:t xml:space="preserve">Initial draft — front matter, architecture, plant model, master data.</w:t>
             </w:r>
           </w:p>
         </w:tc>

</xml_diff>